<commit_message>
feat: 용례 확인 #5
</commit_message>
<xml_diff>
--- a/paper/jkiie_submit_body.docx
+++ b/paper/jkiie_submit_body.docx
@@ -17,7 +17,7 @@
         <w:spacing w:line="300" w:lineRule="exact"/>
       </w:pPr>
       <w:r>
-        <w:t>We study truck scheduling in a multi-door cross-dock where a compound truck is partially unloaded and then departs as an outbound carrier. Existing models assume all trucks are available at time zero and minimize makespan only. We extend the problem with per-truck release times and soft due dates (violable at a tardiness cost), minimizing makespan plus total tardiness, and formulate it as a mixed-integer program and a CP-SAT model under a reproducible seed protocol. VAA-GILS is an iterated local search combining Vogel-style construction, best-improvement descent, bottleneck-guided operators, and kick restarts. Where CP-SAT provides a reference, VAA-GILS is within 0.11–0.21</w:t>
+        <w:t xml:space="preserve">We study truck scheduling in a multi-door cross-dock where a compound truck is partially unloaded and then departs as an outbound carrier. Existing models assume all trucks are available at time zero and minimize makespan only. We extend the problem with per-truck release times and soft due dates (violable at a tardiness cost), minimizing makespan plus total tardiness, and formulate it as a mixed-integer program and a CP-SAT model under a reproducible seed protocol. VAA-GILS is an iterated local search combining Vogel-style construction, best-improvement descent, bottleneck-guided operators, kick restarts, and greedy acceptance. Where CP-SAT provides a reference solution, VAA-GILS is within 0.06–0.25% of that reference while requiring substantially less computation time (under 0.5 versus 76–606 seconds); where optimality was proven, it averages 0.23% above the optimum. Where CP-SAT finds no feasible schedule within 600 seconds, it returns the best solutions observed. Ablation attributes the gain to this deterministic structure, not to learned operator selection or stochastic acceptance.</w:t>
       </w:r>
     </w:p>
     <w:p>
@@ -186,35 +186,35 @@
           <w:b/>
           <w:bCs/>
         </w:rPr>
-        <w:t>정확해</w:t>
+        <w:t xml:space="preserve">CP-SAT 기준해 비교를 동반한</w:t>
       </w:r>
       <w:r>
         <w:rPr>
           <w:b/>
           <w:bCs/>
         </w:rPr>
-        <w:t xml:space="preserve"> </w:t>
+        <w:t xml:space="preserve"/>
       </w:r>
       <w:r>
         <w:rPr>
           <w:b/>
           <w:bCs/>
         </w:rPr>
-        <w:t>검증을</w:t>
+        <w:t xml:space="preserve"/>
       </w:r>
       <w:r>
         <w:rPr>
           <w:b/>
           <w:bCs/>
         </w:rPr>
-        <w:t xml:space="preserve"> </w:t>
+        <w:t xml:space="preserve"/>
       </w:r>
       <w:r>
         <w:rPr>
           <w:b/>
           <w:bCs/>
         </w:rPr>
-        <w:t>동반한</w:t>
+        <w:t xml:space="preserve"/>
       </w:r>
       <w:r>
         <w:rPr>
@@ -274,7 +274,7 @@
       </w:r>
       <w:r>
         <w:br/>
-        <w:t>Compound-Truck Cross-Docking Scheduling with Release Times and Soft Due Dates: A Bottleneck-Guided Iterated Local Search with Exact-Solver Verification</w:t>
+        <w:t xml:space="preserve">Compound-Truck Cross-Docking Scheduling with Release Times and Soft Due Dates: A Bottleneck-Guided Iterated Local Search with CP-SAT Benchmarking</w:t>
       </w:r>
       <w:r>
         <w:br/>
@@ -617,7 +617,7 @@
         <w:rPr>
           <w:rFonts w:asciiTheme="minorEastAsia" w:hAnsiTheme="minorEastAsia"/>
         </w:rPr>
-        <w:t xml:space="preserve"> 도착 불확실성은 별도의 흐름이다. Konur와 Golias는 bounded arrival window(2013a)와 unknown arrival 하의 cost-stable schedule(2013b)을 다룬다. Larbi 등(2011)은 도착 정보의 완전·부분·부재(full/partial/absent) 정보를 구분하고, Ladier와 Alpan(2016)은 time window 하의 robust schedule을, Xi 등(2020)은 two-stage conflict robust optimization을 제시한다. 본 모형은 결정론적이며 각 도착 시각은 스케줄 구성 시점에 알려져 있다. 따라서 이들 불확실성 모형은 본 모형을 직접 대체하기보다 향후 자연스럽게 확장할 수 있는 연구 방향에 해당한다.</w:t>
+        <w:t xml:space="preserve"> 도착 정보의 불확실성은 앞서 다룬 결정론적 시간 제약 연구들과는 별개의 흐름을 이룬다. Konur와 Golias는 bounded arrival window(2013a)와 unknown arrival 하의 cost-stable schedule(2013b)을 다룬다. Larbi 등(2011)은 도착 정보의 완전·부분·부재(full/partial/absent) 정보를 구분하고, Ladier와 Alpan(2016)은 time window 하의 robust schedule을, Xi 등(2020)은 two-stage conflict robust optimization을 제시한다. 본 모형은 결정론적이며 각 도착 시각은 스케줄 구성 시점에 알려져 있다. 따라서 이들 불확실성 모형은 본 모형을 직접 대체하기보다 향후 자연스럽게 확장할 수 있는 연구 방향에 해당한다.</w:t>
       </w:r>
     </w:p>
     <w:p>
@@ -990,7 +990,7 @@
         <w:rPr>
           <w:rFonts w:asciiTheme="minorEastAsia" w:hAnsiTheme="minorEastAsia"/>
         </w:rPr>
-        <w:t xml:space="preserve">를 </w:t>
+        <w:t xml:space="preserve">를 화물량 </w:t>
       </w:r>
       <m:oMath>
         <m:sSub>
@@ -1023,7 +1023,7 @@
         <w:rPr>
           <w:rFonts w:asciiTheme="minorEastAsia" w:hAnsiTheme="minorEastAsia"/>
         </w:rPr>
-        <w:t xml:space="preserve"> 단위 싣는다. 단위 처리시간 </w:t>
+        <w:t xml:space="preserve">만큼 싣는다. 단위 처리시간 </w:t>
       </w:r>
       <m:oMath>
         <m:sSub>
@@ -7797,6 +7797,17 @@
           <w:rFonts w:asciiTheme="minorEastAsia" w:hAnsiTheme="minorEastAsia"/>
         </w:rPr>
       </w:pPr>
+      <m:oMath>
+        <m:r>
+          <m:t>λ</m:t>
+        </m:r>
+      </m:oMath>
+      <w:r>
+        <w:rPr>
+          <w:rFonts w:asciiTheme="minorEastAsia" w:hAnsiTheme="minorEastAsia"/>
+        </w:rPr>
+        <w:t xml:space="preserve">는 납기지연 한 단위 시간에 부과하는 벌점 계수(penalty coefficient)로, 작업완료시간과 납기 준수 사이의 관리적 선호를 반영하는 파라미터이다(6.4절). </w:t>
+      </w:r>
       <m:oMath>
         <m:sSub>
           <m:sSubPr>
@@ -10462,7 +10473,7 @@
         <w:rPr>
           <w:rFonts w:asciiTheme="minorEastAsia" w:hAnsiTheme="minorEastAsia"/>
         </w:rPr>
-        <w:t xml:space="preserve">VAA-GILS는 iterated local search의 구현체로, 연산자 내부 sampling과 acceptance를 제외하면 결정론적이다. 이하에서 </w:t>
+        <w:t xml:space="preserve">VAA-GILS는 iterated local search의 구현체로, 연산자 선택, 연산자 내부 sampling, kick을 제외하면 결정론적이다. 이하에서 </w:t>
       </w:r>
       <w:r>
         <w:rPr>
@@ -10548,7 +10559,7 @@
         <w:rPr>
           <w:rFonts w:asciiTheme="minorEastAsia" w:hAnsiTheme="minorEastAsia"/>
         </w:rPr>
-        <w:t xml:space="preserve"> 1,000회 반복한다. 선택 정책이 연산자 하나를 뽑아 현재 해에서 후보를 생성하고, 후보가 전역 최선해를 개선하면 descent를 적용해 incumbent를 갱신한다. acceptance는 초기 온도 </w:t>
+        <w:t xml:space="preserve"> 1,000회 반복한다. 선택 정책이 연산자 하나를 뽑아 현재 해에서 후보를 생성하고, 후보가 전역 최선해를 개선하면 descent를 적용해 incumbent를 갱신한다. acceptance는 후보가 현재 해를 엄격히 개선할 때만 받아들이는 greedy 규칙이다. 이 규칙은 조정 집합에서 simulated annealing acceptance(초기 온도 </w:t>
       </w:r>
       <m:oMath>
         <m:sSub>
@@ -10683,7 +10694,67 @@
         <w:rPr>
           <w:rFonts w:asciiTheme="minorEastAsia" w:hAnsiTheme="minorEastAsia"/>
         </w:rPr>
-        <w:t>의 simulated annealing이다.</w:t>
+        <w:t xml:space="preserve">, 재시작 시 reheating)와 비교해 정하였다. 조정 집합 45개 인스턴스 중 33개에서 SA acceptance의 목적값이 greedy보다 높았고(인스턴스별 차이의 중앙값 +0.017%p, 양측 Wilcoxon </w:t>
+      </w:r>
+      <m:oMath>
+        <m:r>
+          <m:t>p</m:t>
+        </m:r>
+        <m:r>
+          <m:rPr>
+            <m:sty m:val="p"/>
+          </m:rPr>
+          <m:t>=</m:t>
+        </m:r>
+        <m:r>
+          <m:t>0.023</m:t>
+        </m:r>
+      </m:oMath>
+      <w:r>
+        <w:rPr>
+          <w:rFonts w:asciiTheme="minorEastAsia" w:hAnsiTheme="minorEastAsia"/>
+        </w:rPr>
+        <w:t xml:space="preserve">), 평균 차이는 한 인스턴스의 큰 차이 때문에 −0.011%p였다. 시간 제약이 없는 조건(+0.084%p, </w:t>
+      </w:r>
+      <m:oMath>
+        <m:r>
+          <m:t>p</m:t>
+        </m:r>
+        <m:r>
+          <m:rPr>
+            <m:sty m:val="p"/>
+          </m:rPr>
+          <m:t>=</m:t>
+        </m:r>
+        <m:r>
+          <m:t>0.083</m:t>
+        </m:r>
+      </m:oMath>
+      <w:r>
+        <w:rPr>
+          <w:rFonts w:asciiTheme="minorEastAsia" w:hAnsiTheme="minorEastAsia"/>
+        </w:rPr>
+        <w:t xml:space="preserve">)과 있는 조건(−0.058%p, </w:t>
+      </w:r>
+      <m:oMath>
+        <m:r>
+          <m:t>p</m:t>
+        </m:r>
+        <m:r>
+          <m:rPr>
+            <m:sty m:val="p"/>
+          </m:rPr>
+          <m:t>=</m:t>
+        </m:r>
+        <m:r>
+          <m:t>0.051</m:t>
+        </m:r>
+      </m:oMath>
+      <w:r>
+        <w:rPr>
+          <w:rFonts w:asciiTheme="minorEastAsia" w:hAnsiTheme="minorEastAsia"/>
+        </w:rPr>
+        <w:t xml:space="preserve">)으로 나누어도 SA의 유의한 우위는 없었다.</w:t>
       </w:r>
     </w:p>
     <w:p>
@@ -10701,7 +10772,7 @@
           <w:b/>
           <w:bCs/>
         </w:rPr>
-        <w:t>Kick restart와 reheating.</w:t>
+        <w:t xml:space="preserve">Kick restart.</w:t>
       </w:r>
       <w:r>
         <w:rPr>
@@ -10764,97 +10835,7 @@
           <w:rFonts w:asciiTheme="minorEastAsia" w:hAnsiTheme="minorEastAsia"/>
         </w:rPr>
         <w:lastRenderedPageBreak/>
-        <w:t xml:space="preserve">각 이동은 직전 이동의 결과에 적용되며, 재시작 직후에는 descent를 수행하지 않는다. 이어서 </w:t>
-      </w:r>
-      <m:oMath>
-        <m:r>
-          <w:rPr>
-            <w:rFonts w:ascii="Cambria Math" w:hAnsi="Cambria Math"/>
-          </w:rPr>
-          <m:t>T</m:t>
-        </m:r>
-        <m:r>
-          <m:rPr>
-            <m:sty m:val="p"/>
-          </m:rPr>
-          <w:rPr>
-            <w:rFonts w:ascii="Cambria Math" w:hAnsi="Cambria Math"/>
-          </w:rPr>
-          <m:t>←max{</m:t>
-        </m:r>
-        <m:r>
-          <w:rPr>
-            <w:rFonts w:ascii="Cambria Math" w:hAnsi="Cambria Math"/>
-          </w:rPr>
-          <m:t>T</m:t>
-        </m:r>
-        <m:r>
-          <m:rPr>
-            <m:sty m:val="p"/>
-          </m:rPr>
-          <w:rPr>
-            <w:rFonts w:ascii="Cambria Math" w:hAnsi="Cambria Math"/>
-          </w:rPr>
-          <m:t>,</m:t>
-        </m:r>
-        <m:r>
-          <w:rPr>
-            <w:rFonts w:ascii="Cambria Math" w:hAnsi="Cambria Math"/>
-          </w:rPr>
-          <m:t>0.02 J</m:t>
-        </m:r>
-        <m:r>
-          <m:rPr>
-            <m:sty m:val="p"/>
-          </m:rPr>
-          <w:rPr>
-            <w:rFonts w:ascii="Cambria Math" w:hAnsi="Cambria Math"/>
-          </w:rPr>
-          <m:t>(</m:t>
-        </m:r>
-        <m:sSup>
-          <m:sSupPr>
-            <m:ctrlPr>
-              <w:rPr>
-                <w:rFonts w:ascii="Cambria Math" w:hAnsi="Cambria Math"/>
-              </w:rPr>
-            </m:ctrlPr>
-          </m:sSupPr>
-          <m:e>
-            <m:r>
-              <w:rPr>
-                <w:rFonts w:ascii="Cambria Math" w:hAnsi="Cambria Math"/>
-              </w:rPr>
-              <m:t>s</m:t>
-            </m:r>
-          </m:e>
-          <m:sup>
-            <m:r>
-              <m:rPr>
-                <m:sty m:val="p"/>
-              </m:rPr>
-              <w:rPr>
-                <w:rFonts w:ascii="Cambria Math" w:hAnsi="Cambria Math"/>
-              </w:rPr>
-              <m:t>*</m:t>
-            </m:r>
-          </m:sup>
-        </m:sSup>
-        <m:r>
-          <m:rPr>
-            <m:sty m:val="p"/>
-          </m:rPr>
-          <w:rPr>
-            <w:rFonts w:ascii="Cambria Math" w:hAnsi="Cambria Math"/>
-          </w:rPr>
-          <m:t>)}</m:t>
-        </m:r>
-      </m:oMath>
-      <w:r>
-        <w:rPr>
-          <w:rFonts w:asciiTheme="minorEastAsia" w:hAnsiTheme="minorEastAsia"/>
-        </w:rPr>
-        <w:t>로 온도를 reheat한다.</w:t>
+        <w:t xml:space="preserve">각 이동은 직전 이동의 결과에 적용되며, 재시작 직후에는 descent를 수행하지 않는다.</w:t>
       </w:r>
     </w:p>
     <w:p>
@@ -10930,7 +10911,7 @@
         <w:rPr>
           <w:rFonts w:asciiTheme="minorEastAsia" w:hAnsiTheme="minorEastAsia"/>
         </w:rPr>
-        <w:t xml:space="preserve"> simulated annealing인 반면, VAA-GILS는 그 한 연산자 적용 단계를 iterated local search 안에 넣고 guided 연산자, 개선 이동마다의 full descent, kick restart를 더한다. 가장 중요한 차이는 개선 이동 이후의 descent이며, ablation은 이것이 품질 이득의 대부분을 설명함을 보인다. 두 방법의 구조적 차이는 &lt;Table 1&gt;에 정리하였다.</w:t>
+        <w:t xml:space="preserve"> simulated annealing인 반면, VAA-GILS는 그 한 연산자 적용 단계를 iterated local search 안에 넣고 guided 연산자, 개선 이동마다의 full descent, kick restart를 더하며, 확률적 acceptance 대신 greedy acceptance를 쓴다. ablation(6.2절)은 이 가운데 kick restart의 기여가 가장 크고 guided 연산자와 descent가 그 뒤를 이음을 보인다. 두 방법의 구조적 차이는 &lt;Table 1&gt;에 정리하였다.</w:t>
       </w:r>
       <w:hyperlink w:anchor="tab:base"/>
     </w:p>
@@ -11109,7 +11090,7 @@
                 <w:rFonts w:asciiTheme="minorEastAsia" w:hAnsiTheme="minorEastAsia"/>
                 <w:sz w:val="18"/>
               </w:rPr>
-              <w:t>Iterated local search (SA only as acceptance)</w:t>
+              <w:t xml:space="preserve">Iterated local search</w:t>
             </w:r>
           </w:p>
         </w:tc>
@@ -11434,7 +11415,7 @@
                 <w:rFonts w:asciiTheme="minorEastAsia" w:hAnsiTheme="minorEastAsia"/>
                 <w:sz w:val="18"/>
               </w:rPr>
-              <w:t>Kick restart + reheating</w:t>
+              <w:t xml:space="preserve">Kick restart</w:t>
             </w:r>
           </w:p>
         </w:tc>
@@ -11499,7 +11480,7 @@
                 <w:rFonts w:asciiTheme="minorEastAsia" w:hAnsiTheme="minorEastAsia"/>
                 <w:sz w:val="18"/>
               </w:rPr>
-              <w:t>SA (Metropolis; dispensable per ablation)</w:t>
+              <w:t xml:space="preserve">Greedy (improving candidates only)</w:t>
             </w:r>
           </w:p>
         </w:tc>
@@ -12300,21 +12281,21 @@
         <w:rPr>
           <w:rFonts w:asciiTheme="minorEastAsia" w:hAnsiTheme="minorEastAsia"/>
         </w:rPr>
-        <w:t>나머지 생성 파라미터는 &lt;Table </w:t>
+        <w:t xml:space="preserve">나머지 생성 파라미터는 &lt;Table 2&gt;</w:t>
       </w:r>
       <w:hyperlink w:anchor="tab:param">
         <w:r>
           <w:rPr>
             <w:rFonts w:asciiTheme="minorEastAsia" w:hAnsiTheme="minorEastAsia"/>
           </w:rPr>
-          <w:t>[tab:param]</w:t>
+          <w:t xml:space="preserve"/>
         </w:r>
       </w:hyperlink>
       <w:r>
         <w:rPr>
           <w:rFonts w:asciiTheme="minorEastAsia" w:hAnsiTheme="minorEastAsia"/>
         </w:rPr>
-        <w:t>&gt;에 정리하였다. 화물이 특정 목적지로 쏠리는 정도는 이와 별개의 조건이며, 보고하는 모든 실험은 쏠림이 없는 조건을 사용한다(쏠린 조건과 군집 조건은 부록 A의 transfer DQN 학습에만 쓴다). 도어를 일렬로 늘어놓으면 이송시간이 도어 번호 차이로 정해져 도어 배정이 해에 미치는 영향이 작아지므로, 배정 결정이 실제로 품질을 가르도록 무작위 배치를 쓴다. 이송 거리를 10으로 나누는 것은 이송시간을 처리시간과 같은 크기 범위에 두기 위해서다.</w:t>
+        <w:t xml:space="preserve">에 정리하였다. 화물이 특정 목적지로 쏠리는 정도는 이와 별개의 조건이며, 보고하는 모든 실험은 쏠림이 없는 조건을 사용한다(쏠린 조건과 군집 조건은 부록 A의 transfer DQN 학습에만 쓴다). 도어를 일렬로 늘어놓으면 이송시간이 도어 번호 차이로 정해져 도어 배정이 해에 미치는 영향이 작아지므로, 배정 결정이 실제로 품질을 가르도록 무작위 배치를 쓴다. 이송 거리를 10으로 나누는 것은 이송시간을 처리시간과 같은 크기 범위에 두기 위해서다.</w:t>
       </w:r>
     </w:p>
     <w:tbl>
@@ -13829,7 +13810,7 @@
         <w:rPr>
           <w:rFonts w:asciiTheme="minorEastAsia" w:hAnsiTheme="minorEastAsia"/>
         </w:rPr>
-        <w:t>비교 대상은 다섯이다. (i) VAA는 구성 휴리스틱만 적용한 초기해, (ii) Paper-SA-RL5는 원 모델의 재구현이며, (iii)–(v) GILS-uniform, GILS-tabular, GILS-DQN은 선택 정책만 바꾼 제안 방법의 세 변형이다. 제안 방법의 기본값은 GILS-uniform이고 나머지 두 변형은 학습 기반 선택의 효과를 보기 위한 것이다. 여기에 CP-SAT 결과를 함께 보고한다. 원 모델은 도착 시각과 납기를 다루지 않으므로 Paper-SA-RL5는 none 조건에서만 비교한다.</w:t>
+        <w:t xml:space="preserve">비교 대상은 여섯이다. (i) VAA는 구성 휴리스틱만 적용한 초기해, (ii) Paper-SA-RL5는 원 모델의 재구현, (iii) Extended SA-RL5는 Paper-SA-RL5의 해 표현·이웃 구조·Q-learning 연산자 선택·SA acceptance를 그대로 두고 evaluator와 목적식만 식 (16)으로 확장한 것이며, (iv)–(vi) GILS-uniform, GILS-tabular, GILS-DQN은 선택 정책만 바꾼 제안 방법의 세 변형이다. 제안 방법의 기본값은 GILS-uniform이고 나머지 두 변형은 학습 기반 선택의 효과를 보기 위한 것이다. 여기에 CP-SAT 결과를 함께 보고한다. 원 모델은 도착 시각과 납기를 다루지 않으므로 Paper-SA-RL5는 none 조건에서, Extended SA-RL5는 medium과 tight 조건에서 비교한다. none 조건에서는 납기지연 항이 사라져 Extended SA-RL5가 Paper-SA-RL5와 같아진다.</w:t>
       </w:r>
     </w:p>
     <w:p>
@@ -13859,7 +13840,7 @@
         <w:rPr>
           <w:rFonts w:asciiTheme="minorEastAsia" w:hAnsiTheme="minorEastAsia"/>
         </w:rPr>
-        <w:t>와 같은 설계 값은 조정 집합에서만 고르므로 시험 집합의 성능이 부풀려지지 않는다. 주 해품질 비교(&lt;Table 2&gt;)는 조건당 시험 인스턴스 20개를 각각 5회 반복 실행한다. 인스턴스마다 난이도가 다르므로 여러 개가 필요하고, 알고리즘에 무작위성이 있으므로 같은 인스턴스도 여러 번 실행한다. 통제된 ablation(&lt;Table 3&gt;–&lt;Table 5&gt;)은 같은 엔진에서 구성요소만 떼어내는 짝지은 비교여서 인스턴스 간 난이도 편차가 상쇄되므로 조건당 5개만 사용한다.</w:t>
+        <w:t xml:space="preserve">와 acceptance 규칙 같은 설계 값은 조정 집합에서만 고르므로 시험 집합의 성능이 부풀려지지 않는다. 주 해품질 비교(&lt;Table 3&gt;)는 조건당 시험 인스턴스 20개를 각각 5회 반복 실행한다. 인스턴스마다 난이도가 다르므로 여러 개가 필요하고, 알고리즘에 무작위성이 있으므로 같은 인스턴스도 여러 번 실행한다. 통제된 ablation(&lt;Table 4&gt;, &lt;Table 5&gt;)은 같은 엔진에서 구성요소만 떼어내는 짝지은 비교여서 인스턴스 간 난이도 편차가 상쇄되므로 조건당 5개만 사용하고, 선택 정책 비교(&lt;Table 6&gt;)는 주 비교와 같은 조건당 20개 인스턴스를 사용한다.</w:t>
       </w:r>
     </w:p>
     <w:p>
@@ -13875,7 +13856,30 @@
         <w:rPr>
           <w:rFonts w:asciiTheme="minorEastAsia" w:hAnsiTheme="minorEastAsia"/>
         </w:rPr>
-        <w:t xml:space="preserve">같은 인스턴스의 5회 반복은 서로 독립이 아니므로, 먼저 인스턴스별로 평균해 조건당 값 하나를 만든 뒤 짝지은 인스턴스 평균에 양측 Wilcoxon signed-rank test를 적용한다. 주 지표는 인스턴스별 격차 </w:t>
+        <w:t xml:space="preserve">같은 인스턴스의 5회 반복은 서로 독립이 아니므로, 먼저 인스턴스별로 평균해 조건당 값 하나를 만든 뒤 짝지은 인스턴스 평균에 양측 Wilcoxon signed-rank test를 </w:t>
+      </w:r>
+      <w:r>
+        <w:rPr>
+          <w:rFonts w:asciiTheme="minorEastAsia" w:hAnsiTheme="minorEastAsia"/>
+        </w:rPr>
+        <w:t xml:space="preserve">적용한다. 따라서 짝의 수 </w:t>
+      </w:r>
+      <m:oMath>
+        <m:r>
+          <m:t>n</m:t>
+        </m:r>
+      </m:oMath>
+      <w:r>
+        <w:rPr>
+          <w:rFonts w:asciiTheme="minorEastAsia" w:hAnsiTheme="minorEastAsia"/>
+        </w:rPr>
+        <w:t xml:space="preserve">은 비교에 포함된 인스턴스 수를 넘지 않으며, 두 방법의 평균이 같아 차이가 0인 짝은 검정에서 제외된다. 주 지표는</w:t>
+      </w:r>
+      <w:r>
+        <w:rPr>
+          <w:rFonts w:asciiTheme="minorEastAsia" w:hAnsiTheme="minorEastAsia"/>
+        </w:rPr>
+        <w:t xml:space="preserve"> 인스턴스별 격차 </w:t>
       </w:r>
       <m:oMath>
         <m:sSub>
@@ -13975,35 +13979,19 @@
         <w:rPr>
           <w:rFonts w:asciiTheme="minorEastAsia" w:hAnsiTheme="minorEastAsia"/>
         </w:rPr>
-        <w:t>&lt;Table 3&gt;에 20개 인스턴스에 대한 시험 결과를 요약하였다.</w:t>
-      </w:r>
-      <w:hyperlink w:anchor="tab:main"/>
-      <w:r>
-        <w:rPr>
-          <w:rFonts w:asciiTheme="minorEastAsia" w:hAnsiTheme="minorEastAsia"/>
-        </w:rPr>
-        <w:t xml:space="preserve"> CP-SAT가 기준해를 제공한 실험 조건에서 GILS는 이에 근접하며, 기본 선택 정책인 균등 선택 기준으로 그 격차는 평균 0.11–0.21%이다(학습 선택 정책을 포함한 전체 변형은 0.1–0.6%). 같은 선택 정책 기준으로 GILS는 VAA를 평균 2.65%(</w:t>
+        <w:t xml:space="preserve">&lt;Table 3&gt;에 20개 인스턴스에 대한 시험 결과를 요약한다. CP-SAT가 기준해를 제공한 실험 조건에서 GILS는 이에 근접하며, 기본 선택 정책인 균등 선택 기준으로 그 격차는 평균 0.06–0.25%이다(학습 선택 정책을 포함한 전체 변형은 0.06–0.47%). 같은 선택 정책 기준으로 VAA 대비 격차는 평균 2.66%(</w:t>
       </w:r>
       <m:oMath>
         <m:r>
-          <w:rPr>
-            <w:rFonts w:ascii="Cambria Math" w:hAnsi="Cambria Math"/>
-          </w:rPr>
           <m:t>n</m:t>
         </m:r>
         <m:r>
           <m:rPr>
             <m:sty m:val="p"/>
           </m:rPr>
-          <w:rPr>
-            <w:rFonts w:ascii="Cambria Math" w:hAnsi="Cambria Math"/>
-          </w:rPr>
           <m:t>=</m:t>
         </m:r>
         <m:r>
-          <w:rPr>
-            <w:rFonts w:ascii="Cambria Math" w:hAnsi="Cambria Math"/>
-          </w:rPr>
           <m:t>180</m:t>
         </m:r>
       </m:oMath>
@@ -14015,81 +14003,35 @@
       </w:r>
       <m:oMath>
         <m:r>
-          <w:rPr>
-            <w:rFonts w:ascii="Cambria Math" w:hAnsi="Cambria Math"/>
-          </w:rPr>
           <m:t>p</m:t>
         </m:r>
         <m:r>
           <m:rPr>
             <m:sty m:val="p"/>
           </m:rPr>
-          <w:rPr>
-            <w:rFonts w:ascii="Cambria Math" w:hAnsi="Cambria Math"/>
-          </w:rPr>
           <m:t>&lt;</m:t>
         </m:r>
-        <m:sSup>
-          <m:sSupPr>
-            <m:ctrlPr>
-              <w:rPr>
-                <w:rFonts w:ascii="Cambria Math" w:hAnsi="Cambria Math"/>
-              </w:rPr>
-            </m:ctrlPr>
-          </m:sSupPr>
-          <m:e>
-            <m:r>
-              <w:rPr>
-                <w:rFonts w:ascii="Cambria Math" w:hAnsi="Cambria Math"/>
-              </w:rPr>
-              <m:t>10</m:t>
-            </m:r>
-          </m:e>
-          <m:sup>
-            <m:r>
-              <m:rPr>
-                <m:sty m:val="p"/>
-              </m:rPr>
-              <w:rPr>
-                <w:rFonts w:ascii="Cambria Math" w:hAnsi="Cambria Math"/>
-              </w:rPr>
-              <m:t>-</m:t>
-            </m:r>
-            <m:r>
-              <w:rPr>
-                <w:rFonts w:ascii="Cambria Math" w:hAnsi="Cambria Math"/>
-              </w:rPr>
-              <m:t>4</m:t>
-            </m:r>
-          </m:sup>
-        </m:sSup>
+        <m:r>
+          <m:t>0.0001</m:t>
+        </m:r>
       </m:oMath>
       <w:r>
         <w:rPr>
           <w:rFonts w:asciiTheme="minorEastAsia" w:hAnsiTheme="minorEastAsia"/>
         </w:rPr>
-        <w:t>), SA-RL5를 1.38%(</w:t>
+        <w:t xml:space="preserve">), SA-RL5 대비 격차는 1.38%(</w:t>
       </w:r>
       <m:oMath>
         <m:r>
-          <w:rPr>
-            <w:rFonts w:ascii="Cambria Math" w:hAnsi="Cambria Math"/>
-          </w:rPr>
           <m:t>n</m:t>
         </m:r>
         <m:r>
           <m:rPr>
             <m:sty m:val="p"/>
           </m:rPr>
-          <w:rPr>
-            <w:rFonts w:ascii="Cambria Math" w:hAnsi="Cambria Math"/>
-          </w:rPr>
           <m:t>=</m:t>
         </m:r>
         <m:r>
-          <w:rPr>
-            <w:rFonts w:ascii="Cambria Math" w:hAnsi="Cambria Math"/>
-          </w:rPr>
           <m:t>60</m:t>
         </m:r>
       </m:oMath>
@@ -14101,60 +14043,63 @@
       </w:r>
       <m:oMath>
         <m:r>
-          <w:rPr>
-            <w:rFonts w:ascii="Cambria Math" w:hAnsi="Cambria Math"/>
-          </w:rPr>
           <m:t>p</m:t>
         </m:r>
         <m:r>
           <m:rPr>
             <m:sty m:val="p"/>
           </m:rPr>
-          <w:rPr>
-            <w:rFonts w:ascii="Cambria Math" w:hAnsi="Cambria Math"/>
-          </w:rPr>
           <m:t>&lt;</m:t>
         </m:r>
-        <m:sSup>
-          <m:sSupPr>
-            <m:ctrlPr>
-              <w:rPr>
-                <w:rFonts w:ascii="Cambria Math" w:hAnsi="Cambria Math"/>
-              </w:rPr>
-            </m:ctrlPr>
-          </m:sSupPr>
-          <m:e>
-            <m:r>
-              <w:rPr>
-                <w:rFonts w:ascii="Cambria Math" w:hAnsi="Cambria Math"/>
-              </w:rPr>
-              <m:t>10</m:t>
-            </m:r>
-          </m:e>
-          <m:sup>
-            <m:r>
-              <m:rPr>
-                <m:sty m:val="p"/>
-              </m:rPr>
-              <w:rPr>
-                <w:rFonts w:ascii="Cambria Math" w:hAnsi="Cambria Math"/>
-              </w:rPr>
-              <m:t>-</m:t>
-            </m:r>
-            <m:r>
-              <w:rPr>
-                <w:rFonts w:ascii="Cambria Math" w:hAnsi="Cambria Math"/>
-              </w:rPr>
-              <m:t>4</m:t>
-            </m:r>
-          </m:sup>
-        </m:sSup>
+        <m:r>
+          <m:t>0.0001</m:t>
+        </m:r>
       </m:oMath>
       <w:r>
         <w:rPr>
           <w:rFonts w:asciiTheme="minorEastAsia" w:hAnsiTheme="minorEastAsia"/>
         </w:rPr>
-        <w:t>) 능가한다. 실행 시간은 S/M/L에서 각각 0.11, 0.52, 2.3초로, 같은 조건의 CP-SAT(76, 237, 376초)보다 두세 자릿수 빠르다.</w:t>
+        <w:t xml:space="preserve">)이다. medium과 tight 조건에서 Extended SA-RL5 대비 격차는 평균 0.89%(</w:t>
+      </w:r>
+      <m:oMath>
+        <m:r>
+          <m:t>n</m:t>
+        </m:r>
+        <m:r>
+          <m:rPr>
+            <m:sty m:val="p"/>
+          </m:rPr>
+          <m:t>=</m:t>
+        </m:r>
+        <m:r>
+          <m:t>120</m:t>
+        </m:r>
+      </m:oMath>
+      <w:r>
+        <w:rPr>
+          <w:rFonts w:asciiTheme="minorEastAsia" w:hAnsiTheme="minorEastAsia"/>
+        </w:rPr>
+        <w:t xml:space="preserve">, </w:t>
+      </w:r>
+      <m:oMath>
+        <m:r>
+          <m:t>p</m:t>
+        </m:r>
+        <m:r>
+          <m:rPr>
+            <m:sty m:val="p"/>
+          </m:rPr>
+          <m:t>&lt;</m:t>
+        </m:r>
+        <m:r>
+          <m:t>0.0001</m:t>
+        </m:r>
+      </m:oMath>
+      <w:r>
+        <w:rPr>
+          <w:rFonts w:asciiTheme="minorEastAsia" w:hAnsiTheme="minorEastAsia"/>
+        </w:rPr>
+        <w:t xml:space="preserve">)이다. 실행 시간은 S/M/L에서 각각 0.09, 0.55, 3.17초로, 같은 조건의 CP-SAT(76, 237, 376초)보다 100배 이상 빠르다.</w:t>
       </w:r>
     </w:p>
     <w:p>
@@ -14228,7 +14173,7 @@
           <w:sz w:val="18"/>
         </w:rPr>
         <w:lastRenderedPageBreak/>
-        <w:t>on the subset for which CP-SAT returned a reference (5 instances per S condition, 2 for M-none); optimality was proven only for S-none. On that subset the mean CP-SAT runtime is 76 s (S) and 237 s (M-none).</w:t>
+        <w:t xml:space="preserve">on the subset for which CP-SAT returned a reference (5 instances per S condition, 2 for M-none); optimality was proven only for S-none. On that subset the mean CP-SAT runtime is 76 s (S) and 606 s (M-none).</w:t>
       </w:r>
     </w:p>
     <w:tbl>
@@ -14426,7 +14371,7 @@
                 <w:rFonts w:asciiTheme="minorEastAsia" w:hAnsiTheme="minorEastAsia"/>
                 <w:sz w:val="18"/>
               </w:rPr>
-              <w:t>S-none</w:t>
+              <w:t xml:space="preserve">S-none</w:t>
             </w:r>
           </w:p>
         </w:tc>
@@ -14447,7 +14392,7 @@
                 <w:rFonts w:asciiTheme="minorEastAsia" w:hAnsiTheme="minorEastAsia"/>
                 <w:sz w:val="18"/>
               </w:rPr>
-              <w:t>VAA</w:t>
+              <w:t xml:space="preserve">VAA</w:t>
             </w:r>
           </w:p>
         </w:tc>
@@ -14469,7 +14414,7 @@
                 <w:rFonts w:asciiTheme="minorEastAsia" w:hAnsiTheme="minorEastAsia"/>
                 <w:sz w:val="18"/>
               </w:rPr>
-              <w:t>1497.5 ± 400.3</w:t>
+              <w:t xml:space="preserve">1497.5 ± 400.3</w:t>
             </w:r>
           </w:p>
         </w:tc>
@@ -14491,7 +14436,7 @@
                 <w:rFonts w:asciiTheme="minorEastAsia" w:hAnsiTheme="minorEastAsia"/>
                 <w:sz w:val="18"/>
               </w:rPr>
-              <w:t>6.60</w:t>
+              <w:t xml:space="preserve">6.58</w:t>
             </w:r>
           </w:p>
         </w:tc>
@@ -14513,7 +14458,7 @@
                 <w:rFonts w:asciiTheme="minorEastAsia" w:hAnsiTheme="minorEastAsia"/>
                 <w:sz w:val="18"/>
               </w:rPr>
-              <w:t>+6.49</w:t>
+              <w:t xml:space="preserve">+6.49</w:t>
             </w:r>
           </w:p>
         </w:tc>
@@ -14535,7 +14480,7 @@
                 <w:rFonts w:asciiTheme="minorEastAsia" w:hAnsiTheme="minorEastAsia"/>
                 <w:sz w:val="18"/>
               </w:rPr>
-              <w:t>0.00</w:t>
+              <w:t xml:space="preserve">0.00</w:t>
             </w:r>
           </w:p>
         </w:tc>
@@ -14572,7 +14517,7 @@
                 <w:rFonts w:asciiTheme="minorEastAsia" w:hAnsiTheme="minorEastAsia"/>
                 <w:sz w:val="18"/>
               </w:rPr>
-              <w:t>Paper-SA-RL5</w:t>
+              <w:t xml:space="preserve">Paper-SA-RL5</w:t>
             </w:r>
           </w:p>
         </w:tc>
@@ -14594,7 +14539,7 @@
                 <w:rFonts w:asciiTheme="minorEastAsia" w:hAnsiTheme="minorEastAsia"/>
                 <w:sz w:val="18"/>
               </w:rPr>
-              <w:t>1423.3 ± 383.6</w:t>
+              <w:t xml:space="preserve">1423.3 ± 383.6</w:t>
             </w:r>
           </w:p>
         </w:tc>
@@ -14616,7 +14561,7 @@
                 <w:rFonts w:asciiTheme="minorEastAsia" w:hAnsiTheme="minorEastAsia"/>
                 <w:sz w:val="18"/>
               </w:rPr>
-              <w:t>1.03</w:t>
+              <w:t xml:space="preserve">1.01</w:t>
             </w:r>
           </w:p>
         </w:tc>
@@ -14638,7 +14583,7 @@
                 <w:rFonts w:asciiTheme="minorEastAsia" w:hAnsiTheme="minorEastAsia"/>
                 <w:sz w:val="18"/>
               </w:rPr>
-              <w:t>+1.21</w:t>
+              <w:t xml:space="preserve">+1.21</w:t>
             </w:r>
           </w:p>
         </w:tc>
@@ -14660,7 +14605,7 @@
                 <w:rFonts w:asciiTheme="minorEastAsia" w:hAnsiTheme="minorEastAsia"/>
                 <w:sz w:val="18"/>
               </w:rPr>
-              <w:t>0.15</w:t>
+              <w:t xml:space="preserve">0.15</w:t>
             </w:r>
           </w:p>
         </w:tc>
@@ -14697,7 +14642,7 @@
                 <w:rFonts w:asciiTheme="minorEastAsia" w:hAnsiTheme="minorEastAsia"/>
                 <w:sz w:val="18"/>
               </w:rPr>
-              <w:t>GILS-uniform</w:t>
+              <w:t xml:space="preserve">GILS-uniform</w:t>
             </w:r>
           </w:p>
         </w:tc>
@@ -14719,7 +14664,7 @@
                 <w:rFonts w:asciiTheme="minorEastAsia" w:hAnsiTheme="minorEastAsia"/>
                 <w:sz w:val="18"/>
               </w:rPr>
-              <w:t>1411.8 ± 382.7</w:t>
+              <w:t xml:space="preserve">1412.5 ± 381.8</w:t>
             </w:r>
           </w:p>
         </w:tc>
@@ -14741,7 +14686,7 @@
                 <w:rFonts w:asciiTheme="minorEastAsia" w:hAnsiTheme="minorEastAsia"/>
                 <w:sz w:val="18"/>
               </w:rPr>
-              <w:t>0.16</w:t>
+              <w:t xml:space="preserve">0.22</w:t>
             </w:r>
           </w:p>
         </w:tc>
@@ -14763,7 +14708,7 @@
                 <w:rFonts w:asciiTheme="minorEastAsia" w:hAnsiTheme="minorEastAsia"/>
                 <w:sz w:val="18"/>
               </w:rPr>
-              <w:t>+0.21</w:t>
+              <w:t xml:space="preserve">+0.23</w:t>
             </w:r>
           </w:p>
         </w:tc>
@@ -14785,7 +14730,7 @@
                 <w:rFonts w:asciiTheme="minorEastAsia" w:hAnsiTheme="minorEastAsia"/>
                 <w:sz w:val="18"/>
               </w:rPr>
-              <w:t>0.08</w:t>
+              <w:t xml:space="preserve">0.09</w:t>
             </w:r>
           </w:p>
         </w:tc>
@@ -14822,7 +14767,7 @@
                 <w:rFonts w:asciiTheme="minorEastAsia" w:hAnsiTheme="minorEastAsia"/>
                 <w:sz w:val="18"/>
               </w:rPr>
-              <w:t>GILS-tabular</w:t>
+              <w:t xml:space="preserve">GILS-tabular</w:t>
             </w:r>
           </w:p>
         </w:tc>
@@ -14844,7 +14789,7 @@
                 <w:rFonts w:asciiTheme="minorEastAsia" w:hAnsiTheme="minorEastAsia"/>
                 <w:sz w:val="18"/>
               </w:rPr>
-              <w:t>1412.9 ± 381.3</w:t>
+              <w:t xml:space="preserve">1413.7 ± 382.5</w:t>
             </w:r>
           </w:p>
         </w:tc>
@@ -14866,7 +14811,7 @@
                 <w:rFonts w:asciiTheme="minorEastAsia" w:hAnsiTheme="minorEastAsia"/>
                 <w:sz w:val="18"/>
               </w:rPr>
-              <w:t>0.28</w:t>
+              <w:t xml:space="preserve">0.28</w:t>
             </w:r>
           </w:p>
         </w:tc>
@@ -14888,7 +14833,7 @@
                 <w:rFonts w:asciiTheme="minorEastAsia" w:hAnsiTheme="minorEastAsia"/>
                 <w:sz w:val="18"/>
               </w:rPr>
-              <w:t>+0.33</w:t>
+              <w:t xml:space="preserve">+0.42</w:t>
             </w:r>
           </w:p>
         </w:tc>
@@ -14910,7 +14855,7 @@
                 <w:rFonts w:asciiTheme="minorEastAsia" w:hAnsiTheme="minorEastAsia"/>
                 <w:sz w:val="18"/>
               </w:rPr>
-              <w:t>0.11</w:t>
+              <w:t xml:space="preserve">0.11</w:t>
             </w:r>
           </w:p>
         </w:tc>
@@ -14947,7 +14892,7 @@
                 <w:rFonts w:asciiTheme="minorEastAsia" w:hAnsiTheme="minorEastAsia"/>
                 <w:sz w:val="18"/>
               </w:rPr>
-              <w:t>GILS-DQN</w:t>
+              <w:t xml:space="preserve">GILS-DQN</w:t>
             </w:r>
           </w:p>
         </w:tc>
@@ -14969,7 +14914,7 @@
                 <w:rFonts w:asciiTheme="minorEastAsia" w:hAnsiTheme="minorEastAsia"/>
                 <w:sz w:val="18"/>
               </w:rPr>
-              <w:t>1416.1 ± 382.4</w:t>
+              <w:t xml:space="preserve">1413.4 ± 382.1</w:t>
             </w:r>
           </w:p>
         </w:tc>
@@ -14991,7 +14936,7 @@
                 <w:rFonts w:asciiTheme="minorEastAsia" w:hAnsiTheme="minorEastAsia"/>
                 <w:sz w:val="18"/>
               </w:rPr>
-              <w:t>0.51</w:t>
+              <w:t xml:space="preserve">0.27</w:t>
             </w:r>
           </w:p>
         </w:tc>
@@ -15013,7 +14958,7 @@
                 <w:rFonts w:asciiTheme="minorEastAsia" w:hAnsiTheme="minorEastAsia"/>
                 <w:sz w:val="18"/>
               </w:rPr>
-              <w:t>+0.75</w:t>
+              <w:t xml:space="preserve">+0.40</w:t>
             </w:r>
           </w:p>
         </w:tc>
@@ -15035,7 +14980,7 @@
                 <w:rFonts w:asciiTheme="minorEastAsia" w:hAnsiTheme="minorEastAsia"/>
                 <w:sz w:val="18"/>
               </w:rPr>
-              <w:t>0.23</w:t>
+              <w:t xml:space="preserve">0.23</w:t>
             </w:r>
           </w:p>
         </w:tc>
@@ -15058,7 +15003,7 @@
                 <w:rFonts w:asciiTheme="minorEastAsia" w:hAnsiTheme="minorEastAsia"/>
                 <w:sz w:val="18"/>
               </w:rPr>
-              <w:t>S-medium</w:t>
+              <w:t xml:space="preserve">S-medium</w:t>
             </w:r>
           </w:p>
         </w:tc>
@@ -15079,7 +15024,7 @@
                 <w:rFonts w:asciiTheme="minorEastAsia" w:hAnsiTheme="minorEastAsia"/>
                 <w:sz w:val="18"/>
               </w:rPr>
-              <w:t>VAA</w:t>
+              <w:t xml:space="preserve">VAA</w:t>
             </w:r>
           </w:p>
         </w:tc>
@@ -15101,7 +15046,7 @@
                 <w:rFonts w:asciiTheme="minorEastAsia" w:hAnsiTheme="minorEastAsia"/>
                 <w:sz w:val="18"/>
               </w:rPr>
-              <w:t>5447.5 ± 1468.9</w:t>
+              <w:t xml:space="preserve">5447.5 ± 1468.9</w:t>
             </w:r>
           </w:p>
         </w:tc>
@@ -15123,7 +15068,7 @@
                 <w:rFonts w:asciiTheme="minorEastAsia" w:hAnsiTheme="minorEastAsia"/>
                 <w:sz w:val="18"/>
               </w:rPr>
-              <w:t>3.89</w:t>
+              <w:t xml:space="preserve">3.87</w:t>
             </w:r>
           </w:p>
         </w:tc>
@@ -15145,7 +15090,7 @@
                 <w:rFonts w:asciiTheme="minorEastAsia" w:hAnsiTheme="minorEastAsia"/>
                 <w:sz w:val="18"/>
               </w:rPr>
-              <w:t>+3.33</w:t>
+              <w:t xml:space="preserve">+3.33</w:t>
             </w:r>
           </w:p>
         </w:tc>
@@ -15167,7 +15112,7 @@
                 <w:rFonts w:asciiTheme="minorEastAsia" w:hAnsiTheme="minorEastAsia"/>
                 <w:sz w:val="18"/>
               </w:rPr>
-              <w:t>0.00</w:t>
+              <w:t xml:space="preserve">0.00</w:t>
             </w:r>
           </w:p>
         </w:tc>
@@ -15204,7 +15149,7 @@
                 <w:rFonts w:asciiTheme="minorEastAsia" w:hAnsiTheme="minorEastAsia"/>
                 <w:sz w:val="18"/>
               </w:rPr>
-              <w:t>GILS-uniform</w:t>
+              <w:t xml:space="preserve">Extended-SA-RL5</w:t>
             </w:r>
           </w:p>
         </w:tc>
@@ -15226,7 +15171,7 @@
                 <w:rFonts w:asciiTheme="minorEastAsia" w:hAnsiTheme="minorEastAsia"/>
                 <w:sz w:val="18"/>
               </w:rPr>
-              <w:t>5255.7 ± 1413.3</w:t>
+              <w:t xml:space="preserve">5289.1 ± 1428.9</w:t>
             </w:r>
           </w:p>
         </w:tc>
@@ -15248,7 +15193,7 @@
                 <w:rFonts w:asciiTheme="minorEastAsia" w:hAnsiTheme="minorEastAsia"/>
                 <w:sz w:val="18"/>
               </w:rPr>
-              <w:t>0.08</w:t>
+              <w:t xml:space="preserve">0.69</w:t>
             </w:r>
           </w:p>
         </w:tc>
@@ -15270,7 +15215,7 @@
                 <w:rFonts w:asciiTheme="minorEastAsia" w:hAnsiTheme="minorEastAsia"/>
                 <w:sz w:val="18"/>
               </w:rPr>
-              <w:t>+0.11</w:t>
+              <w:t xml:space="preserve">+0.90</w:t>
             </w:r>
           </w:p>
         </w:tc>
@@ -15292,7 +15237,7 @@
                 <w:rFonts w:asciiTheme="minorEastAsia" w:hAnsiTheme="minorEastAsia"/>
                 <w:sz w:val="18"/>
               </w:rPr>
-              <w:t>0.08</w:t>
+              <w:t xml:space="preserve">0.17</w:t>
             </w:r>
           </w:p>
         </w:tc>
@@ -15329,7 +15274,7 @@
                 <w:rFonts w:asciiTheme="minorEastAsia" w:hAnsiTheme="minorEastAsia"/>
                 <w:sz w:val="18"/>
               </w:rPr>
-              <w:t>GILS-tabular</w:t>
+              <w:t xml:space="preserve">GILS-uniform</w:t>
             </w:r>
           </w:p>
         </w:tc>
@@ -15351,7 +15296,7 @@
                 <w:rFonts w:asciiTheme="minorEastAsia" w:hAnsiTheme="minorEastAsia"/>
                 <w:sz w:val="18"/>
               </w:rPr>
-              <w:t>5259.1 ± 1412.3</w:t>
+              <w:t xml:space="preserve">5258.8 ± 1412.7</w:t>
             </w:r>
           </w:p>
         </w:tc>
@@ -15373,7 +15318,7 @@
                 <w:rFonts w:asciiTheme="minorEastAsia" w:hAnsiTheme="minorEastAsia"/>
                 <w:sz w:val="18"/>
               </w:rPr>
-              <w:t>0.15</w:t>
+              <w:t xml:space="preserve">0.13</w:t>
             </w:r>
           </w:p>
         </w:tc>
@@ -15395,7 +15340,7 @@
                 <w:rFonts w:asciiTheme="minorEastAsia" w:hAnsiTheme="minorEastAsia"/>
                 <w:sz w:val="18"/>
               </w:rPr>
-              <w:t>+0.18</w:t>
+              <w:t xml:space="preserve">+0.16</w:t>
             </w:r>
           </w:p>
         </w:tc>
@@ -15417,7 +15362,7 @@
                 <w:rFonts w:asciiTheme="minorEastAsia" w:hAnsiTheme="minorEastAsia"/>
                 <w:sz w:val="18"/>
               </w:rPr>
-              <w:t>0.11</w:t>
+              <w:t xml:space="preserve">0.09</w:t>
             </w:r>
           </w:p>
         </w:tc>
@@ -15454,7 +15399,7 @@
                 <w:rFonts w:asciiTheme="minorEastAsia" w:hAnsiTheme="minorEastAsia"/>
                 <w:sz w:val="18"/>
               </w:rPr>
-              <w:t>GILS-DQN</w:t>
+              <w:t xml:space="preserve">GILS-tabular</w:t>
             </w:r>
           </w:p>
         </w:tc>
@@ -15476,7 +15421,7 @@
                 <w:rFonts w:asciiTheme="minorEastAsia" w:hAnsiTheme="minorEastAsia"/>
                 <w:sz w:val="18"/>
               </w:rPr>
-              <w:t>5270.8 ± 1415.3</w:t>
+              <w:t xml:space="preserve">5262.0 ± 1409.6</w:t>
             </w:r>
           </w:p>
         </w:tc>
@@ -15498,7 +15443,7 @@
                 <w:rFonts w:asciiTheme="minorEastAsia" w:hAnsiTheme="minorEastAsia"/>
                 <w:sz w:val="18"/>
               </w:rPr>
-              <w:t>0.38</w:t>
+              <w:t xml:space="preserve">0.21</w:t>
             </w:r>
           </w:p>
         </w:tc>
@@ -15520,7 +15465,7 @@
                 <w:rFonts w:asciiTheme="minorEastAsia" w:hAnsiTheme="minorEastAsia"/>
                 <w:sz w:val="18"/>
               </w:rPr>
-              <w:t>+0.55</w:t>
+              <w:t xml:space="preserve">+0.17</w:t>
             </w:r>
           </w:p>
         </w:tc>
@@ -15542,7 +15487,7 @@
                 <w:rFonts w:asciiTheme="minorEastAsia" w:hAnsiTheme="minorEastAsia"/>
                 <w:sz w:val="18"/>
               </w:rPr>
-              <w:t>0.22</w:t>
+              <w:t xml:space="preserve">0.12</w:t>
             </w:r>
           </w:p>
         </w:tc>
@@ -15560,13 +15505,6 @@
                 <w:rFonts w:asciiTheme="minorEastAsia" w:hAnsiTheme="minorEastAsia"/>
               </w:rPr>
             </w:pPr>
-            <w:r>
-              <w:rPr>
-                <w:rFonts w:asciiTheme="minorEastAsia" w:hAnsiTheme="minorEastAsia"/>
-                <w:sz w:val="18"/>
-              </w:rPr>
-              <w:t>S-tight</w:t>
-            </w:r>
           </w:p>
         </w:tc>
         <w:tc>
@@ -15586,7 +15524,7 @@
                 <w:rFonts w:asciiTheme="minorEastAsia" w:hAnsiTheme="minorEastAsia"/>
                 <w:sz w:val="18"/>
               </w:rPr>
-              <w:t>VAA</w:t>
+              <w:t xml:space="preserve">GILS-DQN</w:t>
             </w:r>
           </w:p>
         </w:tc>
@@ -15608,7 +15546,7 @@
                 <w:rFonts w:asciiTheme="minorEastAsia" w:hAnsiTheme="minorEastAsia"/>
                 <w:sz w:val="18"/>
               </w:rPr>
-              <w:t>9276.8 ± 2387.6</w:t>
+              <w:t xml:space="preserve">5275.2 ± 1412.5</w:t>
             </w:r>
           </w:p>
         </w:tc>
@@ -15630,7 +15568,7 @@
                 <w:rFonts w:asciiTheme="minorEastAsia" w:hAnsiTheme="minorEastAsia"/>
                 <w:sz w:val="18"/>
               </w:rPr>
-              <w:t>2.90</w:t>
+              <w:t xml:space="preserve">0.47</w:t>
             </w:r>
           </w:p>
         </w:tc>
@@ -15652,7 +15590,7 @@
                 <w:rFonts w:asciiTheme="minorEastAsia" w:hAnsiTheme="minorEastAsia"/>
                 <w:sz w:val="18"/>
               </w:rPr>
-              <w:t>+2.17</w:t>
+              <w:t xml:space="preserve">+0.47</w:t>
             </w:r>
           </w:p>
         </w:tc>
@@ -15674,7 +15612,7 @@
                 <w:rFonts w:asciiTheme="minorEastAsia" w:hAnsiTheme="minorEastAsia"/>
                 <w:sz w:val="18"/>
               </w:rPr>
-              <w:t>0.00</w:t>
+              <w:t xml:space="preserve">0.23</w:t>
             </w:r>
           </w:p>
         </w:tc>
@@ -15692,6 +15630,13 @@
                 <w:rFonts w:asciiTheme="minorEastAsia" w:hAnsiTheme="minorEastAsia"/>
               </w:rPr>
             </w:pPr>
+            <w:r>
+              <w:rPr>
+                <w:rFonts w:asciiTheme="minorEastAsia" w:hAnsiTheme="minorEastAsia"/>
+                <w:sz w:val="18"/>
+              </w:rPr>
+              <w:t xml:space="preserve">S-tight</w:t>
+            </w:r>
           </w:p>
         </w:tc>
         <w:tc>
@@ -15711,7 +15656,7 @@
                 <w:rFonts w:asciiTheme="minorEastAsia" w:hAnsiTheme="minorEastAsia"/>
                 <w:sz w:val="18"/>
               </w:rPr>
-              <w:t>GILS-uniform</w:t>
+              <w:t xml:space="preserve">VAA</w:t>
             </w:r>
           </w:p>
         </w:tc>
@@ -15733,7 +15678,7 @@
                 <w:rFonts w:asciiTheme="minorEastAsia" w:hAnsiTheme="minorEastAsia"/>
                 <w:sz w:val="18"/>
               </w:rPr>
-              <w:t>9010.8 ± 2206.1</w:t>
+              <w:t xml:space="preserve">9276.8 ± 2387.6</w:t>
             </w:r>
           </w:p>
         </w:tc>
@@ -15755,7 +15700,7 @@
                 <w:rFonts w:asciiTheme="minorEastAsia" w:hAnsiTheme="minorEastAsia"/>
                 <w:sz w:val="18"/>
               </w:rPr>
-              <w:t>0.09</w:t>
+              <w:t xml:space="preserve">2.90</w:t>
             </w:r>
           </w:p>
         </w:tc>
@@ -15777,7 +15722,7 @@
                 <w:rFonts w:asciiTheme="minorEastAsia" w:hAnsiTheme="minorEastAsia"/>
                 <w:sz w:val="18"/>
               </w:rPr>
-              <w:t>+0.21</w:t>
+              <w:t xml:space="preserve">+2.17</w:t>
             </w:r>
           </w:p>
         </w:tc>
@@ -15799,7 +15744,7 @@
                 <w:rFonts w:asciiTheme="minorEastAsia" w:hAnsiTheme="minorEastAsia"/>
                 <w:sz w:val="18"/>
               </w:rPr>
-              <w:t>0.09</w:t>
+              <w:t xml:space="preserve">0.00</w:t>
             </w:r>
           </w:p>
         </w:tc>
@@ -15836,7 +15781,7 @@
                 <w:rFonts w:asciiTheme="minorEastAsia" w:hAnsiTheme="minorEastAsia"/>
                 <w:sz w:val="18"/>
               </w:rPr>
-              <w:t>GILS-tabular</w:t>
+              <w:t xml:space="preserve">Extended-SA-RL5</w:t>
             </w:r>
           </w:p>
         </w:tc>
@@ -15858,7 +15803,7 @@
                 <w:rFonts w:asciiTheme="minorEastAsia" w:hAnsiTheme="minorEastAsia"/>
                 <w:sz w:val="18"/>
               </w:rPr>
-              <w:t>9011.9 ± 2206.7</w:t>
+              <w:t xml:space="preserve">9057.4 ± 2224.3</w:t>
             </w:r>
           </w:p>
         </w:tc>
@@ -15880,7 +15825,7 @@
                 <w:rFonts w:asciiTheme="minorEastAsia" w:hAnsiTheme="minorEastAsia"/>
                 <w:sz w:val="18"/>
               </w:rPr>
-              <w:t>0.11</w:t>
+              <w:t xml:space="preserve">0.59</w:t>
             </w:r>
           </w:p>
         </w:tc>
@@ -15902,7 +15847,7 @@
                 <w:rFonts w:asciiTheme="minorEastAsia" w:hAnsiTheme="minorEastAsia"/>
                 <w:sz w:val="18"/>
               </w:rPr>
-              <w:t>+0.17</w:t>
+              <w:t xml:space="preserve">+0.69</w:t>
             </w:r>
           </w:p>
         </w:tc>
@@ -15924,7 +15869,7 @@
                 <w:rFonts w:asciiTheme="minorEastAsia" w:hAnsiTheme="minorEastAsia"/>
                 <w:sz w:val="18"/>
               </w:rPr>
-              <w:t>0.11</w:t>
+              <w:t xml:space="preserve">0.17</w:t>
             </w:r>
           </w:p>
         </w:tc>
@@ -15961,7 +15906,7 @@
                 <w:rFonts w:asciiTheme="minorEastAsia" w:hAnsiTheme="minorEastAsia"/>
                 <w:sz w:val="18"/>
               </w:rPr>
-              <w:t>GILS-DQN</w:t>
+              <w:t xml:space="preserve">GILS-uniform</w:t>
             </w:r>
           </w:p>
         </w:tc>
@@ -15983,7 +15928,7 @@
                 <w:rFonts w:asciiTheme="minorEastAsia" w:hAnsiTheme="minorEastAsia"/>
                 <w:sz w:val="18"/>
               </w:rPr>
-              <w:t>9022.0 ± 2205.3</w:t>
+              <w:t xml:space="preserve">9012.8 ± 2205.5</w:t>
             </w:r>
           </w:p>
         </w:tc>
@@ -16005,7 +15950,7 @@
                 <w:rFonts w:asciiTheme="minorEastAsia" w:hAnsiTheme="minorEastAsia"/>
                 <w:sz w:val="18"/>
               </w:rPr>
-              <w:t>0.23</w:t>
+              <w:t xml:space="preserve">0.11</w:t>
             </w:r>
           </w:p>
         </w:tc>
@@ -16027,7 +15972,7 @@
                 <w:rFonts w:asciiTheme="minorEastAsia" w:hAnsiTheme="minorEastAsia"/>
                 <w:sz w:val="18"/>
               </w:rPr>
-              <w:t>+0.34</w:t>
+              <w:t xml:space="preserve">+0.25</w:t>
             </w:r>
           </w:p>
         </w:tc>
@@ -16049,7 +15994,7 @@
                 <w:rFonts w:asciiTheme="minorEastAsia" w:hAnsiTheme="minorEastAsia"/>
                 <w:sz w:val="18"/>
               </w:rPr>
-              <w:t>0.22</w:t>
+              <w:t xml:space="preserve">0.09</w:t>
             </w:r>
           </w:p>
         </w:tc>
@@ -16067,13 +16012,6 @@
                 <w:rFonts w:asciiTheme="minorEastAsia" w:hAnsiTheme="minorEastAsia"/>
               </w:rPr>
             </w:pPr>
-            <w:r>
-              <w:rPr>
-                <w:rFonts w:asciiTheme="minorEastAsia" w:hAnsiTheme="minorEastAsia"/>
-                <w:sz w:val="18"/>
-              </w:rPr>
-              <w:t>M-none</w:t>
-            </w:r>
           </w:p>
         </w:tc>
         <w:tc>
@@ -16093,7 +16031,7 @@
                 <w:rFonts w:asciiTheme="minorEastAsia" w:hAnsiTheme="minorEastAsia"/>
                 <w:sz w:val="18"/>
               </w:rPr>
-              <w:t>VAA</w:t>
+              <w:t xml:space="preserve">GILS-tabular</w:t>
             </w:r>
           </w:p>
         </w:tc>
@@ -16115,7 +16053,7 @@
                 <w:rFonts w:asciiTheme="minorEastAsia" w:hAnsiTheme="minorEastAsia"/>
                 <w:sz w:val="18"/>
               </w:rPr>
-              <w:t>3030.9 ± 903.6</w:t>
+              <w:t xml:space="preserve">9016.9 ± 2206.4</w:t>
             </w:r>
           </w:p>
         </w:tc>
@@ -16137,7 +16075,7 @@
                 <w:rFonts w:asciiTheme="minorEastAsia" w:hAnsiTheme="minorEastAsia"/>
                 <w:sz w:val="18"/>
               </w:rPr>
-              <w:t>3.73</w:t>
+              <w:t xml:space="preserve">0.16</w:t>
             </w:r>
           </w:p>
         </w:tc>
@@ -16159,7 +16097,7 @@
                 <w:rFonts w:asciiTheme="minorEastAsia" w:hAnsiTheme="minorEastAsia"/>
                 <w:sz w:val="18"/>
               </w:rPr>
-              <w:t>+4.80</w:t>
+              <w:t xml:space="preserve">+0.30</w:t>
             </w:r>
           </w:p>
         </w:tc>
@@ -16181,7 +16119,7 @@
                 <w:rFonts w:asciiTheme="minorEastAsia" w:hAnsiTheme="minorEastAsia"/>
                 <w:sz w:val="18"/>
               </w:rPr>
-              <w:t>0.00</w:t>
+              <w:t xml:space="preserve">0.12</w:t>
             </w:r>
           </w:p>
         </w:tc>
@@ -16218,7 +16156,7 @@
                 <w:rFonts w:asciiTheme="minorEastAsia" w:hAnsiTheme="minorEastAsia"/>
                 <w:sz w:val="18"/>
               </w:rPr>
-              <w:t>Paper-SA-RL5</w:t>
+              <w:t xml:space="preserve">GILS-DQN</w:t>
             </w:r>
           </w:p>
         </w:tc>
@@ -16240,7 +16178,7 @@
                 <w:rFonts w:asciiTheme="minorEastAsia" w:hAnsiTheme="minorEastAsia"/>
                 <w:sz w:val="18"/>
               </w:rPr>
-              <w:t>2976.4 ± 864.4</w:t>
+              <w:t xml:space="preserve">9024.3 ± 2209.0</w:t>
             </w:r>
           </w:p>
         </w:tc>
@@ -16262,7 +16200,7 @@
                 <w:rFonts w:asciiTheme="minorEastAsia" w:hAnsiTheme="minorEastAsia"/>
                 <w:sz w:val="18"/>
               </w:rPr>
-              <w:t>1.86</w:t>
+              <w:t xml:space="preserve">0.24</w:t>
             </w:r>
           </w:p>
         </w:tc>
@@ -16284,7 +16222,7 @@
                 <w:rFonts w:asciiTheme="minorEastAsia" w:hAnsiTheme="minorEastAsia"/>
                 <w:sz w:val="18"/>
               </w:rPr>
-              <w:t>+0.99</w:t>
+              <w:t xml:space="preserve">+0.43</w:t>
             </w:r>
           </w:p>
         </w:tc>
@@ -16306,7 +16244,7 @@
                 <w:rFonts w:asciiTheme="minorEastAsia" w:hAnsiTheme="minorEastAsia"/>
                 <w:sz w:val="18"/>
               </w:rPr>
-              <w:t>0.55</w:t>
+              <w:t xml:space="preserve">0.24</w:t>
             </w:r>
           </w:p>
         </w:tc>
@@ -16324,6 +16262,13 @@
                 <w:rFonts w:asciiTheme="minorEastAsia" w:hAnsiTheme="minorEastAsia"/>
               </w:rPr>
             </w:pPr>
+            <w:r>
+              <w:rPr>
+                <w:rFonts w:asciiTheme="minorEastAsia" w:hAnsiTheme="minorEastAsia"/>
+                <w:sz w:val="18"/>
+              </w:rPr>
+              <w:t xml:space="preserve">M-none</w:t>
+            </w:r>
           </w:p>
         </w:tc>
         <w:tc>
@@ -16343,7 +16288,7 @@
                 <w:rFonts w:asciiTheme="minorEastAsia" w:hAnsiTheme="minorEastAsia"/>
                 <w:sz w:val="18"/>
               </w:rPr>
-              <w:t>GILS-uniform</w:t>
+              <w:t xml:space="preserve">VAA</w:t>
             </w:r>
           </w:p>
         </w:tc>
@@ -16365,7 +16310,7 @@
                 <w:rFonts w:asciiTheme="minorEastAsia" w:hAnsiTheme="minorEastAsia"/>
                 <w:sz w:val="18"/>
               </w:rPr>
-              <w:t>2928.9 ± 842.6</w:t>
+              <w:t xml:space="preserve">3030.9 ± 903.6</w:t>
             </w:r>
           </w:p>
         </w:tc>
@@ -16387,7 +16332,7 @@
                 <w:rFonts w:asciiTheme="minorEastAsia" w:hAnsiTheme="minorEastAsia"/>
                 <w:sz w:val="18"/>
               </w:rPr>
-              <w:t>0.29</w:t>
+              <w:t xml:space="preserve">3.73</w:t>
             </w:r>
           </w:p>
         </w:tc>
@@ -16409,7 +16354,7 @@
                 <w:rFonts w:asciiTheme="minorEastAsia" w:hAnsiTheme="minorEastAsia"/>
                 <w:sz w:val="18"/>
               </w:rPr>
-              <w:t>+0.13</w:t>
+              <w:t xml:space="preserve">+4.80</w:t>
             </w:r>
           </w:p>
         </w:tc>
@@ -16431,7 +16376,7 @@
                 <w:rFonts w:asciiTheme="minorEastAsia" w:hAnsiTheme="minorEastAsia"/>
                 <w:sz w:val="18"/>
               </w:rPr>
-              <w:t>0.43</w:t>
+              <w:t xml:space="preserve">0.00</w:t>
             </w:r>
           </w:p>
         </w:tc>
@@ -16468,7 +16413,7 @@
                 <w:rFonts w:asciiTheme="minorEastAsia" w:hAnsiTheme="minorEastAsia"/>
                 <w:sz w:val="18"/>
               </w:rPr>
-              <w:t>GILS-tabular</w:t>
+              <w:t xml:space="preserve">Paper-SA-RL5</w:t>
             </w:r>
           </w:p>
         </w:tc>
@@ -16490,7 +16435,7 @@
                 <w:rFonts w:asciiTheme="minorEastAsia" w:hAnsiTheme="minorEastAsia"/>
                 <w:sz w:val="18"/>
               </w:rPr>
-              <w:t>2932.1 ± 846.3</w:t>
+              <w:t xml:space="preserve">2976.4 ± 864.4</w:t>
             </w:r>
           </w:p>
         </w:tc>
@@ -16512,7 +16457,7 @@
                 <w:rFonts w:asciiTheme="minorEastAsia" w:hAnsiTheme="minorEastAsia"/>
                 <w:sz w:val="18"/>
               </w:rPr>
-              <w:t>0.37</w:t>
+              <w:t xml:space="preserve">1.86</w:t>
             </w:r>
           </w:p>
         </w:tc>
@@ -16534,7 +16479,7 @@
                 <w:rFonts w:asciiTheme="minorEastAsia" w:hAnsiTheme="minorEastAsia"/>
                 <w:sz w:val="18"/>
               </w:rPr>
-              <w:t>+0.11</w:t>
+              <w:t xml:space="preserve">+0.99</w:t>
             </w:r>
           </w:p>
         </w:tc>
@@ -16556,7 +16501,7 @@
                 <w:rFonts w:asciiTheme="minorEastAsia" w:hAnsiTheme="minorEastAsia"/>
                 <w:sz w:val="18"/>
               </w:rPr>
-              <w:t>0.52</w:t>
+              <w:t xml:space="preserve">0.55</w:t>
             </w:r>
           </w:p>
         </w:tc>
@@ -16593,7 +16538,7 @@
                 <w:rFonts w:asciiTheme="minorEastAsia" w:hAnsiTheme="minorEastAsia"/>
                 <w:sz w:val="18"/>
               </w:rPr>
-              <w:t>GILS-DQN</w:t>
+              <w:t xml:space="preserve">GILS-uniform</w:t>
             </w:r>
           </w:p>
         </w:tc>
@@ -16615,7 +16560,7 @@
                 <w:rFonts w:asciiTheme="minorEastAsia" w:hAnsiTheme="minorEastAsia"/>
                 <w:sz w:val="18"/>
               </w:rPr>
-              <w:t>2932.5 ± 845.5</w:t>
+              <w:t xml:space="preserve">2928.8 ± 844.0</w:t>
             </w:r>
           </w:p>
         </w:tc>
@@ -16637,7 +16582,7 @@
                 <w:rFonts w:asciiTheme="minorEastAsia" w:hAnsiTheme="minorEastAsia"/>
                 <w:sz w:val="18"/>
               </w:rPr>
-              <w:t>0.40</w:t>
+              <w:t xml:space="preserve">0.27</w:t>
             </w:r>
           </w:p>
         </w:tc>
@@ -16659,7 +16604,7 @@
                 <w:rFonts w:asciiTheme="minorEastAsia" w:hAnsiTheme="minorEastAsia"/>
                 <w:sz w:val="18"/>
               </w:rPr>
-              <w:t>+0.19</w:t>
+              <w:t xml:space="preserve">+0.06</w:t>
             </w:r>
           </w:p>
         </w:tc>
@@ -16681,7 +16626,7 @@
                 <w:rFonts w:asciiTheme="minorEastAsia" w:hAnsiTheme="minorEastAsia"/>
                 <w:sz w:val="18"/>
               </w:rPr>
-              <w:t>0.73</w:t>
+              <w:t xml:space="preserve">0.48</w:t>
             </w:r>
           </w:p>
         </w:tc>
@@ -16699,13 +16644,6 @@
                 <w:rFonts w:asciiTheme="minorEastAsia" w:hAnsiTheme="minorEastAsia"/>
               </w:rPr>
             </w:pPr>
-            <w:r>
-              <w:rPr>
-                <w:rFonts w:asciiTheme="minorEastAsia" w:hAnsiTheme="minorEastAsia"/>
-                <w:sz w:val="18"/>
-              </w:rPr>
-              <w:t>M-medium</w:t>
-            </w:r>
           </w:p>
         </w:tc>
         <w:tc>
@@ -16725,7 +16663,7 @@
                 <w:rFonts w:asciiTheme="minorEastAsia" w:hAnsiTheme="minorEastAsia"/>
                 <w:sz w:val="18"/>
               </w:rPr>
-              <w:t>VAA</w:t>
+              <w:t xml:space="preserve">GILS-tabular</w:t>
             </w:r>
           </w:p>
         </w:tc>
@@ -16747,7 +16685,7 @@
                 <w:rFonts w:asciiTheme="minorEastAsia" w:hAnsiTheme="minorEastAsia"/>
                 <w:sz w:val="18"/>
               </w:rPr>
-              <w:t>23025.5 ± 4075.4</w:t>
+              <w:t xml:space="preserve">2929.8 ± 844.4</w:t>
             </w:r>
           </w:p>
         </w:tc>
@@ -16769,7 +16707,7 @@
                 <w:rFonts w:asciiTheme="minorEastAsia" w:hAnsiTheme="minorEastAsia"/>
                 <w:sz w:val="18"/>
               </w:rPr>
-              <w:t>2.56</w:t>
+              <w:t xml:space="preserve">0.30</w:t>
             </w:r>
           </w:p>
         </w:tc>
@@ -16791,7 +16729,7 @@
                 <w:rFonts w:asciiTheme="minorEastAsia" w:hAnsiTheme="minorEastAsia"/>
                 <w:sz w:val="18"/>
               </w:rPr>
-              <w:t>—</w:t>
+              <w:t xml:space="preserve">+0.10</w:t>
             </w:r>
           </w:p>
         </w:tc>
@@ -16813,7 +16751,7 @@
                 <w:rFonts w:asciiTheme="minorEastAsia" w:hAnsiTheme="minorEastAsia"/>
                 <w:sz w:val="18"/>
               </w:rPr>
-              <w:t>0.00</w:t>
+              <w:t xml:space="preserve">0.58</w:t>
             </w:r>
           </w:p>
         </w:tc>
@@ -16850,7 +16788,7 @@
                 <w:rFonts w:asciiTheme="minorEastAsia" w:hAnsiTheme="minorEastAsia"/>
                 <w:sz w:val="18"/>
               </w:rPr>
-              <w:t>GILS-uniform</w:t>
+              <w:t xml:space="preserve">GILS-DQN</w:t>
             </w:r>
           </w:p>
         </w:tc>
@@ -16872,7 +16810,7 @@
                 <w:rFonts w:asciiTheme="minorEastAsia" w:hAnsiTheme="minorEastAsia"/>
                 <w:sz w:val="18"/>
               </w:rPr>
-              <w:t>22526.4 ± 3960.5</w:t>
+              <w:t xml:space="preserve">2930.2 ± 843.9</w:t>
             </w:r>
           </w:p>
         </w:tc>
@@ -16894,7 +16832,7 @@
                 <w:rFonts w:asciiTheme="minorEastAsia" w:hAnsiTheme="minorEastAsia"/>
                 <w:sz w:val="18"/>
               </w:rPr>
-              <w:t>0.29</w:t>
+              <w:t xml:space="preserve">0.32</w:t>
             </w:r>
           </w:p>
         </w:tc>
@@ -16916,7 +16854,7 @@
                 <w:rFonts w:asciiTheme="minorEastAsia" w:hAnsiTheme="minorEastAsia"/>
                 <w:sz w:val="18"/>
               </w:rPr>
-              <w:t>—</w:t>
+              <w:t xml:space="preserve">+0.14</w:t>
             </w:r>
           </w:p>
         </w:tc>
@@ -16938,7 +16876,7 @@
                 <w:rFonts w:asciiTheme="minorEastAsia" w:hAnsiTheme="minorEastAsia"/>
                 <w:sz w:val="18"/>
               </w:rPr>
-              <w:t>0.44</w:t>
+              <w:t xml:space="preserve">0.77</w:t>
             </w:r>
           </w:p>
         </w:tc>
@@ -16956,6 +16894,13 @@
                 <w:rFonts w:asciiTheme="minorEastAsia" w:hAnsiTheme="minorEastAsia"/>
               </w:rPr>
             </w:pPr>
+            <w:r>
+              <w:rPr>
+                <w:rFonts w:asciiTheme="minorEastAsia" w:hAnsiTheme="minorEastAsia"/>
+                <w:sz w:val="18"/>
+              </w:rPr>
+              <w:t xml:space="preserve">M-medium</w:t>
+            </w:r>
           </w:p>
         </w:tc>
         <w:tc>
@@ -16975,7 +16920,7 @@
                 <w:rFonts w:asciiTheme="minorEastAsia" w:hAnsiTheme="minorEastAsia"/>
                 <w:sz w:val="18"/>
               </w:rPr>
-              <w:t>GILS-tabular</w:t>
+              <w:t xml:space="preserve">VAA</w:t>
             </w:r>
           </w:p>
         </w:tc>
@@ -16997,7 +16942,7 @@
                 <w:rFonts w:asciiTheme="minorEastAsia" w:hAnsiTheme="minorEastAsia"/>
                 <w:sz w:val="18"/>
               </w:rPr>
-              <w:t>22515.5 ± 3964.0</w:t>
+              <w:t xml:space="preserve">23025.5 ± 4075.4</w:t>
             </w:r>
           </w:p>
         </w:tc>
@@ -17019,7 +16964,7 @@
                 <w:rFonts w:asciiTheme="minorEastAsia" w:hAnsiTheme="minorEastAsia"/>
                 <w:sz w:val="18"/>
               </w:rPr>
-              <w:t>0.24</w:t>
+              <w:t xml:space="preserve">2.57</w:t>
             </w:r>
           </w:p>
         </w:tc>
@@ -17041,7 +16986,7 @@
                 <w:rFonts w:asciiTheme="minorEastAsia" w:hAnsiTheme="minorEastAsia"/>
                 <w:sz w:val="18"/>
               </w:rPr>
-              <w:t>—</w:t>
+              <w:t xml:space="preserve">—</w:t>
             </w:r>
           </w:p>
         </w:tc>
@@ -17063,7 +17008,7 @@
                 <w:rFonts w:asciiTheme="minorEastAsia" w:hAnsiTheme="minorEastAsia"/>
                 <w:sz w:val="18"/>
               </w:rPr>
-              <w:t>0.55</w:t>
+              <w:t xml:space="preserve">0.00</w:t>
             </w:r>
           </w:p>
         </w:tc>
@@ -17100,7 +17045,7 @@
                 <w:rFonts w:asciiTheme="minorEastAsia" w:hAnsiTheme="minorEastAsia"/>
                 <w:sz w:val="18"/>
               </w:rPr>
-              <w:t>GILS-DQN</w:t>
+              <w:t xml:space="preserve">Extended-SA-RL5</w:t>
             </w:r>
           </w:p>
         </w:tc>
@@ -17122,7 +17067,7 @@
                 <w:rFonts w:asciiTheme="minorEastAsia" w:hAnsiTheme="minorEastAsia"/>
                 <w:sz w:val="18"/>
               </w:rPr>
-              <w:t>22540.3 ± 3956.4</w:t>
+              <w:t xml:space="preserve">22843.1 ± 4012.0</w:t>
             </w:r>
           </w:p>
         </w:tc>
@@ -17144,7 +17089,7 @@
                 <w:rFonts w:asciiTheme="minorEastAsia" w:hAnsiTheme="minorEastAsia"/>
                 <w:sz w:val="18"/>
               </w:rPr>
-              <w:t>0.36</w:t>
+              <w:t xml:space="preserve">1.72</w:t>
             </w:r>
           </w:p>
         </w:tc>
@@ -17166,7 +17111,7 @@
                 <w:rFonts w:asciiTheme="minorEastAsia" w:hAnsiTheme="minorEastAsia"/>
                 <w:sz w:val="18"/>
               </w:rPr>
-              <w:t>—</w:t>
+              <w:t xml:space="preserve">—</w:t>
             </w:r>
           </w:p>
         </w:tc>
@@ -17188,7 +17133,7 @@
                 <w:rFonts w:asciiTheme="minorEastAsia" w:hAnsiTheme="minorEastAsia"/>
                 <w:sz w:val="18"/>
               </w:rPr>
-              <w:t>0.75</w:t>
+              <w:t xml:space="preserve">0.57</w:t>
             </w:r>
           </w:p>
         </w:tc>
@@ -17206,13 +17151,6 @@
                 <w:rFonts w:asciiTheme="minorEastAsia" w:hAnsiTheme="minorEastAsia"/>
               </w:rPr>
             </w:pPr>
-            <w:r>
-              <w:rPr>
-                <w:rFonts w:asciiTheme="minorEastAsia" w:hAnsiTheme="minorEastAsia"/>
-                <w:sz w:val="18"/>
-              </w:rPr>
-              <w:t>M-tight</w:t>
-            </w:r>
           </w:p>
         </w:tc>
         <w:tc>
@@ -17232,7 +17170,7 @@
                 <w:rFonts w:asciiTheme="minorEastAsia" w:hAnsiTheme="minorEastAsia"/>
                 <w:sz w:val="18"/>
               </w:rPr>
-              <w:t>VAA</w:t>
+              <w:t xml:space="preserve">GILS-uniform</w:t>
             </w:r>
           </w:p>
         </w:tc>
@@ -17254,7 +17192,7 @@
                 <w:rFonts w:asciiTheme="minorEastAsia" w:hAnsiTheme="minorEastAsia"/>
                 <w:sz w:val="18"/>
               </w:rPr>
-              <w:t>38903.7 ± 11283.5</w:t>
+              <w:t xml:space="preserve">22514.6 ± 3960.1</w:t>
             </w:r>
           </w:p>
         </w:tc>
@@ -17276,7 +17214,7 @@
                 <w:rFonts w:asciiTheme="minorEastAsia" w:hAnsiTheme="minorEastAsia"/>
                 <w:sz w:val="18"/>
               </w:rPr>
-              <w:t>1.25</w:t>
+              <w:t xml:space="preserve">0.25</w:t>
             </w:r>
           </w:p>
         </w:tc>
@@ -17298,7 +17236,7 @@
                 <w:rFonts w:asciiTheme="minorEastAsia" w:hAnsiTheme="minorEastAsia"/>
                 <w:sz w:val="18"/>
               </w:rPr>
-              <w:t>—</w:t>
+              <w:t xml:space="preserve">—</w:t>
             </w:r>
           </w:p>
         </w:tc>
@@ -17320,7 +17258,7 @@
                 <w:rFonts w:asciiTheme="minorEastAsia" w:hAnsiTheme="minorEastAsia"/>
                 <w:sz w:val="18"/>
               </w:rPr>
-              <w:t>0.01</w:t>
+              <w:t xml:space="preserve">0.52</w:t>
             </w:r>
           </w:p>
         </w:tc>
@@ -17357,7 +17295,7 @@
                 <w:rFonts w:asciiTheme="minorEastAsia" w:hAnsiTheme="minorEastAsia"/>
                 <w:sz w:val="18"/>
               </w:rPr>
-              <w:t>GILS-uniform</w:t>
+              <w:t xml:space="preserve">GILS-tabular</w:t>
             </w:r>
           </w:p>
         </w:tc>
@@ -17379,7 +17317,7 @@
                 <w:rFonts w:asciiTheme="minorEastAsia" w:hAnsiTheme="minorEastAsia"/>
                 <w:sz w:val="18"/>
               </w:rPr>
-              <w:t>38528.0 ± 11078.0</w:t>
+              <w:t xml:space="preserve">22517.8 ± 3967.4</w:t>
             </w:r>
           </w:p>
         </w:tc>
@@ -17401,7 +17339,7 @@
                 <w:rFonts w:asciiTheme="minorEastAsia" w:hAnsiTheme="minorEastAsia"/>
                 <w:sz w:val="18"/>
               </w:rPr>
-              <w:t>0.19</w:t>
+              <w:t xml:space="preserve">0.26</w:t>
             </w:r>
           </w:p>
         </w:tc>
@@ -17423,7 +17361,7 @@
                 <w:rFonts w:asciiTheme="minorEastAsia" w:hAnsiTheme="minorEastAsia"/>
                 <w:sz w:val="18"/>
               </w:rPr>
-              <w:t>—</w:t>
+              <w:t xml:space="preserve">—</w:t>
             </w:r>
           </w:p>
         </w:tc>
@@ -17445,7 +17383,7 @@
                 <w:rFonts w:asciiTheme="minorEastAsia" w:hAnsiTheme="minorEastAsia"/>
                 <w:sz w:val="18"/>
               </w:rPr>
-              <w:t>0.48</w:t>
+              <w:t xml:space="preserve">0.65</w:t>
             </w:r>
           </w:p>
         </w:tc>
@@ -17482,7 +17420,7 @@
                 <w:rFonts w:asciiTheme="minorEastAsia" w:hAnsiTheme="minorEastAsia"/>
                 <w:sz w:val="18"/>
               </w:rPr>
-              <w:t>GILS-tabular</w:t>
+              <w:t xml:space="preserve">GILS-DQN</w:t>
             </w:r>
           </w:p>
         </w:tc>
@@ -17504,7 +17442,7 @@
                 <w:rFonts w:asciiTheme="minorEastAsia" w:hAnsiTheme="minorEastAsia"/>
                 <w:sz w:val="18"/>
               </w:rPr>
-              <w:t>38512.1 ± 11059.5</w:t>
+              <w:t xml:space="preserve">22542.4 ± 3958.6</w:t>
             </w:r>
           </w:p>
         </w:tc>
@@ -17526,7 +17464,7 @@
                 <w:rFonts w:asciiTheme="minorEastAsia" w:hAnsiTheme="minorEastAsia"/>
                 <w:sz w:val="18"/>
               </w:rPr>
-              <w:t>0.16</w:t>
+              <w:t xml:space="preserve">0.38</w:t>
             </w:r>
           </w:p>
         </w:tc>
@@ -17548,7 +17486,7 @@
                 <w:rFonts w:asciiTheme="minorEastAsia" w:hAnsiTheme="minorEastAsia"/>
                 <w:sz w:val="18"/>
               </w:rPr>
-              <w:t>—</w:t>
+              <w:t xml:space="preserve">—</w:t>
             </w:r>
           </w:p>
         </w:tc>
@@ -17570,7 +17508,7 @@
                 <w:rFonts w:asciiTheme="minorEastAsia" w:hAnsiTheme="minorEastAsia"/>
                 <w:sz w:val="18"/>
               </w:rPr>
-              <w:t>0.60</w:t>
+              <w:t xml:space="preserve">0.75</w:t>
             </w:r>
           </w:p>
         </w:tc>
@@ -17588,6 +17526,13 @@
                 <w:rFonts w:asciiTheme="minorEastAsia" w:hAnsiTheme="minorEastAsia"/>
               </w:rPr>
             </w:pPr>
+            <w:r>
+              <w:rPr>
+                <w:rFonts w:asciiTheme="minorEastAsia" w:hAnsiTheme="minorEastAsia"/>
+                <w:sz w:val="18"/>
+              </w:rPr>
+              <w:t xml:space="preserve">M-tight</w:t>
+            </w:r>
           </w:p>
         </w:tc>
         <w:tc>
@@ -17607,7 +17552,7 @@
                 <w:rFonts w:asciiTheme="minorEastAsia" w:hAnsiTheme="minorEastAsia"/>
                 <w:sz w:val="18"/>
               </w:rPr>
-              <w:t>GILS-DQN</w:t>
+              <w:t xml:space="preserve">VAA</w:t>
             </w:r>
           </w:p>
         </w:tc>
@@ -17629,7 +17574,7 @@
                 <w:rFonts w:asciiTheme="minorEastAsia" w:hAnsiTheme="minorEastAsia"/>
                 <w:sz w:val="18"/>
               </w:rPr>
-              <w:t>38543.6 ± 11077.6</w:t>
+              <w:t xml:space="preserve">38903.7 ± 11283.5</w:t>
             </w:r>
           </w:p>
         </w:tc>
@@ -17651,7 +17596,7 @@
                 <w:rFonts w:asciiTheme="minorEastAsia" w:hAnsiTheme="minorEastAsia"/>
                 <w:sz w:val="18"/>
               </w:rPr>
-              <w:t>0.24</w:t>
+              <w:t xml:space="preserve">1.24</w:t>
             </w:r>
           </w:p>
         </w:tc>
@@ -17673,7 +17618,7 @@
                 <w:rFonts w:asciiTheme="minorEastAsia" w:hAnsiTheme="minorEastAsia"/>
                 <w:sz w:val="18"/>
               </w:rPr>
-              <w:t>—</w:t>
+              <w:t xml:space="preserve">—</w:t>
             </w:r>
           </w:p>
         </w:tc>
@@ -17695,7 +17640,7 @@
                 <w:rFonts w:asciiTheme="minorEastAsia" w:hAnsiTheme="minorEastAsia"/>
                 <w:sz w:val="18"/>
               </w:rPr>
-              <w:t>0.81</w:t>
+              <w:t xml:space="preserve">0.01</w:t>
             </w:r>
           </w:p>
         </w:tc>
@@ -17713,13 +17658,6 @@
                 <w:rFonts w:asciiTheme="minorEastAsia" w:hAnsiTheme="minorEastAsia"/>
               </w:rPr>
             </w:pPr>
-            <w:r>
-              <w:rPr>
-                <w:rFonts w:asciiTheme="minorEastAsia" w:hAnsiTheme="minorEastAsia"/>
-                <w:sz w:val="18"/>
-              </w:rPr>
-              <w:t>L-none</w:t>
-            </w:r>
           </w:p>
         </w:tc>
         <w:tc>
@@ -17739,7 +17677,7 @@
                 <w:rFonts w:asciiTheme="minorEastAsia" w:hAnsiTheme="minorEastAsia"/>
                 <w:sz w:val="18"/>
               </w:rPr>
-              <w:t>VAA</w:t>
+              <w:t xml:space="preserve">Extended-SA-RL5</w:t>
             </w:r>
           </w:p>
         </w:tc>
@@ -17761,7 +17699,7 @@
                 <w:rFonts w:asciiTheme="minorEastAsia" w:hAnsiTheme="minorEastAsia"/>
                 <w:sz w:val="18"/>
               </w:rPr>
-              <w:t>5492.3 ± 1482.2</w:t>
+              <w:t xml:space="preserve">38786.7 ± 11087.7</w:t>
             </w:r>
           </w:p>
         </w:tc>
@@ -17783,7 +17721,7 @@
                 <w:rFonts w:asciiTheme="minorEastAsia" w:hAnsiTheme="minorEastAsia"/>
                 <w:sz w:val="18"/>
               </w:rPr>
-              <w:t>2.21</w:t>
+              <w:t xml:space="preserve">0.90</w:t>
             </w:r>
           </w:p>
         </w:tc>
@@ -17805,7 +17743,7 @@
                 <w:rFonts w:asciiTheme="minorEastAsia" w:hAnsiTheme="minorEastAsia"/>
                 <w:sz w:val="18"/>
               </w:rPr>
-              <w:t>—</w:t>
+              <w:t xml:space="preserve">—</w:t>
             </w:r>
           </w:p>
         </w:tc>
@@ -17827,7 +17765,7 @@
                 <w:rFonts w:asciiTheme="minorEastAsia" w:hAnsiTheme="minorEastAsia"/>
                 <w:sz w:val="18"/>
               </w:rPr>
-              <w:t>0.02</w:t>
+              <w:t xml:space="preserve">0.66</w:t>
             </w:r>
           </w:p>
         </w:tc>
@@ -17864,7 +17802,7 @@
                 <w:rFonts w:asciiTheme="minorEastAsia" w:hAnsiTheme="minorEastAsia"/>
                 <w:sz w:val="18"/>
               </w:rPr>
-              <w:t>Paper-SA-RL5</w:t>
+              <w:t xml:space="preserve">GILS-uniform</w:t>
             </w:r>
           </w:p>
         </w:tc>
@@ -17886,7 +17824,7 @@
                 <w:rFonts w:asciiTheme="minorEastAsia" w:hAnsiTheme="minorEastAsia"/>
                 <w:sz w:val="18"/>
               </w:rPr>
-              <w:t>5479.7 ± 1449.5</w:t>
+              <w:t xml:space="preserve">38496.5 ± 11061.4</w:t>
             </w:r>
           </w:p>
         </w:tc>
@@ -17908,7 +17846,7 @@
                 <w:rFonts w:asciiTheme="minorEastAsia" w:hAnsiTheme="minorEastAsia"/>
                 <w:sz w:val="18"/>
               </w:rPr>
-              <w:t>1.97</w:t>
+              <w:t xml:space="preserve">0.11</w:t>
             </w:r>
           </w:p>
         </w:tc>
@@ -17930,7 +17868,7 @@
                 <w:rFonts w:asciiTheme="minorEastAsia" w:hAnsiTheme="minorEastAsia"/>
                 <w:sz w:val="18"/>
               </w:rPr>
-              <w:t>—</w:t>
+              <w:t xml:space="preserve">—</w:t>
             </w:r>
           </w:p>
         </w:tc>
@@ -17952,7 +17890,7 @@
                 <w:rFonts w:asciiTheme="minorEastAsia" w:hAnsiTheme="minorEastAsia"/>
                 <w:sz w:val="18"/>
               </w:rPr>
-              <w:t>1.92</w:t>
+              <w:t xml:space="preserve">0.65</w:t>
             </w:r>
           </w:p>
         </w:tc>
@@ -17989,7 +17927,7 @@
                 <w:rFonts w:asciiTheme="minorEastAsia" w:hAnsiTheme="minorEastAsia"/>
                 <w:sz w:val="18"/>
               </w:rPr>
-              <w:t>GILS-uniform</w:t>
+              <w:t xml:space="preserve">GILS-tabular</w:t>
             </w:r>
           </w:p>
         </w:tc>
@@ -18011,7 +17949,7 @@
                 <w:rFonts w:asciiTheme="minorEastAsia" w:hAnsiTheme="minorEastAsia"/>
                 <w:sz w:val="18"/>
               </w:rPr>
-              <w:t>5388.4 ± 1427.3</w:t>
+              <w:t xml:space="preserve">38512.9 ± 11062.6</w:t>
             </w:r>
           </w:p>
         </w:tc>
@@ -18033,7 +17971,7 @@
                 <w:rFonts w:asciiTheme="minorEastAsia" w:hAnsiTheme="minorEastAsia"/>
                 <w:sz w:val="18"/>
               </w:rPr>
-              <w:t>0.27</w:t>
+              <w:t xml:space="preserve">0.15</w:t>
             </w:r>
           </w:p>
         </w:tc>
@@ -18055,7 +17993,7 @@
                 <w:rFonts w:asciiTheme="minorEastAsia" w:hAnsiTheme="minorEastAsia"/>
                 <w:sz w:val="18"/>
               </w:rPr>
-              <w:t>—</w:t>
+              <w:t xml:space="preserve">—</w:t>
             </w:r>
           </w:p>
         </w:tc>
@@ -18077,7 +18015,7 @@
                 <w:rFonts w:asciiTheme="minorEastAsia" w:hAnsiTheme="minorEastAsia"/>
                 <w:sz w:val="18"/>
               </w:rPr>
-              <w:t>2.16</w:t>
+              <w:t xml:space="preserve">0.77</w:t>
             </w:r>
           </w:p>
         </w:tc>
@@ -18114,7 +18052,7 @@
                 <w:rFonts w:asciiTheme="minorEastAsia" w:hAnsiTheme="minorEastAsia"/>
                 <w:sz w:val="18"/>
               </w:rPr>
-              <w:t>GILS-tabular</w:t>
+              <w:t xml:space="preserve">GILS-DQN</w:t>
             </w:r>
           </w:p>
         </w:tc>
@@ -18136,7 +18074,7 @@
                 <w:rFonts w:asciiTheme="minorEastAsia" w:hAnsiTheme="minorEastAsia"/>
                 <w:sz w:val="18"/>
               </w:rPr>
-              <w:t>5385.5 ± 1424.6</w:t>
+              <w:t xml:space="preserve">38542.6 ± 11072.4</w:t>
             </w:r>
           </w:p>
         </w:tc>
@@ -18158,7 +18096,7 @@
                 <w:rFonts w:asciiTheme="minorEastAsia" w:hAnsiTheme="minorEastAsia"/>
                 <w:sz w:val="18"/>
               </w:rPr>
-              <w:t>0.22</w:t>
+              <w:t xml:space="preserve">0.23</w:t>
             </w:r>
           </w:p>
         </w:tc>
@@ -18180,7 +18118,7 @@
                 <w:rFonts w:asciiTheme="minorEastAsia" w:hAnsiTheme="minorEastAsia"/>
                 <w:sz w:val="18"/>
               </w:rPr>
-              <w:t>—</w:t>
+              <w:t xml:space="preserve">—</w:t>
             </w:r>
           </w:p>
         </w:tc>
@@ -18202,7 +18140,7 @@
                 <w:rFonts w:asciiTheme="minorEastAsia" w:hAnsiTheme="minorEastAsia"/>
                 <w:sz w:val="18"/>
               </w:rPr>
-              <w:t>2.54</w:t>
+              <w:t xml:space="preserve">0.78</w:t>
             </w:r>
           </w:p>
         </w:tc>
@@ -18220,6 +18158,13 @@
                 <w:rFonts w:asciiTheme="minorEastAsia" w:hAnsiTheme="minorEastAsia"/>
               </w:rPr>
             </w:pPr>
+            <w:r>
+              <w:rPr>
+                <w:rFonts w:asciiTheme="minorEastAsia" w:hAnsiTheme="minorEastAsia"/>
+                <w:sz w:val="18"/>
+              </w:rPr>
+              <w:t xml:space="preserve">L-none</w:t>
+            </w:r>
           </w:p>
         </w:tc>
         <w:tc>
@@ -18239,7 +18184,7 @@
                 <w:rFonts w:asciiTheme="minorEastAsia" w:hAnsiTheme="minorEastAsia"/>
                 <w:sz w:val="18"/>
               </w:rPr>
-              <w:t>GILS-DQN</w:t>
+              <w:t xml:space="preserve">VAA</w:t>
             </w:r>
           </w:p>
         </w:tc>
@@ -18261,7 +18206,7 @@
                 <w:rFonts w:asciiTheme="minorEastAsia" w:hAnsiTheme="minorEastAsia"/>
                 <w:sz w:val="18"/>
               </w:rPr>
-              <w:t>5386.1 ± 1425.2</w:t>
+              <w:t xml:space="preserve">5492.3 ± 1482.2</w:t>
             </w:r>
           </w:p>
         </w:tc>
@@ -18283,7 +18228,7 @@
                 <w:rFonts w:asciiTheme="minorEastAsia" w:hAnsiTheme="minorEastAsia"/>
                 <w:sz w:val="18"/>
               </w:rPr>
-              <w:t>0.23</w:t>
+              <w:t xml:space="preserve">2.18</w:t>
             </w:r>
           </w:p>
         </w:tc>
@@ -18305,7 +18250,7 @@
                 <w:rFonts w:asciiTheme="minorEastAsia" w:hAnsiTheme="minorEastAsia"/>
                 <w:sz w:val="18"/>
               </w:rPr>
-              <w:t>—</w:t>
+              <w:t xml:space="preserve">—</w:t>
             </w:r>
           </w:p>
         </w:tc>
@@ -18327,7 +18272,7 @@
                 <w:rFonts w:asciiTheme="minorEastAsia" w:hAnsiTheme="minorEastAsia"/>
                 <w:sz w:val="18"/>
               </w:rPr>
-              <w:t>2.99</w:t>
+              <w:t xml:space="preserve">0.02</w:t>
             </w:r>
           </w:p>
         </w:tc>
@@ -18345,13 +18290,6 @@
                 <w:rFonts w:asciiTheme="minorEastAsia" w:hAnsiTheme="minorEastAsia"/>
               </w:rPr>
             </w:pPr>
-            <w:r>
-              <w:rPr>
-                <w:rFonts w:asciiTheme="minorEastAsia" w:hAnsiTheme="minorEastAsia"/>
-                <w:sz w:val="18"/>
-              </w:rPr>
-              <w:t>L-medium</w:t>
-            </w:r>
           </w:p>
         </w:tc>
         <w:tc>
@@ -18371,7 +18309,7 @@
                 <w:rFonts w:asciiTheme="minorEastAsia" w:hAnsiTheme="minorEastAsia"/>
                 <w:sz w:val="18"/>
               </w:rPr>
-              <w:t>VAA</w:t>
+              <w:t xml:space="preserve">Paper-SA-RL5</w:t>
             </w:r>
           </w:p>
         </w:tc>
@@ -18393,7 +18331,7 @@
                 <w:rFonts w:asciiTheme="minorEastAsia" w:hAnsiTheme="minorEastAsia"/>
                 <w:sz w:val="18"/>
               </w:rPr>
-              <w:t>55611.1 ± 18087.3</w:t>
+              <w:t xml:space="preserve">5479.7 ± 1449.5</w:t>
             </w:r>
           </w:p>
         </w:tc>
@@ -18415,7 +18353,7 @@
                 <w:rFonts w:asciiTheme="minorEastAsia" w:hAnsiTheme="minorEastAsia"/>
                 <w:sz w:val="18"/>
               </w:rPr>
-              <w:t>1.52</w:t>
+              <w:t xml:space="preserve">1.95</w:t>
             </w:r>
           </w:p>
         </w:tc>
@@ -18437,7 +18375,7 @@
                 <w:rFonts w:asciiTheme="minorEastAsia" w:hAnsiTheme="minorEastAsia"/>
                 <w:sz w:val="18"/>
               </w:rPr>
-              <w:t>—</w:t>
+              <w:t xml:space="preserve">—</w:t>
             </w:r>
           </w:p>
         </w:tc>
@@ -18459,7 +18397,7 @@
                 <w:rFonts w:asciiTheme="minorEastAsia" w:hAnsiTheme="minorEastAsia"/>
                 <w:sz w:val="18"/>
               </w:rPr>
-              <w:t>0.02</w:t>
+              <w:t xml:space="preserve">1.92</w:t>
             </w:r>
           </w:p>
         </w:tc>
@@ -18496,7 +18434,7 @@
                 <w:rFonts w:asciiTheme="minorEastAsia" w:hAnsiTheme="minorEastAsia"/>
                 <w:sz w:val="18"/>
               </w:rPr>
-              <w:t>GILS-uniform</w:t>
+              <w:t xml:space="preserve">GILS-uniform</w:t>
             </w:r>
           </w:p>
         </w:tc>
@@ -18518,7 +18456,7 @@
                 <w:rFonts w:asciiTheme="minorEastAsia" w:hAnsiTheme="minorEastAsia"/>
                 <w:sz w:val="18"/>
               </w:rPr>
-              <w:t>54846.4 ± 17523.5</w:t>
+              <w:t xml:space="preserve">5384.0 ± 1423.9</w:t>
             </w:r>
           </w:p>
         </w:tc>
@@ -18540,7 +18478,7 @@
                 <w:rFonts w:asciiTheme="minorEastAsia" w:hAnsiTheme="minorEastAsia"/>
                 <w:sz w:val="18"/>
               </w:rPr>
-              <w:t>0.10</w:t>
+              <w:t xml:space="preserve">0.17</w:t>
             </w:r>
           </w:p>
         </w:tc>
@@ -18562,7 +18500,7 @@
                 <w:rFonts w:asciiTheme="minorEastAsia" w:hAnsiTheme="minorEastAsia"/>
                 <w:sz w:val="18"/>
               </w:rPr>
-              <w:t>—</w:t>
+              <w:t xml:space="preserve">—</w:t>
             </w:r>
           </w:p>
         </w:tc>
@@ -18584,7 +18522,7 @@
                 <w:rFonts w:asciiTheme="minorEastAsia" w:hAnsiTheme="minorEastAsia"/>
                 <w:sz w:val="18"/>
               </w:rPr>
-              <w:t>2.10</w:t>
+              <w:t xml:space="preserve">3.38</w:t>
             </w:r>
           </w:p>
         </w:tc>
@@ -18621,7 +18559,7 @@
                 <w:rFonts w:asciiTheme="minorEastAsia" w:hAnsiTheme="minorEastAsia"/>
                 <w:sz w:val="18"/>
               </w:rPr>
-              <w:t>GILS-tabular</w:t>
+              <w:t xml:space="preserve">GILS-tabular</w:t>
             </w:r>
           </w:p>
         </w:tc>
@@ -18643,7 +18581,7 @@
                 <w:rFonts w:asciiTheme="minorEastAsia" w:hAnsiTheme="minorEastAsia"/>
                 <w:sz w:val="18"/>
               </w:rPr>
-              <w:t>54833.4 ± 17526.8</w:t>
+              <w:t xml:space="preserve">5386.4 ± 1424.2</w:t>
             </w:r>
           </w:p>
         </w:tc>
@@ -18665,7 +18603,7 @@
                 <w:rFonts w:asciiTheme="minorEastAsia" w:hAnsiTheme="minorEastAsia"/>
                 <w:sz w:val="18"/>
               </w:rPr>
-              <w:t>0.07</w:t>
+              <w:t xml:space="preserve">0.21</w:t>
             </w:r>
           </w:p>
         </w:tc>
@@ -18687,7 +18625,7 @@
                 <w:rFonts w:asciiTheme="minorEastAsia" w:hAnsiTheme="minorEastAsia"/>
                 <w:sz w:val="18"/>
               </w:rPr>
-              <w:t>—</w:t>
+              <w:t xml:space="preserve">—</w:t>
             </w:r>
           </w:p>
         </w:tc>
@@ -18709,7 +18647,7 @@
                 <w:rFonts w:asciiTheme="minorEastAsia" w:hAnsiTheme="minorEastAsia"/>
                 <w:sz w:val="18"/>
               </w:rPr>
-              <w:t>2.52</w:t>
+              <w:t xml:space="preserve">3.74</w:t>
             </w:r>
           </w:p>
         </w:tc>
@@ -18746,7 +18684,7 @@
                 <w:rFonts w:asciiTheme="minorEastAsia" w:hAnsiTheme="minorEastAsia"/>
                 <w:sz w:val="18"/>
               </w:rPr>
-              <w:t>GILS-DQN</w:t>
+              <w:t xml:space="preserve">GILS-DQN</w:t>
             </w:r>
           </w:p>
         </w:tc>
@@ -18768,7 +18706,7 @@
                 <w:rFonts w:asciiTheme="minorEastAsia" w:hAnsiTheme="minorEastAsia"/>
                 <w:sz w:val="18"/>
               </w:rPr>
-              <w:t>54848.8 ± 17522.9</w:t>
+              <w:t xml:space="preserve">5384.9 ± 1424.5</w:t>
             </w:r>
           </w:p>
         </w:tc>
@@ -18790,7 +18728,7 @@
                 <w:rFonts w:asciiTheme="minorEastAsia" w:hAnsiTheme="minorEastAsia"/>
                 <w:sz w:val="18"/>
               </w:rPr>
-              <w:t>0.11</w:t>
+              <w:t xml:space="preserve">0.18</w:t>
             </w:r>
           </w:p>
         </w:tc>
@@ -18812,7 +18750,7 @@
                 <w:rFonts w:asciiTheme="minorEastAsia" w:hAnsiTheme="minorEastAsia"/>
                 <w:sz w:val="18"/>
               </w:rPr>
-              <w:t>—</w:t>
+              <w:t xml:space="preserve">—</w:t>
             </w:r>
           </w:p>
         </w:tc>
@@ -18834,7 +18772,7 @@
                 <w:rFonts w:asciiTheme="minorEastAsia" w:hAnsiTheme="minorEastAsia"/>
                 <w:sz w:val="18"/>
               </w:rPr>
-              <w:t>2.85</w:t>
+              <w:t xml:space="preserve">3.09</w:t>
             </w:r>
           </w:p>
         </w:tc>
@@ -18857,7 +18795,7 @@
                 <w:rFonts w:asciiTheme="minorEastAsia" w:hAnsiTheme="minorEastAsia"/>
                 <w:sz w:val="18"/>
               </w:rPr>
-              <w:t>L-tight</w:t>
+              <w:t xml:space="preserve">L-medium</w:t>
             </w:r>
           </w:p>
         </w:tc>
@@ -18878,7 +18816,7 @@
                 <w:rFonts w:asciiTheme="minorEastAsia" w:hAnsiTheme="minorEastAsia"/>
                 <w:sz w:val="18"/>
               </w:rPr>
-              <w:t>VAA</w:t>
+              <w:t xml:space="preserve">VAA</w:t>
             </w:r>
           </w:p>
         </w:tc>
@@ -18900,7 +18838,7 @@
                 <w:rFonts w:asciiTheme="minorEastAsia" w:hAnsiTheme="minorEastAsia"/>
                 <w:sz w:val="18"/>
               </w:rPr>
-              <w:t>119671.9 ± 32475.3</w:t>
+              <w:t xml:space="preserve">55611.1 ± 18087.3</w:t>
             </w:r>
           </w:p>
         </w:tc>
@@ -18922,7 +18860,7 @@
                 <w:rFonts w:asciiTheme="minorEastAsia" w:hAnsiTheme="minorEastAsia"/>
                 <w:sz w:val="18"/>
               </w:rPr>
-              <w:t>0.77</w:t>
+              <w:t xml:space="preserve">1.55</w:t>
             </w:r>
           </w:p>
         </w:tc>
@@ -18944,7 +18882,7 @@
                 <w:rFonts w:asciiTheme="minorEastAsia" w:hAnsiTheme="minorEastAsia"/>
                 <w:sz w:val="18"/>
               </w:rPr>
-              <w:t>—</w:t>
+              <w:t xml:space="preserve">—</w:t>
             </w:r>
           </w:p>
         </w:tc>
@@ -18966,7 +18904,7 @@
                 <w:rFonts w:asciiTheme="minorEastAsia" w:hAnsiTheme="minorEastAsia"/>
                 <w:sz w:val="18"/>
               </w:rPr>
-              <w:t>0.02</w:t>
+              <w:t xml:space="preserve">0.02</w:t>
             </w:r>
           </w:p>
         </w:tc>
@@ -19003,7 +18941,7 @@
                 <w:rFonts w:asciiTheme="minorEastAsia" w:hAnsiTheme="minorEastAsia"/>
                 <w:sz w:val="18"/>
               </w:rPr>
-              <w:t>GILS-uniform</w:t>
+              <w:t xml:space="preserve">Extended-SA-RL5</w:t>
             </w:r>
           </w:p>
         </w:tc>
@@ -19025,7 +18963,7 @@
                 <w:rFonts w:asciiTheme="minorEastAsia" w:hAnsiTheme="minorEastAsia"/>
                 <w:sz w:val="18"/>
               </w:rPr>
-              <w:t>118901.4 ± 31781.1</w:t>
+              <w:t xml:space="preserve">55539.7 ± 17673.9</w:t>
             </w:r>
           </w:p>
         </w:tc>
@@ -19047,7 +18985,7 @@
                 <w:rFonts w:asciiTheme="minorEastAsia" w:hAnsiTheme="minorEastAsia"/>
                 <w:sz w:val="18"/>
               </w:rPr>
-              <w:t>0.08</w:t>
+              <w:t xml:space="preserve">1.44</w:t>
             </w:r>
           </w:p>
         </w:tc>
@@ -19069,7 +19007,7 @@
                 <w:rFonts w:asciiTheme="minorEastAsia" w:hAnsiTheme="minorEastAsia"/>
                 <w:sz w:val="18"/>
               </w:rPr>
-              <w:t>—</w:t>
+              <w:t xml:space="preserve">—</w:t>
             </w:r>
           </w:p>
         </w:tc>
@@ -19091,7 +19029,7 @@
                 <w:rFonts w:asciiTheme="minorEastAsia" w:hAnsiTheme="minorEastAsia"/>
                 <w:sz w:val="18"/>
               </w:rPr>
-              <w:t>2.01</w:t>
+              <w:t xml:space="preserve">1.95</w:t>
             </w:r>
           </w:p>
         </w:tc>
@@ -19128,7 +19066,7 @@
                 <w:rFonts w:asciiTheme="minorEastAsia" w:hAnsiTheme="minorEastAsia"/>
                 <w:sz w:val="18"/>
               </w:rPr>
-              <w:t>GILS-tabular</w:t>
+              <w:t xml:space="preserve">GILS-uniform</w:t>
             </w:r>
           </w:p>
         </w:tc>
@@ -19150,7 +19088,7 @@
                 <w:rFonts w:asciiTheme="minorEastAsia" w:hAnsiTheme="minorEastAsia"/>
                 <w:sz w:val="18"/>
               </w:rPr>
-              <w:t>118865.6 ± 31788.4</w:t>
+              <w:t xml:space="preserve">54826.5 ± 17528.3</w:t>
             </w:r>
           </w:p>
         </w:tc>
@@ -19172,7 +19110,7 @@
                 <w:rFonts w:asciiTheme="minorEastAsia" w:hAnsiTheme="minorEastAsia"/>
                 <w:sz w:val="18"/>
               </w:rPr>
-              <w:t>0.05</w:t>
+              <w:t xml:space="preserve">0.09</w:t>
             </w:r>
           </w:p>
         </w:tc>
@@ -19194,7 +19132,7 @@
                 <w:rFonts w:asciiTheme="minorEastAsia" w:hAnsiTheme="minorEastAsia"/>
                 <w:sz w:val="18"/>
               </w:rPr>
-              <w:t>—</w:t>
+              <w:t xml:space="preserve">—</w:t>
             </w:r>
           </w:p>
         </w:tc>
@@ -19216,7 +19154,7 @@
                 <w:rFonts w:asciiTheme="minorEastAsia" w:hAnsiTheme="minorEastAsia"/>
                 <w:sz w:val="18"/>
               </w:rPr>
-              <w:t>2.51</w:t>
+              <w:t xml:space="preserve">3.21</w:t>
             </w:r>
           </w:p>
         </w:tc>
@@ -19253,7 +19191,7 @@
                 <w:rFonts w:asciiTheme="minorEastAsia" w:hAnsiTheme="minorEastAsia"/>
                 <w:sz w:val="18"/>
               </w:rPr>
-              <w:t>GILS-DQN</w:t>
+              <w:t xml:space="preserve">GILS-tabular</w:t>
             </w:r>
           </w:p>
         </w:tc>
@@ -19275,7 +19213,7 @@
                 <w:rFonts w:asciiTheme="minorEastAsia" w:hAnsiTheme="minorEastAsia"/>
                 <w:sz w:val="18"/>
               </w:rPr>
-              <w:t>118888.8 ± 31789.1</w:t>
+              <w:t xml:space="preserve">54830.9 ± 17523.0</w:t>
             </w:r>
           </w:p>
         </w:tc>
@@ -19297,7 +19235,7 @@
                 <w:rFonts w:asciiTheme="minorEastAsia" w:hAnsiTheme="minorEastAsia"/>
                 <w:sz w:val="18"/>
               </w:rPr>
-              <w:t>0.07</w:t>
+              <w:t xml:space="preserve">0.11</w:t>
             </w:r>
           </w:p>
         </w:tc>
@@ -19319,7 +19257,7 @@
                 <w:rFonts w:asciiTheme="minorEastAsia" w:hAnsiTheme="minorEastAsia"/>
                 <w:sz w:val="18"/>
               </w:rPr>
-              <w:t>—</w:t>
+              <w:t xml:space="preserve">—</w:t>
             </w:r>
           </w:p>
         </w:tc>
@@ -19341,7 +19279,764 @@
                 <w:rFonts w:asciiTheme="minorEastAsia" w:hAnsiTheme="minorEastAsia"/>
                 <w:sz w:val="18"/>
               </w:rPr>
-              <w:t>2.76</w:t>
+              <w:t xml:space="preserve">3.60</w:t>
+            </w:r>
+          </w:p>
+        </w:tc>
+      </w:tr>
+      <w:tr>
+        <w:tc>
+          <w:tcPr>
+            <w:tcW w:w="1224" w:type="dxa"/>
+          </w:tcPr>
+          <w:p>
+            <w:pPr>
+              <w:pStyle w:val="Compact"/>
+              <w:spacing w:after="0"/>
+              <w:rPr>
+                <w:rFonts w:asciiTheme="minorEastAsia" w:hAnsiTheme="minorEastAsia"/>
+              </w:rPr>
+            </w:pPr>
+          </w:p>
+        </w:tc>
+        <w:tc>
+          <w:tcPr>
+            <w:tcW w:w="1872" w:type="dxa"/>
+          </w:tcPr>
+          <w:p>
+            <w:pPr>
+              <w:pStyle w:val="Compact"/>
+              <w:spacing w:after="0"/>
+              <w:rPr>
+                <w:rFonts w:asciiTheme="minorEastAsia" w:hAnsiTheme="minorEastAsia"/>
+              </w:rPr>
+            </w:pPr>
+            <w:r>
+              <w:rPr>
+                <w:rFonts w:asciiTheme="minorEastAsia" w:hAnsiTheme="minorEastAsia"/>
+                <w:sz w:val="18"/>
+              </w:rPr>
+              <w:t xml:space="preserve">GILS-DQN</w:t>
+            </w:r>
+          </w:p>
+        </w:tc>
+        <w:tc>
+          <w:tcPr>
+            <w:tcW w:w="2088" w:type="dxa"/>
+          </w:tcPr>
+          <w:p>
+            <w:pPr>
+              <w:pStyle w:val="Compact"/>
+              <w:spacing w:after="0"/>
+              <w:jc w:val="right"/>
+              <w:rPr>
+                <w:rFonts w:asciiTheme="minorEastAsia" w:hAnsiTheme="minorEastAsia"/>
+              </w:rPr>
+            </w:pPr>
+            <w:r>
+              <w:rPr>
+                <w:rFonts w:asciiTheme="minorEastAsia" w:hAnsiTheme="minorEastAsia"/>
+                <w:sz w:val="18"/>
+              </w:rPr>
+              <w:t xml:space="preserve">54839.1 ± 17523.4</w:t>
+            </w:r>
+          </w:p>
+        </w:tc>
+        <w:tc>
+          <w:tcPr>
+            <w:tcW w:w="1080" w:type="dxa"/>
+          </w:tcPr>
+          <w:p>
+            <w:pPr>
+              <w:pStyle w:val="Compact"/>
+              <w:spacing w:after="0"/>
+              <w:jc w:val="right"/>
+              <w:rPr>
+                <w:rFonts w:asciiTheme="minorEastAsia" w:hAnsiTheme="minorEastAsia"/>
+              </w:rPr>
+            </w:pPr>
+            <w:r>
+              <w:rPr>
+                <w:rFonts w:asciiTheme="minorEastAsia" w:hAnsiTheme="minorEastAsia"/>
+                <w:sz w:val="18"/>
+              </w:rPr>
+              <w:t xml:space="preserve">0.12</w:t>
+            </w:r>
+          </w:p>
+        </w:tc>
+        <w:tc>
+          <w:tcPr>
+            <w:tcW w:w="1440" w:type="dxa"/>
+          </w:tcPr>
+          <w:p>
+            <w:pPr>
+              <w:pStyle w:val="Compact"/>
+              <w:spacing w:after="0"/>
+              <w:jc w:val="right"/>
+              <w:rPr>
+                <w:rFonts w:asciiTheme="minorEastAsia" w:hAnsiTheme="minorEastAsia"/>
+              </w:rPr>
+            </w:pPr>
+            <w:r>
+              <w:rPr>
+                <w:rFonts w:asciiTheme="minorEastAsia" w:hAnsiTheme="minorEastAsia"/>
+                <w:sz w:val="18"/>
+              </w:rPr>
+              <w:t xml:space="preserve">—</w:t>
+            </w:r>
+          </w:p>
+        </w:tc>
+        <w:tc>
+          <w:tcPr>
+            <w:tcW w:w="1008" w:type="dxa"/>
+          </w:tcPr>
+          <w:p>
+            <w:pPr>
+              <w:pStyle w:val="Compact"/>
+              <w:spacing w:after="0"/>
+              <w:jc w:val="right"/>
+              <w:rPr>
+                <w:rFonts w:asciiTheme="minorEastAsia" w:hAnsiTheme="minorEastAsia"/>
+              </w:rPr>
+            </w:pPr>
+            <w:r>
+              <w:rPr>
+                <w:rFonts w:asciiTheme="minorEastAsia" w:hAnsiTheme="minorEastAsia"/>
+                <w:sz w:val="18"/>
+              </w:rPr>
+              <w:t xml:space="preserve">3.05</w:t>
+            </w:r>
+          </w:p>
+        </w:tc>
+      </w:tr>
+      <w:tr>
+        <w:tc>
+          <w:tcPr>
+            <w:tcW w:w="1224" w:type="dxa"/>
+          </w:tcPr>
+          <w:p>
+            <w:pPr>
+              <w:pStyle w:val="Compact"/>
+              <w:spacing w:after="0"/>
+              <w:rPr>
+                <w:rFonts w:asciiTheme="minorEastAsia" w:hAnsiTheme="minorEastAsia"/>
+              </w:rPr>
+            </w:pPr>
+            <w:r>
+              <w:rPr>
+                <w:rFonts w:asciiTheme="minorEastAsia" w:hAnsiTheme="minorEastAsia"/>
+                <w:sz w:val="18"/>
+              </w:rPr>
+              <w:t xml:space="preserve">L-tight</w:t>
+            </w:r>
+          </w:p>
+        </w:tc>
+        <w:tc>
+          <w:tcPr>
+            <w:tcW w:w="1872" w:type="dxa"/>
+          </w:tcPr>
+          <w:p>
+            <w:pPr>
+              <w:pStyle w:val="Compact"/>
+              <w:spacing w:after="0"/>
+              <w:rPr>
+                <w:rFonts w:asciiTheme="minorEastAsia" w:hAnsiTheme="minorEastAsia"/>
+              </w:rPr>
+            </w:pPr>
+            <w:r>
+              <w:rPr>
+                <w:rFonts w:asciiTheme="minorEastAsia" w:hAnsiTheme="minorEastAsia"/>
+                <w:sz w:val="18"/>
+              </w:rPr>
+              <w:t xml:space="preserve">VAA</w:t>
+            </w:r>
+          </w:p>
+        </w:tc>
+        <w:tc>
+          <w:tcPr>
+            <w:tcW w:w="2088" w:type="dxa"/>
+          </w:tcPr>
+          <w:p>
+            <w:pPr>
+              <w:pStyle w:val="Compact"/>
+              <w:spacing w:after="0"/>
+              <w:jc w:val="right"/>
+              <w:rPr>
+                <w:rFonts w:asciiTheme="minorEastAsia" w:hAnsiTheme="minorEastAsia"/>
+              </w:rPr>
+            </w:pPr>
+            <w:r>
+              <w:rPr>
+                <w:rFonts w:asciiTheme="minorEastAsia" w:hAnsiTheme="minorEastAsia"/>
+                <w:sz w:val="18"/>
+              </w:rPr>
+              <w:t xml:space="preserve">119671.9 ± 32475.3</w:t>
+            </w:r>
+          </w:p>
+        </w:tc>
+        <w:tc>
+          <w:tcPr>
+            <w:tcW w:w="1080" w:type="dxa"/>
+          </w:tcPr>
+          <w:p>
+            <w:pPr>
+              <w:pStyle w:val="Compact"/>
+              <w:spacing w:after="0"/>
+              <w:jc w:val="right"/>
+              <w:rPr>
+                <w:rFonts w:asciiTheme="minorEastAsia" w:hAnsiTheme="minorEastAsia"/>
+              </w:rPr>
+            </w:pPr>
+            <w:r>
+              <w:rPr>
+                <w:rFonts w:asciiTheme="minorEastAsia" w:hAnsiTheme="minorEastAsia"/>
+                <w:sz w:val="18"/>
+              </w:rPr>
+              <w:t xml:space="preserve">0.78</w:t>
+            </w:r>
+          </w:p>
+        </w:tc>
+        <w:tc>
+          <w:tcPr>
+            <w:tcW w:w="1440" w:type="dxa"/>
+          </w:tcPr>
+          <w:p>
+            <w:pPr>
+              <w:pStyle w:val="Compact"/>
+              <w:spacing w:after="0"/>
+              <w:jc w:val="right"/>
+              <w:rPr>
+                <w:rFonts w:asciiTheme="minorEastAsia" w:hAnsiTheme="minorEastAsia"/>
+              </w:rPr>
+            </w:pPr>
+            <w:r>
+              <w:rPr>
+                <w:rFonts w:asciiTheme="minorEastAsia" w:hAnsiTheme="minorEastAsia"/>
+                <w:sz w:val="18"/>
+              </w:rPr>
+              <w:t xml:space="preserve">—</w:t>
+            </w:r>
+          </w:p>
+        </w:tc>
+        <w:tc>
+          <w:tcPr>
+            <w:tcW w:w="1008" w:type="dxa"/>
+          </w:tcPr>
+          <w:p>
+            <w:pPr>
+              <w:pStyle w:val="Compact"/>
+              <w:spacing w:after="0"/>
+              <w:jc w:val="right"/>
+              <w:rPr>
+                <w:rFonts w:asciiTheme="minorEastAsia" w:hAnsiTheme="minorEastAsia"/>
+              </w:rPr>
+            </w:pPr>
+            <w:r>
+              <w:rPr>
+                <w:rFonts w:asciiTheme="minorEastAsia" w:hAnsiTheme="minorEastAsia"/>
+                <w:sz w:val="18"/>
+              </w:rPr>
+              <w:t xml:space="preserve">0.02</w:t>
+            </w:r>
+          </w:p>
+        </w:tc>
+      </w:tr>
+      <w:tr>
+        <w:tc>
+          <w:tcPr>
+            <w:tcW w:w="1224" w:type="dxa"/>
+          </w:tcPr>
+          <w:p>
+            <w:pPr>
+              <w:pStyle w:val="Compact"/>
+              <w:spacing w:after="0"/>
+              <w:rPr>
+                <w:rFonts w:asciiTheme="minorEastAsia" w:hAnsiTheme="minorEastAsia"/>
+              </w:rPr>
+            </w:pPr>
+          </w:p>
+        </w:tc>
+        <w:tc>
+          <w:tcPr>
+            <w:tcW w:w="1872" w:type="dxa"/>
+          </w:tcPr>
+          <w:p>
+            <w:pPr>
+              <w:pStyle w:val="Compact"/>
+              <w:spacing w:after="0"/>
+              <w:rPr>
+                <w:rFonts w:asciiTheme="minorEastAsia" w:hAnsiTheme="minorEastAsia"/>
+              </w:rPr>
+            </w:pPr>
+            <w:r>
+              <w:rPr>
+                <w:rFonts w:asciiTheme="minorEastAsia" w:hAnsiTheme="minorEastAsia"/>
+                <w:sz w:val="18"/>
+              </w:rPr>
+              <w:t xml:space="preserve">Extended-SA-RL5</w:t>
+            </w:r>
+          </w:p>
+        </w:tc>
+        <w:tc>
+          <w:tcPr>
+            <w:tcW w:w="2088" w:type="dxa"/>
+          </w:tcPr>
+          <w:p>
+            <w:pPr>
+              <w:pStyle w:val="Compact"/>
+              <w:spacing w:after="0"/>
+              <w:jc w:val="right"/>
+              <w:rPr>
+                <w:rFonts w:asciiTheme="minorEastAsia" w:hAnsiTheme="minorEastAsia"/>
+              </w:rPr>
+            </w:pPr>
+            <w:r>
+              <w:rPr>
+                <w:rFonts w:asciiTheme="minorEastAsia" w:hAnsiTheme="minorEastAsia"/>
+                <w:sz w:val="18"/>
+              </w:rPr>
+              <w:t xml:space="preserve">119637.8 ± 31833.7</w:t>
+            </w:r>
+          </w:p>
+        </w:tc>
+        <w:tc>
+          <w:tcPr>
+            <w:tcW w:w="1080" w:type="dxa"/>
+          </w:tcPr>
+          <w:p>
+            <w:pPr>
+              <w:pStyle w:val="Compact"/>
+              <w:spacing w:after="0"/>
+              <w:jc w:val="right"/>
+              <w:rPr>
+                <w:rFonts w:asciiTheme="minorEastAsia" w:hAnsiTheme="minorEastAsia"/>
+              </w:rPr>
+            </w:pPr>
+            <w:r>
+              <w:rPr>
+                <w:rFonts w:asciiTheme="minorEastAsia" w:hAnsiTheme="minorEastAsia"/>
+                <w:sz w:val="18"/>
+              </w:rPr>
+              <w:t xml:space="preserve">0.74</w:t>
+            </w:r>
+          </w:p>
+        </w:tc>
+        <w:tc>
+          <w:tcPr>
+            <w:tcW w:w="1440" w:type="dxa"/>
+          </w:tcPr>
+          <w:p>
+            <w:pPr>
+              <w:pStyle w:val="Compact"/>
+              <w:spacing w:after="0"/>
+              <w:jc w:val="right"/>
+              <w:rPr>
+                <w:rFonts w:asciiTheme="minorEastAsia" w:hAnsiTheme="minorEastAsia"/>
+              </w:rPr>
+            </w:pPr>
+            <w:r>
+              <w:rPr>
+                <w:rFonts w:asciiTheme="minorEastAsia" w:hAnsiTheme="minorEastAsia"/>
+                <w:sz w:val="18"/>
+              </w:rPr>
+              <w:t xml:space="preserve">—</w:t>
+            </w:r>
+          </w:p>
+        </w:tc>
+        <w:tc>
+          <w:tcPr>
+            <w:tcW w:w="1008" w:type="dxa"/>
+          </w:tcPr>
+          <w:p>
+            <w:pPr>
+              <w:pStyle w:val="Compact"/>
+              <w:spacing w:after="0"/>
+              <w:jc w:val="right"/>
+              <w:rPr>
+                <w:rFonts w:asciiTheme="minorEastAsia" w:hAnsiTheme="minorEastAsia"/>
+              </w:rPr>
+            </w:pPr>
+            <w:r>
+              <w:rPr>
+                <w:rFonts w:asciiTheme="minorEastAsia" w:hAnsiTheme="minorEastAsia"/>
+                <w:sz w:val="18"/>
+              </w:rPr>
+              <w:t xml:space="preserve">1.88</w:t>
+            </w:r>
+          </w:p>
+        </w:tc>
+      </w:tr>
+      <w:tr>
+        <w:tc>
+          <w:tcPr>
+            <w:tcW w:w="1224" w:type="dxa"/>
+          </w:tcPr>
+          <w:p>
+            <w:pPr>
+              <w:pStyle w:val="Compact"/>
+              <w:spacing w:after="0"/>
+              <w:rPr>
+                <w:rFonts w:asciiTheme="minorEastAsia" w:hAnsiTheme="minorEastAsia"/>
+              </w:rPr>
+            </w:pPr>
+          </w:p>
+        </w:tc>
+        <w:tc>
+          <w:tcPr>
+            <w:tcW w:w="1872" w:type="dxa"/>
+          </w:tcPr>
+          <w:p>
+            <w:pPr>
+              <w:pStyle w:val="Compact"/>
+              <w:spacing w:after="0"/>
+              <w:rPr>
+                <w:rFonts w:asciiTheme="minorEastAsia" w:hAnsiTheme="minorEastAsia"/>
+              </w:rPr>
+            </w:pPr>
+            <w:r>
+              <w:rPr>
+                <w:rFonts w:asciiTheme="minorEastAsia" w:hAnsiTheme="minorEastAsia"/>
+                <w:sz w:val="18"/>
+              </w:rPr>
+              <w:t xml:space="preserve">GILS-uniform</w:t>
+            </w:r>
+          </w:p>
+        </w:tc>
+        <w:tc>
+          <w:tcPr>
+            <w:tcW w:w="2088" w:type="dxa"/>
+          </w:tcPr>
+          <w:p>
+            <w:pPr>
+              <w:pStyle w:val="Compact"/>
+              <w:spacing w:after="0"/>
+              <w:jc w:val="right"/>
+              <w:rPr>
+                <w:rFonts w:asciiTheme="minorEastAsia" w:hAnsiTheme="minorEastAsia"/>
+              </w:rPr>
+            </w:pPr>
+            <w:r>
+              <w:rPr>
+                <w:rFonts w:asciiTheme="minorEastAsia" w:hAnsiTheme="minorEastAsia"/>
+                <w:sz w:val="18"/>
+              </w:rPr>
+              <w:t xml:space="preserve">118865.0 ± 31786.4</w:t>
+            </w:r>
+          </w:p>
+        </w:tc>
+        <w:tc>
+          <w:tcPr>
+            <w:tcW w:w="1080" w:type="dxa"/>
+          </w:tcPr>
+          <w:p>
+            <w:pPr>
+              <w:pStyle w:val="Compact"/>
+              <w:spacing w:after="0"/>
+              <w:jc w:val="right"/>
+              <w:rPr>
+                <w:rFonts w:asciiTheme="minorEastAsia" w:hAnsiTheme="minorEastAsia"/>
+              </w:rPr>
+            </w:pPr>
+            <w:r>
+              <w:rPr>
+                <w:rFonts w:asciiTheme="minorEastAsia" w:hAnsiTheme="minorEastAsia"/>
+                <w:sz w:val="18"/>
+              </w:rPr>
+              <w:t xml:space="preserve">0.05</w:t>
+            </w:r>
+          </w:p>
+        </w:tc>
+        <w:tc>
+          <w:tcPr>
+            <w:tcW w:w="1440" w:type="dxa"/>
+          </w:tcPr>
+          <w:p>
+            <w:pPr>
+              <w:pStyle w:val="Compact"/>
+              <w:spacing w:after="0"/>
+              <w:jc w:val="right"/>
+              <w:rPr>
+                <w:rFonts w:asciiTheme="minorEastAsia" w:hAnsiTheme="minorEastAsia"/>
+              </w:rPr>
+            </w:pPr>
+            <w:r>
+              <w:rPr>
+                <w:rFonts w:asciiTheme="minorEastAsia" w:hAnsiTheme="minorEastAsia"/>
+                <w:sz w:val="18"/>
+              </w:rPr>
+              <w:t xml:space="preserve">—</w:t>
+            </w:r>
+          </w:p>
+        </w:tc>
+        <w:tc>
+          <w:tcPr>
+            <w:tcW w:w="1008" w:type="dxa"/>
+          </w:tcPr>
+          <w:p>
+            <w:pPr>
+              <w:pStyle w:val="Compact"/>
+              <w:spacing w:after="0"/>
+              <w:jc w:val="right"/>
+              <w:rPr>
+                <w:rFonts w:asciiTheme="minorEastAsia" w:hAnsiTheme="minorEastAsia"/>
+              </w:rPr>
+            </w:pPr>
+            <w:r>
+              <w:rPr>
+                <w:rFonts w:asciiTheme="minorEastAsia" w:hAnsiTheme="minorEastAsia"/>
+                <w:sz w:val="18"/>
+              </w:rPr>
+              <w:t xml:space="preserve">2.91</w:t>
+            </w:r>
+          </w:p>
+        </w:tc>
+      </w:tr>
+      <w:tr>
+        <w:tc>
+          <w:tcPr>
+            <w:tcW w:w="1224" w:type="dxa"/>
+          </w:tcPr>
+          <w:p>
+            <w:pPr>
+              <w:pStyle w:val="Compact"/>
+              <w:spacing w:after="0"/>
+              <w:rPr>
+                <w:rFonts w:asciiTheme="minorEastAsia" w:hAnsiTheme="minorEastAsia"/>
+              </w:rPr>
+            </w:pPr>
+          </w:p>
+        </w:tc>
+        <w:tc>
+          <w:tcPr>
+            <w:tcW w:w="1872" w:type="dxa"/>
+          </w:tcPr>
+          <w:p>
+            <w:pPr>
+              <w:pStyle w:val="Compact"/>
+              <w:spacing w:after="0"/>
+              <w:rPr>
+                <w:rFonts w:asciiTheme="minorEastAsia" w:hAnsiTheme="minorEastAsia"/>
+              </w:rPr>
+            </w:pPr>
+            <w:r>
+              <w:rPr>
+                <w:rFonts w:asciiTheme="minorEastAsia" w:hAnsiTheme="minorEastAsia"/>
+                <w:sz w:val="18"/>
+              </w:rPr>
+              <w:t xml:space="preserve">GILS-tabular</w:t>
+            </w:r>
+          </w:p>
+        </w:tc>
+        <w:tc>
+          <w:tcPr>
+            <w:tcW w:w="2088" w:type="dxa"/>
+          </w:tcPr>
+          <w:p>
+            <w:pPr>
+              <w:pStyle w:val="Compact"/>
+              <w:spacing w:after="0"/>
+              <w:jc w:val="right"/>
+              <w:rPr>
+                <w:rFonts w:asciiTheme="minorEastAsia" w:hAnsiTheme="minorEastAsia"/>
+              </w:rPr>
+            </w:pPr>
+            <w:r>
+              <w:rPr>
+                <w:rFonts w:asciiTheme="minorEastAsia" w:hAnsiTheme="minorEastAsia"/>
+                <w:sz w:val="18"/>
+              </w:rPr>
+              <w:t xml:space="preserve">118866.6 ± 31780.4</w:t>
+            </w:r>
+          </w:p>
+        </w:tc>
+        <w:tc>
+          <w:tcPr>
+            <w:tcW w:w="1080" w:type="dxa"/>
+          </w:tcPr>
+          <w:p>
+            <w:pPr>
+              <w:pStyle w:val="Compact"/>
+              <w:spacing w:after="0"/>
+              <w:jc w:val="right"/>
+              <w:rPr>
+                <w:rFonts w:asciiTheme="minorEastAsia" w:hAnsiTheme="minorEastAsia"/>
+              </w:rPr>
+            </w:pPr>
+            <w:r>
+              <w:rPr>
+                <w:rFonts w:asciiTheme="minorEastAsia" w:hAnsiTheme="minorEastAsia"/>
+                <w:sz w:val="18"/>
+              </w:rPr>
+              <w:t xml:space="preserve">0.06</w:t>
+            </w:r>
+          </w:p>
+        </w:tc>
+        <w:tc>
+          <w:tcPr>
+            <w:tcW w:w="1440" w:type="dxa"/>
+          </w:tcPr>
+          <w:p>
+            <w:pPr>
+              <w:pStyle w:val="Compact"/>
+              <w:spacing w:after="0"/>
+              <w:jc w:val="right"/>
+              <w:rPr>
+                <w:rFonts w:asciiTheme="minorEastAsia" w:hAnsiTheme="minorEastAsia"/>
+              </w:rPr>
+            </w:pPr>
+            <w:r>
+              <w:rPr>
+                <w:rFonts w:asciiTheme="minorEastAsia" w:hAnsiTheme="minorEastAsia"/>
+                <w:sz w:val="18"/>
+              </w:rPr>
+              <w:t xml:space="preserve">—</w:t>
+            </w:r>
+          </w:p>
+        </w:tc>
+        <w:tc>
+          <w:tcPr>
+            <w:tcW w:w="1008" w:type="dxa"/>
+          </w:tcPr>
+          <w:p>
+            <w:pPr>
+              <w:pStyle w:val="Compact"/>
+              <w:spacing w:after="0"/>
+              <w:jc w:val="right"/>
+              <w:rPr>
+                <w:rFonts w:asciiTheme="minorEastAsia" w:hAnsiTheme="minorEastAsia"/>
+              </w:rPr>
+            </w:pPr>
+            <w:r>
+              <w:rPr>
+                <w:rFonts w:asciiTheme="minorEastAsia" w:hAnsiTheme="minorEastAsia"/>
+                <w:sz w:val="18"/>
+              </w:rPr>
+              <w:t xml:space="preserve">3.38</w:t>
+            </w:r>
+          </w:p>
+        </w:tc>
+      </w:tr>
+      <w:tr>
+        <w:tc>
+          <w:tcPr>
+            <w:tcW w:w="1224" w:type="dxa"/>
+          </w:tcPr>
+          <w:p>
+            <w:pPr>
+              <w:pStyle w:val="Compact"/>
+              <w:spacing w:after="0"/>
+              <w:rPr>
+                <w:rFonts w:asciiTheme="minorEastAsia" w:hAnsiTheme="minorEastAsia"/>
+              </w:rPr>
+            </w:pPr>
+          </w:p>
+        </w:tc>
+        <w:tc>
+          <w:tcPr>
+            <w:tcW w:w="1872" w:type="dxa"/>
+          </w:tcPr>
+          <w:p>
+            <w:pPr>
+              <w:pStyle w:val="Compact"/>
+              <w:spacing w:after="0"/>
+              <w:rPr>
+                <w:rFonts w:asciiTheme="minorEastAsia" w:hAnsiTheme="minorEastAsia"/>
+              </w:rPr>
+            </w:pPr>
+            <w:r>
+              <w:rPr>
+                <w:rFonts w:asciiTheme="minorEastAsia" w:hAnsiTheme="minorEastAsia"/>
+                <w:sz w:val="18"/>
+              </w:rPr>
+              <w:t xml:space="preserve">GILS-DQN</w:t>
+            </w:r>
+          </w:p>
+        </w:tc>
+        <w:tc>
+          <w:tcPr>
+            <w:tcW w:w="2088" w:type="dxa"/>
+          </w:tcPr>
+          <w:p>
+            <w:pPr>
+              <w:pStyle w:val="Compact"/>
+              <w:spacing w:after="0"/>
+              <w:jc w:val="right"/>
+              <w:rPr>
+                <w:rFonts w:asciiTheme="minorEastAsia" w:hAnsiTheme="minorEastAsia"/>
+              </w:rPr>
+            </w:pPr>
+            <w:r>
+              <w:rPr>
+                <w:rFonts w:asciiTheme="minorEastAsia" w:hAnsiTheme="minorEastAsia"/>
+                <w:sz w:val="18"/>
+              </w:rPr>
+              <w:t xml:space="preserve">118897.8 ± 31779.3</w:t>
+            </w:r>
+          </w:p>
+        </w:tc>
+        <w:tc>
+          <w:tcPr>
+            <w:tcW w:w="1080" w:type="dxa"/>
+          </w:tcPr>
+          <w:p>
+            <w:pPr>
+              <w:pStyle w:val="Compact"/>
+              <w:spacing w:after="0"/>
+              <w:jc w:val="right"/>
+              <w:rPr>
+                <w:rFonts w:asciiTheme="minorEastAsia" w:hAnsiTheme="minorEastAsia"/>
+              </w:rPr>
+            </w:pPr>
+            <w:r>
+              <w:rPr>
+                <w:rFonts w:asciiTheme="minorEastAsia" w:hAnsiTheme="minorEastAsia"/>
+                <w:sz w:val="18"/>
+              </w:rPr>
+              <w:t xml:space="preserve">0.08</w:t>
+            </w:r>
+          </w:p>
+        </w:tc>
+        <w:tc>
+          <w:tcPr>
+            <w:tcW w:w="1440" w:type="dxa"/>
+          </w:tcPr>
+          <w:p>
+            <w:pPr>
+              <w:pStyle w:val="Compact"/>
+              <w:spacing w:after="0"/>
+              <w:jc w:val="right"/>
+              <w:rPr>
+                <w:rFonts w:asciiTheme="minorEastAsia" w:hAnsiTheme="minorEastAsia"/>
+              </w:rPr>
+            </w:pPr>
+            <w:r>
+              <w:rPr>
+                <w:rFonts w:asciiTheme="minorEastAsia" w:hAnsiTheme="minorEastAsia"/>
+                <w:sz w:val="18"/>
+              </w:rPr>
+              <w:t xml:space="preserve">—</w:t>
+            </w:r>
+          </w:p>
+        </w:tc>
+        <w:tc>
+          <w:tcPr>
+            <w:tcW w:w="1008" w:type="dxa"/>
+          </w:tcPr>
+          <w:p>
+            <w:pPr>
+              <w:pStyle w:val="Compact"/>
+              <w:spacing w:after="0"/>
+              <w:jc w:val="right"/>
+              <w:rPr>
+                <w:rFonts w:asciiTheme="minorEastAsia" w:hAnsiTheme="minorEastAsia"/>
+              </w:rPr>
+            </w:pPr>
+            <w:r>
+              <w:rPr>
+                <w:rFonts w:asciiTheme="minorEastAsia" w:hAnsiTheme="minorEastAsia"/>
+                <w:sz w:val="18"/>
+              </w:rPr>
+              <w:t xml:space="preserve">3.35</w:t>
             </w:r>
           </w:p>
         </w:tc>
@@ -19395,13 +20090,13 @@
           <w:b/>
           <w:bCs/>
         </w:rPr>
-        <w:t>Operator pool.</w:t>
-      </w:r>
-      <w:r>
-        <w:rPr>
-          <w:rFonts w:asciiTheme="minorEastAsia" w:hAnsiTheme="minorEastAsia"/>
-        </w:rPr>
-        <w:t xml:space="preserve"> 선택 정책을 균등 선택으로 고정하고 연산자 집합만 기본(7종)/ 핵심(+g1,g2)/전체(+g3,g4)로 바꾸면 </w:t>
+        <w:t xml:space="preserve">Operator pool.</w:t>
+      </w:r>
+      <w:r>
+        <w:rPr>
+          <w:rFonts w:asciiTheme="minorEastAsia" w:hAnsiTheme="minorEastAsia"/>
+        </w:rPr>
+        <w:t xml:space="preserve"> 선택 정책을 균등 선택으로 고정하고 연산자 집합만 기본(7종)/핵심(+g1,g2)/전체(+g3,g4)로 바꾸면, 기본에서 핵심으로 갈 때 </w:t>
       </w:r>
       <m:oMath>
         <m:sSub>
@@ -19437,68 +20132,74 @@
         <w:rPr>
           <w:rFonts w:asciiTheme="minorEastAsia" w:hAnsiTheme="minorEastAsia"/>
         </w:rPr>
-        <w:t xml:space="preserve">가 9개 실험 조건 전부에서 generic </w:t>
+        <w:t xml:space="preserve">가 9개 실험 조건 전부에서 낮아지고(&lt;Figure 2&gt;) 짝지은 Wilcoxon(&lt;Table 4&gt;)에서도 g1, g2 추가의 효과가 뚜렷하다. 반면 g3, g4를 더한 효과는 작고 전체 45쌍에서만 유의하며, 시간 제약 유무로 나누면 유의하지 않다(각각 </w:t>
       </w:r>
       <m:oMath>
+        <m:r>
+          <m:t>p</m:t>
+        </m:r>
         <m:r>
           <m:rPr>
             <m:sty m:val="p"/>
           </m:rPr>
-          <w:rPr>
-            <w:rFonts w:ascii="Cambria Math" w:hAnsi="Cambria Math"/>
-          </w:rPr>
-          <m:t>≥</m:t>
+          <m:t>=</m:t>
+        </m:r>
+        <m:r>
+          <m:t>0.09</m:t>
         </m:r>
       </m:oMath>
       <w:r>
         <w:rPr>
           <w:rFonts w:asciiTheme="minorEastAsia" w:hAnsiTheme="minorEastAsia"/>
         </w:rPr>
-        <w:t xml:space="preserve"> critical </w:t>
+        <w:t xml:space="preserve">, </w:t>
       </w:r>
       <m:oMath>
         <m:r>
-          <m:rPr>
-            <m:sty m:val="p"/>
-          </m:rPr>
-          <w:rPr>
-            <w:rFonts w:ascii="Cambria Math" w:hAnsi="Cambria Math"/>
-          </w:rPr>
-          <m:t>≥</m:t>
+          <m:t>0.12</m:t>
         </m:r>
       </m:oMath>
       <w:r>
         <w:rPr>
           <w:rFonts w:asciiTheme="minorEastAsia" w:hAnsiTheme="minorEastAsia"/>
         </w:rPr>
-        <w:t xml:space="preserve"> full로 단조 감소한다(&lt;Figure 2&gt;)</w:t>
-      </w:r>
-      <w:hyperlink w:anchor="fig:op"/>
-      <w:r>
-        <w:rPr>
-          <w:rFonts w:asciiTheme="minorEastAsia" w:hAnsiTheme="minorEastAsia"/>
-        </w:rPr>
-        <w:t>. 짝지은 Wilcoxon(&lt;Table 4&gt;)</w:t>
-      </w:r>
-      <w:hyperlink w:anchor="tab:b1"/>
-      <w:r>
-        <w:rPr>
-          <w:rFonts w:asciiTheme="minorEastAsia" w:hAnsiTheme="minorEastAsia"/>
-        </w:rPr>
-        <w:t>은 유도 연산자가 목적값을 일관되</w:t>
-      </w:r>
-      <w:r>
-        <w:rPr>
-          <w:rFonts w:asciiTheme="minorEastAsia" w:hAnsiTheme="minorEastAsia" w:hint="eastAsia"/>
-          <w:lang w:eastAsia="ko-KR"/>
-        </w:rPr>
-        <w:t xml:space="preserve">고 </w:t>
-      </w:r>
-      <w:r>
-        <w:rPr>
-          <w:rFonts w:asciiTheme="minorEastAsia" w:hAnsiTheme="minorEastAsia"/>
-        </w:rPr>
-        <w:t>유의하게 낮춤을 보인다.</w:t>
+        <w:t xml:space="preserve">). S-medium, S-tight, L-tight에서는 오히려 전체 집합의 </w:t>
+      </w:r>
+      <m:oMath>
+        <m:sSub>
+          <m:sSubPr>
+            <m:ctrlPr>
+              <w:rPr>
+                <w:rFonts w:ascii="Cambria Math" w:hAnsi="Cambria Math"/>
+              </w:rPr>
+            </m:ctrlPr>
+          </m:sSubPr>
+          <m:e>
+            <m:r>
+              <m:rPr>
+                <m:sty m:val="p"/>
+              </m:rPr>
+              <w:rPr>
+                <w:rFonts w:ascii="Cambria Math" w:hAnsi="Cambria Math"/>
+              </w:rPr>
+              <m:t>Δ</m:t>
+            </m:r>
+          </m:e>
+          <m:sub>
+            <m:r>
+              <w:rPr>
+                <w:rFonts w:ascii="Cambria Math" w:hAnsi="Cambria Math"/>
+              </w:rPr>
+              <m:t>bo</m:t>
+            </m:r>
+          </m:sub>
+        </m:sSub>
+      </m:oMath>
+      <w:r>
+        <w:rPr>
+          <w:rFonts w:asciiTheme="minorEastAsia" w:hAnsiTheme="minorEastAsia"/>
+        </w:rPr>
+        <w:t xml:space="preserve">가 0.02%p 이내에서 근소하게 높다. 따라서 유도 연산자의 이득은 대부분 g1, g2에서 나온다.</w:t>
       </w:r>
     </w:p>
     <w:p>
@@ -19530,7 +20231,19 @@
           <w:rFonts w:asciiTheme="minorEastAsia" w:hAnsiTheme="minorEastAsia"/>
           <w:sz w:val="18"/>
         </w:rPr>
-        <w:t xml:space="preserve"> 5 replications per condition, the number of iterations fixed at 1,000; two-sided Wilcoxon, positive mean favors the richer operator set).</w:t>
+        <w:t xml:space="preserve"> 5 replications per condition over 9 conditions, the number of iterations fixed at 1,000; two-sided Wilcoxon on per-instance replication means, hence at most 45 pairs, with zero differences excluded from </w:t>
+      </w:r>
+      <m:oMath>
+        <m:r>
+          <m:t>n</m:t>
+        </m:r>
+      </m:oMath>
+      <w:r>
+        <w:rPr>
+          <w:rFonts w:asciiTheme="minorEastAsia" w:hAnsiTheme="minorEastAsia"/>
+          <w:sz w:val="18"/>
+        </w:rPr>
+        <w:t xml:space="preserve">; positive mean favors the richer operator set).</w:t>
       </w:r>
     </w:p>
     <w:tbl>
@@ -19698,7 +20411,7 @@
                 <w:rFonts w:asciiTheme="minorEastAsia" w:hAnsiTheme="minorEastAsia"/>
                 <w:sz w:val="18"/>
               </w:rPr>
-              <w:t>136</w:t>
+              <w:t xml:space="preserve">45</w:t>
             </w:r>
           </w:p>
         </w:tc>
@@ -19720,7 +20433,7 @@
                 <w:rFonts w:asciiTheme="minorEastAsia" w:hAnsiTheme="minorEastAsia"/>
                 <w:sz w:val="18"/>
               </w:rPr>
-              <w:t>+0.114</w:t>
+              <w:t xml:space="preserve">+0.128</w:t>
             </w:r>
           </w:p>
         </w:tc>
@@ -19741,7 +20454,7 @@
                 <w:rFonts w:asciiTheme="minorEastAsia" w:hAnsiTheme="minorEastAsia"/>
                 <w:sz w:val="18"/>
               </w:rPr>
-              <w:t>&lt;0.0001</w:t>
+              <w:t xml:space="preserve">&lt;0.0001</w:t>
             </w:r>
           </w:p>
         </w:tc>
@@ -19786,7 +20499,7 @@
                 <w:rFonts w:asciiTheme="minorEastAsia" w:hAnsiTheme="minorEastAsia"/>
                 <w:sz w:val="18"/>
               </w:rPr>
-              <w:t>172</w:t>
+              <w:t xml:space="preserve">45</w:t>
             </w:r>
           </w:p>
         </w:tc>
@@ -19808,7 +20521,7 @@
                 <w:rFonts w:asciiTheme="minorEastAsia" w:hAnsiTheme="minorEastAsia"/>
                 <w:sz w:val="18"/>
               </w:rPr>
-              <w:t>+0.048</w:t>
+              <w:t xml:space="preserve">+0.025</w:t>
             </w:r>
           </w:p>
         </w:tc>
@@ -19829,7 +20542,7 @@
                 <w:rFonts w:asciiTheme="minorEastAsia" w:hAnsiTheme="minorEastAsia"/>
                 <w:sz w:val="18"/>
               </w:rPr>
-              <w:t>&lt;0.0001</w:t>
+              <w:t xml:space="preserve">0.0320</w:t>
             </w:r>
           </w:p>
         </w:tc>
@@ -19874,7 +20587,7 @@
                 <w:rFonts w:asciiTheme="minorEastAsia" w:hAnsiTheme="minorEastAsia"/>
                 <w:sz w:val="18"/>
               </w:rPr>
-              <w:t>166</w:t>
+              <w:t xml:space="preserve">45</w:t>
             </w:r>
           </w:p>
         </w:tc>
@@ -19896,7 +20609,7 @@
                 <w:rFonts w:asciiTheme="minorEastAsia" w:hAnsiTheme="minorEastAsia"/>
                 <w:sz w:val="18"/>
               </w:rPr>
-              <w:t>+0.161</w:t>
+              <w:t xml:space="preserve">+0.153</w:t>
             </w:r>
           </w:p>
         </w:tc>
@@ -19917,7 +20630,7 @@
                 <w:rFonts w:asciiTheme="minorEastAsia" w:hAnsiTheme="minorEastAsia"/>
                 <w:sz w:val="18"/>
               </w:rPr>
-              <w:t>&lt;0.0001</w:t>
+              <w:t xml:space="preserve">&lt;0.0001</w:t>
             </w:r>
           </w:p>
         </w:tc>
@@ -19943,7 +20656,7 @@
         <w:lastRenderedPageBreak/>
         <w:drawing>
           <wp:inline distT="0" distB="0" distL="0" distR="0" wp14:anchorId="38A525B9" wp14:editId="32A4FAD5">
-            <wp:extent cx="5334000" cy="3087159"/>
+            <wp:extent cx="5334000" cy="3167062"/>
             <wp:effectExtent l="0" t="0" r="0" b="0"/>
             <wp:docPr id="516521012" name="Picture"/>
             <wp:cNvGraphicFramePr/>
@@ -19965,7 +20678,7 @@
                   <pic:spPr bwMode="auto">
                     <a:xfrm>
                       <a:off x="0" y="0"/>
-                      <a:ext cx="5334000" cy="2617767"/>
+                      <a:ext cx="5334000" cy="3167062"/>
                     </a:xfrm>
                     <a:prstGeom prst="rect">
                       <a:avLst/>
@@ -20016,27 +20729,13 @@
           <w:b/>
           <w:bCs/>
         </w:rPr>
-        <w:t>Engine components.</w:t>
-      </w:r>
-      <w:r>
-        <w:rPr>
-          <w:rFonts w:asciiTheme="minorEastAsia" w:hAnsiTheme="minorEastAsia"/>
-        </w:rPr>
-        <w:t xml:space="preserve"> 연산자 집합을 full, 선택 정책을 균등 선택으로 고정하고 구성요소를 하나씩 제거하면(&lt;Table 5&gt;)</w:t>
-      </w:r>
-      <w:hyperlink w:anchor="tab:b2"/>
-      <w:r>
-        <w:rPr>
-          <w:rFonts w:asciiTheme="minorEastAsia" w:hAnsiTheme="minorEastAsia"/>
-        </w:rPr>
-        <w:t>, best-improvement descent의 기여가 가장 크고 kick restart가 그다음이며, VAA 초기해는 통계적으로 유의하지 않고 확률적 acceptance는 제거해도 목적값이 나빠지지 않는다(&lt;Figure 3&gt;)</w:t>
-      </w:r>
-      <w:hyperlink w:anchor="fig:comp"/>
-      <w:r>
-        <w:rPr>
-          <w:rFonts w:asciiTheme="minorEastAsia" w:hAnsiTheme="minorEastAsia"/>
-        </w:rPr>
-        <w:t>.</w:t>
+        <w:t xml:space="preserve">Engine components.</w:t>
+      </w:r>
+      <w:r>
+        <w:rPr>
+          <w:rFonts w:asciiTheme="minorEastAsia" w:hAnsiTheme="minorEastAsia"/>
+        </w:rPr>
+        <w:t xml:space="preserve"> 연산자 집합을 전체로, 선택 정책을 균등 선택으로 고정한 최종 엔진에서 구성요소를 하나씩 제거하거나 SA acceptance와 reheating을 추가하면(&lt;Table 5&gt;, &lt;Figure 3&gt;) kick restart 제거에 따른 악화가 가장 크고 시간 제약 유무와 관계없이 유의하다. descent 제거와 무작위 초기해의 악화도 유의하지만 그 크기는 restart 제거의 약 1/9 수준이며, 무작위 초기해는 시간 제약 유무로 나누면 유의하지 않다. SA acceptance와 reheating을 추가하면 목적값이 오히려 나빠져, 조정 집합에서 정한 greedy acceptance를 시험 집합에서도 뒷받침한다.</w:t>
       </w:r>
     </w:p>
     <w:p>
@@ -20068,7 +20767,19 @@
           <w:rFonts w:asciiTheme="minorEastAsia" w:hAnsiTheme="minorEastAsia"/>
           <w:sz w:val="18"/>
         </w:rPr>
-        <w:t xml:space="preserve"> 5 replications per condition; leave-one-out, relative objective degradation when a component is removed).</w:t>
+        <w:t xml:space="preserve"> 5 replications per condition over 9 conditions; one change at a time to the final greedy-acceptance engine, relative objective degradation after the change; two-sided Wilcoxon on per-instance replication means, hence at most 45 pairs, with zero differences excluded from </w:t>
+      </w:r>
+      <m:oMath>
+        <m:r>
+          <m:t>n</m:t>
+        </m:r>
+      </m:oMath>
+      <w:r>
+        <w:rPr>
+          <w:rFonts w:asciiTheme="minorEastAsia" w:hAnsiTheme="minorEastAsia"/>
+          <w:sz w:val="18"/>
+        </w:rPr>
+        <w:t xml:space="preserve">).</w:t>
       </w:r>
     </w:p>
     <w:tbl>
@@ -20117,7 +20828,7 @@
                 <w:rFonts w:asciiTheme="minorEastAsia" w:hAnsiTheme="minorEastAsia"/>
                 <w:sz w:val="18"/>
               </w:rPr>
-              <w:t>Removed component</w:t>
+              <w:t xml:space="preserve">Change to the final engine</w:t>
             </w:r>
           </w:p>
         </w:tc>
@@ -20214,7 +20925,7 @@
                 <w:rFonts w:asciiTheme="minorEastAsia" w:hAnsiTheme="minorEastAsia"/>
                 <w:sz w:val="18"/>
               </w:rPr>
-              <w:t>best-improvement descent</w:t>
+              <w:t xml:space="preserve">remove best-improvement descent</w:t>
             </w:r>
           </w:p>
         </w:tc>
@@ -20236,7 +20947,7 @@
                 <w:rFonts w:asciiTheme="minorEastAsia" w:hAnsiTheme="minorEastAsia"/>
                 <w:sz w:val="18"/>
               </w:rPr>
-              <w:t>45</w:t>
+              <w:t xml:space="preserve">45</w:t>
             </w:r>
           </w:p>
         </w:tc>
@@ -20258,7 +20969,7 @@
                 <w:rFonts w:asciiTheme="minorEastAsia" w:hAnsiTheme="minorEastAsia"/>
                 <w:sz w:val="18"/>
               </w:rPr>
-              <w:t>+0.156</w:t>
+              <w:t xml:space="preserve">+0.041</w:t>
             </w:r>
           </w:p>
         </w:tc>
@@ -20279,7 +20990,7 @@
                 <w:rFonts w:asciiTheme="minorEastAsia" w:hAnsiTheme="minorEastAsia"/>
                 <w:sz w:val="18"/>
               </w:rPr>
-              <w:t>&lt;0.0001</w:t>
+              <w:t xml:space="preserve">0.0032</w:t>
             </w:r>
           </w:p>
         </w:tc>
@@ -20302,7 +21013,7 @@
                 <w:rFonts w:asciiTheme="minorEastAsia" w:hAnsiTheme="minorEastAsia"/>
                 <w:sz w:val="18"/>
               </w:rPr>
-              <w:t>kick restart</w:t>
+              <w:t xml:space="preserve">remove kick restart</w:t>
             </w:r>
           </w:p>
         </w:tc>
@@ -20324,7 +21035,7 @@
                 <w:rFonts w:asciiTheme="minorEastAsia" w:hAnsiTheme="minorEastAsia"/>
                 <w:sz w:val="18"/>
               </w:rPr>
-              <w:t>43</w:t>
+              <w:t xml:space="preserve">45</w:t>
             </w:r>
           </w:p>
         </w:tc>
@@ -20346,7 +21057,7 @@
                 <w:rFonts w:asciiTheme="minorEastAsia" w:hAnsiTheme="minorEastAsia"/>
                 <w:sz w:val="18"/>
               </w:rPr>
-              <w:t>+0.069</w:t>
+              <w:t xml:space="preserve">+0.365</w:t>
             </w:r>
           </w:p>
         </w:tc>
@@ -20367,7 +21078,7 @@
                 <w:rFonts w:asciiTheme="minorEastAsia" w:hAnsiTheme="minorEastAsia"/>
                 <w:sz w:val="18"/>
               </w:rPr>
-              <w:t>&lt;0.0001</w:t>
+              <w:t xml:space="preserve">&lt;0.0001</w:t>
             </w:r>
           </w:p>
         </w:tc>
@@ -20390,7 +21101,7 @@
                 <w:rFonts w:asciiTheme="minorEastAsia" w:hAnsiTheme="minorEastAsia"/>
                 <w:sz w:val="18"/>
               </w:rPr>
-              <w:t>VAA initial solution</w:t>
+              <w:t xml:space="preserve">random start instead of VAA</w:t>
             </w:r>
           </w:p>
         </w:tc>
@@ -20412,7 +21123,7 @@
                 <w:rFonts w:asciiTheme="minorEastAsia" w:hAnsiTheme="minorEastAsia"/>
                 <w:sz w:val="18"/>
               </w:rPr>
-              <w:t>45</w:t>
+              <w:t xml:space="preserve">45</w:t>
             </w:r>
           </w:p>
         </w:tc>
@@ -20434,7 +21145,7 @@
                 <w:rFonts w:asciiTheme="minorEastAsia" w:hAnsiTheme="minorEastAsia"/>
                 <w:sz w:val="18"/>
               </w:rPr>
-              <w:t>+0.022</w:t>
+              <w:t xml:space="preserve">+0.043</w:t>
             </w:r>
           </w:p>
         </w:tc>
@@ -20455,7 +21166,7 @@
                 <w:rFonts w:asciiTheme="minorEastAsia" w:hAnsiTheme="minorEastAsia"/>
                 <w:sz w:val="18"/>
               </w:rPr>
-              <w:t>0.114</w:t>
+              <w:t xml:space="preserve">0.0482</w:t>
             </w:r>
           </w:p>
         </w:tc>
@@ -20478,7 +21189,7 @@
                 <w:rFonts w:asciiTheme="minorEastAsia" w:hAnsiTheme="minorEastAsia"/>
                 <w:sz w:val="18"/>
               </w:rPr>
-              <w:t>stochastic acceptance</w:t>
+              <w:t xml:space="preserve">add SA acceptance + reheating</w:t>
             </w:r>
           </w:p>
         </w:tc>
@@ -20500,7 +21211,7 @@
                 <w:rFonts w:asciiTheme="minorEastAsia" w:hAnsiTheme="minorEastAsia"/>
                 <w:sz w:val="18"/>
               </w:rPr>
-              <w:t>45</w:t>
+              <w:t xml:space="preserve">45</w:t>
             </w:r>
           </w:p>
         </w:tc>
@@ -20519,17 +21230,10 @@
             </w:pPr>
             <w:r>
               <w:rPr>
-                <w:rFonts w:ascii="Cambria Math" w:hAnsi="Cambria Math" w:cs="Cambria Math"/>
-                <w:sz w:val="18"/>
-              </w:rPr>
-              <w:t>−</w:t>
-            </w:r>
-            <w:r>
-              <w:rPr>
-                <w:rFonts w:asciiTheme="minorEastAsia" w:hAnsiTheme="minorEastAsia"/>
-                <w:sz w:val="18"/>
-              </w:rPr>
-              <w:t>0.026</w:t>
+                <w:rFonts w:asciiTheme="minorEastAsia" w:hAnsiTheme="minorEastAsia"/>
+                <w:sz w:val="18"/>
+              </w:rPr>
+              <w:t xml:space="preserve">+0.027</w:t>
             </w:r>
           </w:p>
         </w:tc>
@@ -20550,7 +21254,7 @@
                 <w:rFonts w:asciiTheme="minorEastAsia" w:hAnsiTheme="minorEastAsia"/>
                 <w:sz w:val="18"/>
               </w:rPr>
-              <w:t>0.0014</w:t>
+              <w:t xml:space="preserve">0.0014</w:t>
             </w:r>
           </w:p>
         </w:tc>
@@ -20576,7 +21280,7 @@
         <w:lastRenderedPageBreak/>
         <w:drawing>
           <wp:inline distT="0" distB="0" distL="0" distR="0" wp14:anchorId="7E3781EF" wp14:editId="3280B5BF">
-            <wp:extent cx="5334000" cy="2617767"/>
+            <wp:extent cx="5334000" cy="2353235"/>
             <wp:effectExtent l="0" t="0" r="0" b="0"/>
             <wp:docPr id="28" name="Picture"/>
             <wp:cNvGraphicFramePr/>
@@ -20598,7 +21302,7 @@
                   <pic:spPr bwMode="auto">
                     <a:xfrm>
                       <a:off x="0" y="0"/>
-                      <a:ext cx="5334000" cy="2617767"/>
+                      <a:ext cx="5334000" cy="2353235"/>
                     </a:xfrm>
                     <a:prstGeom prst="rect">
                       <a:avLst/>
@@ -20630,7 +21334,7 @@
           <w:rFonts w:asciiTheme="minorEastAsia" w:hAnsiTheme="minorEastAsia"/>
           <w:sz w:val="18"/>
         </w:rPr>
-        <w:t>Figure 3. Objective degradation when each component is removed.</w:t>
+        <w:t xml:space="preserve">Figure 3. Objective degradation when a component is removed from, or SA acceptance is added to, the final engine.</w:t>
       </w:r>
     </w:p>
     <w:p>
@@ -20663,21 +21367,7 @@
         <w:rPr>
           <w:rFonts w:asciiTheme="minorEastAsia" w:hAnsiTheme="minorEastAsia"/>
         </w:rPr>
-        <w:t>연산자 집합과 구성요소를 전체로 고정하고 선택 정책만 바꾸면(&lt;Table 6&gt;)</w:t>
-      </w:r>
-      <w:hyperlink w:anchor="tab:sel"/>
-      <w:r>
-        <w:rPr>
-          <w:rFonts w:asciiTheme="minorEastAsia" w:hAnsiTheme="minorEastAsia"/>
-        </w:rPr>
-        <w:t>, 어떤 학습 정책도 균등 선택을 실용적으로 능가하지 못한다. 반복 횟수를 50–3,000회로 바꾸어도 결과는 같고 우열의 방향이 반복 횟수에 따라 뒤집히며(&lt;Figure 5&gt;)</w:t>
-      </w:r>
-      <w:hyperlink w:anchor="fig:sel"/>
-      <w:r>
-        <w:rPr>
-          <w:rFonts w:asciiTheme="minorEastAsia" w:hAnsiTheme="minorEastAsia"/>
-        </w:rPr>
-        <w:t>, 이러한 부정적 결과는 무제약 조건만으로도 성립하므로 시간 제약 확장 때문에 나타난 결과가 아니다.</w:t>
+        <w:t xml:space="preserve">연산자 집합과 구성요소를 전체로 고정하고 선택 정책만 바꾸면(&lt;Table 6&gt;), 어떤 학습 정책도 균등 선택보다 좋지 않다. tabular Q-learning은 균등 선택보다 평균 0.038%p, transfer DQN은 0.101%p 나쁘며 둘 다 유의하다. 반복 횟수를 50–3,000회로 바꾸어도 모든 반복 횟수에서 균등 선택의 격차가 가장 작고, 3,000회에서만 tabular가 균등 선택에 근접한다(0.13% 대 0.12%, &lt;Figure 5&gt;). 이러한 결과는 무제약 조건만으로도 성립하므로(균등 선택 대비 tabular −0.049%p, p=0.0002; DQN −0.041%p, p=0.002) 시간 제약 확장 때문에 나타난 결과가 아니다.</w:t>
       </w:r>
     </w:p>
     <w:p>
@@ -20694,7 +21384,7 @@
           <w:rFonts w:asciiTheme="minorEastAsia" w:hAnsiTheme="minorEastAsia"/>
           <w:sz w:val="18"/>
         </w:rPr>
-        <w:t xml:space="preserve">Table 6. Effect of the selection policy (5 instances </w:t>
+        <w:t xml:space="preserve">Table 6. Effect of the selection policy (20 instances </w:t>
       </w:r>
       <m:oMath>
         <m:r>
@@ -20709,7 +21399,19 @@
           <w:rFonts w:asciiTheme="minorEastAsia" w:hAnsiTheme="minorEastAsia"/>
           <w:sz w:val="18"/>
         </w:rPr>
-        <w:t xml:space="preserve"> 5 replications per condition, 1,000 iterations; two-sided Wilcoxon, positive mean favors the first method).</w:t>
+        <w:t xml:space="preserve"> 5 replications per condition over 9 conditions, 1,000 iterations; two-sided Wilcoxon on per-instance replication means, hence at most 180 pairs, with zero differences excluded from </w:t>
+      </w:r>
+      <m:oMath>
+        <m:r>
+          <m:t>n</m:t>
+        </m:r>
+      </m:oMath>
+      <w:r>
+        <w:rPr>
+          <w:rFonts w:asciiTheme="minorEastAsia" w:hAnsiTheme="minorEastAsia"/>
+          <w:sz w:val="18"/>
+        </w:rPr>
+        <w:t xml:space="preserve">; positive mean favors the first method).</w:t>
       </w:r>
     </w:p>
     <w:tbl>
@@ -20728,7 +21430,8 @@
         <w:tblLook w:val="0020" w:firstRow="1" w:lastRow="0" w:firstColumn="0" w:lastColumn="0" w:noHBand="0" w:noVBand="0"/>
       </w:tblPr>
       <w:tblGrid>
-        <w:gridCol w:w="3744"/>
+        <w:gridCol w:w="3044"/>
+        <w:gridCol w:w="700"/>
         <w:gridCol w:w="1008"/>
         <w:gridCol w:w="1584"/>
         <w:gridCol w:w="1440"/>
@@ -20740,7 +21443,7 @@
         </w:trPr>
         <w:tc>
           <w:tcPr>
-            <w:tcW w:w="3744" w:type="dxa"/>
+            <w:tcW w:w="3044" w:type="dxa"/>
             <w:tcBorders>
               <w:bottom w:val="single" w:sz="6" w:space="0" w:color="000000"/>
             </w:tcBorders>
@@ -20758,7 +21461,32 @@
                 <w:rFonts w:asciiTheme="minorEastAsia" w:hAnsiTheme="minorEastAsia"/>
                 <w:sz w:val="18"/>
               </w:rPr>
-              <w:t>Comparison</w:t>
+              <w:t xml:space="preserve">Comparison</w:t>
+            </w:r>
+          </w:p>
+        </w:tc>
+        <w:tc>
+          <w:tcPr>
+            <w:tcW w:w="700" w:type="dxa"/>
+            <w:tcBorders>
+              <w:bottom w:val="single" w:sz="6" w:space="0" w:color="000000"/>
+            </w:tcBorders>
+          </w:tcPr>
+          <w:p>
+            <w:pPr>
+              <w:pStyle w:val="Compact"/>
+              <w:spacing w:after="0"/>
+              <w:jc w:val="right"/>
+              <w:rPr>
+                <w:rFonts w:asciiTheme="minorEastAsia" w:hAnsiTheme="minorEastAsia"/>
+              </w:rPr>
+            </w:pPr>
+            <w:r>
+              <w:rPr>
+                <w:rFonts w:asciiTheme="minorEastAsia" w:hAnsiTheme="minorEastAsia"/>
+                <w:sz w:val="18"/>
+              </w:rPr>
+              <w:t xml:space="preserve">n</w:t>
             </w:r>
           </w:p>
         </w:tc>
@@ -20783,7 +21511,7 @@
                 <w:rFonts w:asciiTheme="minorEastAsia" w:hAnsiTheme="minorEastAsia"/>
                 <w:sz w:val="18"/>
               </w:rPr>
-              <w:t>Mean diff.(%p)</w:t>
+              <w:t xml:space="preserve">Mean diff.(%p)</w:t>
             </w:r>
           </w:p>
         </w:tc>
@@ -20808,7 +21536,7 @@
                 <w:rFonts w:asciiTheme="minorEastAsia" w:hAnsiTheme="minorEastAsia"/>
                 <w:sz w:val="18"/>
               </w:rPr>
-              <w:t>p</w:t>
+              <w:t xml:space="preserve">p</w:t>
             </w:r>
           </w:p>
         </w:tc>
@@ -20832,7 +21560,7 @@
                 <w:rFonts w:asciiTheme="minorEastAsia" w:hAnsiTheme="minorEastAsia"/>
                 <w:sz w:val="18"/>
               </w:rPr>
-              <w:t>Verdict</w:t>
+              <w:t xml:space="preserve">Verdict</w:t>
             </w:r>
           </w:p>
         </w:tc>
@@ -20840,22 +21568,44 @@
       <w:tr>
         <w:tc>
           <w:tcPr>
-            <w:tcW w:w="3744" w:type="dxa"/>
-          </w:tcPr>
-          <w:p>
-            <w:pPr>
-              <w:pStyle w:val="Compact"/>
-              <w:spacing w:after="0"/>
-              <w:rPr>
-                <w:rFonts w:asciiTheme="minorEastAsia" w:hAnsiTheme="minorEastAsia"/>
-              </w:rPr>
-            </w:pPr>
-            <w:r>
-              <w:rPr>
-                <w:rFonts w:asciiTheme="minorEastAsia" w:hAnsiTheme="minorEastAsia"/>
-                <w:sz w:val="18"/>
-              </w:rPr>
-              <w:t>tabular vs uniform</w:t>
+            <w:tcW w:w="3044" w:type="dxa"/>
+          </w:tcPr>
+          <w:p>
+            <w:pPr>
+              <w:pStyle w:val="Compact"/>
+              <w:spacing w:after="0"/>
+              <w:rPr>
+                <w:rFonts w:asciiTheme="minorEastAsia" w:hAnsiTheme="minorEastAsia"/>
+              </w:rPr>
+            </w:pPr>
+            <w:r>
+              <w:rPr>
+                <w:rFonts w:asciiTheme="minorEastAsia" w:hAnsiTheme="minorEastAsia"/>
+                <w:sz w:val="18"/>
+              </w:rPr>
+              <w:t xml:space="preserve">tabular vs uniform</w:t>
+            </w:r>
+          </w:p>
+        </w:tc>
+        <w:tc>
+          <w:tcPr>
+            <w:tcW w:w="700" w:type="dxa"/>
+          </w:tcPr>
+          <w:p>
+            <w:pPr>
+              <w:pStyle w:val="Compact"/>
+              <w:spacing w:after="0"/>
+              <w:jc w:val="right"/>
+              <w:rPr>
+                <w:rFonts w:asciiTheme="minorEastAsia" w:hAnsiTheme="minorEastAsia"/>
+              </w:rPr>
+            </w:pPr>
+            <w:r>
+              <w:rPr>
+                <w:rFonts w:asciiTheme="minorEastAsia" w:hAnsiTheme="minorEastAsia"/>
+                <w:sz w:val="18"/>
+              </w:rPr>
+              <w:t xml:space="preserve">180</w:t>
             </w:r>
           </w:p>
         </w:tc>
@@ -20874,17 +21624,10 @@
             </w:pPr>
             <w:r>
               <w:rPr>
-                <w:rFonts w:ascii="Cambria Math" w:hAnsi="Cambria Math" w:cs="Cambria Math"/>
-                <w:sz w:val="18"/>
-              </w:rPr>
-              <w:t>−</w:t>
-            </w:r>
-            <w:r>
-              <w:rPr>
-                <w:rFonts w:asciiTheme="minorEastAsia" w:hAnsiTheme="minorEastAsia"/>
-                <w:sz w:val="18"/>
-              </w:rPr>
-              <w:t>0.01</w:t>
+                <w:rFonts w:asciiTheme="minorEastAsia" w:hAnsiTheme="minorEastAsia"/>
+                <w:sz w:val="18"/>
+              </w:rPr>
+              <w:t xml:space="preserve">−0.038</w:t>
             </w:r>
           </w:p>
         </w:tc>
@@ -20906,7 +21649,7 @@
                 <w:rFonts w:asciiTheme="minorEastAsia" w:hAnsiTheme="minorEastAsia"/>
                 <w:sz w:val="18"/>
               </w:rPr>
-              <w:t>0.150</w:t>
+              <w:t xml:space="preserve">&lt;0.0001</w:t>
             </w:r>
           </w:p>
         </w:tc>
@@ -20927,7 +21670,7 @@
                 <w:rFonts w:asciiTheme="minorEastAsia" w:hAnsiTheme="minorEastAsia"/>
                 <w:sz w:val="18"/>
               </w:rPr>
-              <w:t>No difference</w:t>
+              <w:t xml:space="preserve">Tabular worse</w:t>
             </w:r>
           </w:p>
         </w:tc>
@@ -20935,22 +21678,44 @@
       <w:tr>
         <w:tc>
           <w:tcPr>
-            <w:tcW w:w="3744" w:type="dxa"/>
-          </w:tcPr>
-          <w:p>
-            <w:pPr>
-              <w:pStyle w:val="Compact"/>
-              <w:spacing w:after="0"/>
-              <w:rPr>
-                <w:rFonts w:asciiTheme="minorEastAsia" w:hAnsiTheme="minorEastAsia"/>
-              </w:rPr>
-            </w:pPr>
-            <w:r>
-              <w:rPr>
-                <w:rFonts w:asciiTheme="minorEastAsia" w:hAnsiTheme="minorEastAsia"/>
-                <w:sz w:val="18"/>
-              </w:rPr>
-              <w:t>tabular vs DQN</w:t>
+            <w:tcW w:w="3044" w:type="dxa"/>
+          </w:tcPr>
+          <w:p>
+            <w:pPr>
+              <w:pStyle w:val="Compact"/>
+              <w:spacing w:after="0"/>
+              <w:rPr>
+                <w:rFonts w:asciiTheme="minorEastAsia" w:hAnsiTheme="minorEastAsia"/>
+              </w:rPr>
+            </w:pPr>
+            <w:r>
+              <w:rPr>
+                <w:rFonts w:asciiTheme="minorEastAsia" w:hAnsiTheme="minorEastAsia"/>
+                <w:sz w:val="18"/>
+              </w:rPr>
+              <w:t xml:space="preserve">tabular vs DQN</w:t>
+            </w:r>
+          </w:p>
+        </w:tc>
+        <w:tc>
+          <w:tcPr>
+            <w:tcW w:w="700" w:type="dxa"/>
+          </w:tcPr>
+          <w:p>
+            <w:pPr>
+              <w:pStyle w:val="Compact"/>
+              <w:spacing w:after="0"/>
+              <w:jc w:val="right"/>
+              <w:rPr>
+                <w:rFonts w:asciiTheme="minorEastAsia" w:hAnsiTheme="minorEastAsia"/>
+              </w:rPr>
+            </w:pPr>
+            <w:r>
+              <w:rPr>
+                <w:rFonts w:asciiTheme="minorEastAsia" w:hAnsiTheme="minorEastAsia"/>
+                <w:sz w:val="18"/>
+              </w:rPr>
+              <w:t xml:space="preserve">180</w:t>
             </w:r>
           </w:p>
         </w:tc>
@@ -20972,7 +21737,7 @@
                 <w:rFonts w:asciiTheme="minorEastAsia" w:hAnsiTheme="minorEastAsia"/>
                 <w:sz w:val="18"/>
               </w:rPr>
-              <w:t>+0.10</w:t>
+              <w:t xml:space="preserve">+0.063</w:t>
             </w:r>
           </w:p>
         </w:tc>
@@ -20994,7 +21759,7 @@
                 <w:rFonts w:asciiTheme="minorEastAsia" w:hAnsiTheme="minorEastAsia"/>
                 <w:sz w:val="18"/>
               </w:rPr>
-              <w:t>&lt;0.0001</w:t>
+              <w:t xml:space="preserve">&lt;0.0001</w:t>
             </w:r>
           </w:p>
         </w:tc>
@@ -21015,7 +21780,7 @@
                 <w:rFonts w:asciiTheme="minorEastAsia" w:hAnsiTheme="minorEastAsia"/>
                 <w:sz w:val="18"/>
               </w:rPr>
-              <w:t>DQN worse</w:t>
+              <w:t xml:space="preserve">DQN worse</w:t>
             </w:r>
           </w:p>
         </w:tc>
@@ -21023,22 +21788,44 @@
       <w:tr>
         <w:tc>
           <w:tcPr>
-            <w:tcW w:w="3744" w:type="dxa"/>
-          </w:tcPr>
-          <w:p>
-            <w:pPr>
-              <w:pStyle w:val="Compact"/>
-              <w:spacing w:after="0"/>
-              <w:rPr>
-                <w:rFonts w:asciiTheme="minorEastAsia" w:hAnsiTheme="minorEastAsia"/>
-              </w:rPr>
-            </w:pPr>
-            <w:r>
-              <w:rPr>
-                <w:rFonts w:asciiTheme="minorEastAsia" w:hAnsiTheme="minorEastAsia"/>
-                <w:sz w:val="18"/>
-              </w:rPr>
-              <w:t>uniform vs DQN</w:t>
+            <w:tcW w:w="3044" w:type="dxa"/>
+          </w:tcPr>
+          <w:p>
+            <w:pPr>
+              <w:pStyle w:val="Compact"/>
+              <w:spacing w:after="0"/>
+              <w:rPr>
+                <w:rFonts w:asciiTheme="minorEastAsia" w:hAnsiTheme="minorEastAsia"/>
+              </w:rPr>
+            </w:pPr>
+            <w:r>
+              <w:rPr>
+                <w:rFonts w:asciiTheme="minorEastAsia" w:hAnsiTheme="minorEastAsia"/>
+                <w:sz w:val="18"/>
+              </w:rPr>
+              <w:t xml:space="preserve">uniform vs DQN</w:t>
+            </w:r>
+          </w:p>
+        </w:tc>
+        <w:tc>
+          <w:tcPr>
+            <w:tcW w:w="700" w:type="dxa"/>
+          </w:tcPr>
+          <w:p>
+            <w:pPr>
+              <w:pStyle w:val="Compact"/>
+              <w:spacing w:after="0"/>
+              <w:jc w:val="right"/>
+              <w:rPr>
+                <w:rFonts w:asciiTheme="minorEastAsia" w:hAnsiTheme="minorEastAsia"/>
+              </w:rPr>
+            </w:pPr>
+            <w:r>
+              <w:rPr>
+                <w:rFonts w:asciiTheme="minorEastAsia" w:hAnsiTheme="minorEastAsia"/>
+                <w:sz w:val="18"/>
+              </w:rPr>
+              <w:t xml:space="preserve">179</w:t>
             </w:r>
           </w:p>
         </w:tc>
@@ -21060,7 +21847,7 @@
                 <w:rFonts w:asciiTheme="minorEastAsia" w:hAnsiTheme="minorEastAsia"/>
                 <w:sz w:val="18"/>
               </w:rPr>
-              <w:t>+0.11</w:t>
+              <w:t xml:space="preserve">+0.101</w:t>
             </w:r>
           </w:p>
         </w:tc>
@@ -21082,7 +21869,7 @@
                 <w:rFonts w:asciiTheme="minorEastAsia" w:hAnsiTheme="minorEastAsia"/>
                 <w:sz w:val="18"/>
               </w:rPr>
-              <w:t>&lt;0.0001</w:t>
+              <w:t xml:space="preserve">&lt;0.0001</w:t>
             </w:r>
           </w:p>
         </w:tc>
@@ -21103,7 +21890,7 @@
                 <w:rFonts w:asciiTheme="minorEastAsia" w:hAnsiTheme="minorEastAsia"/>
                 <w:sz w:val="18"/>
               </w:rPr>
-              <w:t>DQN worse</w:t>
+              <w:t xml:space="preserve">DQN worse</w:t>
             </w:r>
           </w:p>
         </w:tc>
@@ -21317,7 +22104,7 @@
         <w:rPr>
           <w:rFonts w:asciiTheme="minorEastAsia" w:hAnsiTheme="minorEastAsia"/>
         </w:rPr>
-        <w:t xml:space="preserve"> 사이에서 일어나고 이후에는 그 폭이 줄어든다. 전체 탐색 구간에서 평균 총 작업완료시간은 약 1% 상승, 평균 납기지연은 2–3% 하락한다. </w:t>
+        <w:t xml:space="preserve"> 사이에서 일어나고 이후에는 그 폭이 줄어든다. 전체 탐색 구간에서 규모별 평균 총 작업완료시간은 0.6–1.4% 상승하고 평균 납기지연은 0.9–3.1% 하락한다. </w:t>
       </w:r>
       <m:oMath>
         <m:r>
@@ -21346,7 +22133,93 @@
         <w:rPr>
           <w:rFonts w:asciiTheme="minorEastAsia" w:hAnsiTheme="minorEastAsia"/>
         </w:rPr>
-        <w:t>을 채택한다: 완만한 총 작업완료시간 비용으로 납기지연이 거의 최소에 이르고 두 시간 성분에 동일 가중을 준다. 이 탐색은 시험이 아닌 조정 인스턴스를 사용한 설계 정당화이다.</w:t>
+        <w:t xml:space="preserve">을 채택한다: 완만한 총 작업완료시간 비용으로 납기지연이 </w:t>
+      </w:r>
+      <w:r>
+        <w:rPr>
+          <w:rFonts w:asciiTheme="minorEastAsia" w:hAnsiTheme="minorEastAsia"/>
+        </w:rPr>
+        <w:t xml:space="preserve">거의 최소에 이르며, 총 작업완료시간과 납기지연에 단위 시간당 동일한 벌점 계수를 부여한다. 다만 </w:t>
+      </w:r>
+      <m:oMath>
+        <m:sSub>
+          <m:e>
+            <m:r>
+              <m:t>C</m:t>
+            </m:r>
+          </m:e>
+          <m:sub>
+            <m:r>
+              <m:rPr>
+                <m:sty m:val="p"/>
+              </m:rPr>
+              <m:t>max</m:t>
+            </m:r>
+          </m:sub>
+        </m:sSub>
+      </m:oMath>
+      <w:r>
+        <w:rPr>
+          <w:rFonts w:asciiTheme="minorEastAsia" w:hAnsiTheme="minorEastAsia"/>
+        </w:rPr>
+        <w:t xml:space="preserve">는 단일 최댓값이고 </w:t>
+      </w:r>
+      <m:oMath>
+        <m:nary>
+          <m:naryPr>
+            <m:chr m:val="∑"/>
+            <m:limLoc m:val="undOvr"/>
+            <m:subHide m:val="off"/>
+            <m:supHide m:val="on"/>
+          </m:naryPr>
+          <m:sub>
+            <m:r>
+              <m:t>q</m:t>
+            </m:r>
+          </m:sub>
+          <m:sup>
+            <m:r>
+              <m:t>​</m:t>
+            </m:r>
+          </m:sup>
+          <m:e>
+            <m:sSub>
+              <m:e>
+                <m:r>
+                  <m:t>T</m:t>
+                </m:r>
+              </m:e>
+              <m:sub>
+                <m:r>
+                  <m:t>q</m:t>
+                </m:r>
+              </m:sub>
+            </m:sSub>
+          </m:e>
+        </m:nary>
+      </m:oMath>
+      <w:r>
+        <w:rPr>
+          <w:rFonts w:asciiTheme="minorEastAsia" w:hAnsiTheme="minorEastAsia"/>
+        </w:rPr>
+        <w:t xml:space="preserve">는 여러 트럭의 합이므로 계수가 같다고 두 성분이 목적식에 미치는 실질적 영향까지 같은 것은 아니다. </w:t>
+      </w:r>
+      <m:oMath>
+        <m:r>
+          <m:t>λ</m:t>
+        </m:r>
+      </m:oMath>
+      <w:r>
+        <w:rPr>
+          <w:rFonts w:asciiTheme="minorEastAsia" w:hAnsiTheme="minorEastAsia"/>
+        </w:rPr>
+        <w:t xml:space="preserve">는 운영자가 작업완료시간 대비 납기 준수를 얼마나 중시하는지를 나타내는 관리적 선호(managerial preference) 파라미터이며, 실제 적용에서는 운영 여건에 맞게 조정할 수 있다. </w:t>
+      </w:r>
+      <w:r>
+        <w:rPr>
+          <w:rFonts w:asciiTheme="minorEastAsia" w:hAnsiTheme="minorEastAsia"/>
+        </w:rPr>
+        <w:t xml:space="preserve">이 탐색은 시험이 아닌 조정 인스턴스를 사용한 설계 정당화이다.</w:t>
       </w:r>
     </w:p>
     <w:p>
@@ -21368,7 +22241,7 @@
         <w:lastRenderedPageBreak/>
         <w:drawing>
           <wp:inline distT="0" distB="0" distL="0" distR="0" wp14:anchorId="0EC9270C" wp14:editId="55EBB5D9">
-            <wp:extent cx="3840480" cy="2668222"/>
+            <wp:extent cx="3840480" cy="2743200"/>
             <wp:effectExtent l="0" t="0" r="0" b="0"/>
             <wp:docPr id="35" name="Picture"/>
             <wp:cNvGraphicFramePr/>
@@ -21390,7 +22263,7 @@
                   <pic:spPr bwMode="auto">
                     <a:xfrm>
                       <a:off x="0" y="0"/>
-                      <a:ext cx="3840480" cy="2820298"/>
+                      <a:ext cx="3840480" cy="2743200"/>
                     </a:xfrm>
                     <a:prstGeom prst="rect">
                       <a:avLst/>
@@ -21470,7 +22343,7 @@
         <w:rPr>
           <w:rFonts w:asciiTheme="minorEastAsia" w:hAnsiTheme="minorEastAsia"/>
         </w:rPr>
-        <w:t>s밖에 들지 않아 연산자를 잘 고르는 것보다 많이 시도하는 편이 유리하고, 모든 신규 최선해 뒤에 결정론적 descent가 따라붙어 어떤 연산자로 그 지점에 이르렀는지의 차이를 상당 부분 흡수한다. 반복 횟수별 격차 곡선도 대부분의 시험 인스턴스에서 해 품질이 1,000회 이전에 평탄해짐을 보인다. SA acceptance와 reheating은 원 모델과 비교할 수 있도록 유지하였으나, ablation은 본 설정에서 이 둘이 해 품질에 필수적이지 않음을 보인다.</w:t>
+        <w:t xml:space="preserve">s밖에 들지 않아 연산자를 잘 고르는 것보다 많이 시도하는 편이 유리하고, 모든 신규 최선해 뒤에 결정론적 descent가 따라붙어 어떤 연산자로 그 지점에 이르렀는지의 차이를 상당 부분 흡수한다. 반복 횟수별 격차 곡선도 1,000회 이후의 추가 개선이 작음을 보인다(조건당 5개 인스턴스에서 균등 선택의 격차는 1,000회 0.22%, 3,000회 0.12%이고, 45개 인스턴스 중 33개에서 개선 폭이 0.1%p 미만이다). 정체 탈출은 kick restart가 맡으므로 SA acceptance와 reheating의 역할은 이와 겹치며, 조정 집합 비교와 시험 집합 ablation에서 이 둘이 해 품질을 높이지 않아 최종 VAA-GILS에서 제외하였다(4장, &lt;Table 5&gt;). 즉 본 문제에서 성능의 본질은 학습된 선택 정책이나 확률적 acceptance가 아니라 kick restart, bottleneck-guided 연산자, 결정론적 descent에 있다.</w:t>
       </w:r>
     </w:p>
     <w:p>
@@ -21518,14 +22391,7 @@
         <w:rPr>
           <w:rFonts w:asciiTheme="minorEastAsia" w:hAnsiTheme="minorEastAsia"/>
         </w:rPr>
-        <w:t xml:space="preserve">본 연구는 부분 하역 병행 트럭 스케줄링에 도착 시각과 연성 납기를 도입하고, MILP·CP-SAT 정식화와 유효 하한으로 휴리스틱 해를 검증하였다. CP-SAT 기준해가 있는 실험 조건에서 VAA-GILS의 목적값은 해당 기준해 대비 평균 0.11–0.21%였고(소형 무제약 조건에서는 CP-SAT가 최적성을 증명하였다), 대형 시간 제약 조건에서는 수 초 안에 비교 방법 가운데 가장 좋은 해를 제공하였다. ablation은 성능이 best-improvement descent, guided 이동, restart라는 결정론적 구조에서 비롯되며, 학습 기반 연산자 선택·학습된 초기해·확률적 acceptance는 이 환경에서 실용적 이득을 주지 않음을 </w:t>
-      </w:r>
-      <w:r>
-        <w:rPr>
-          <w:rFonts w:asciiTheme="minorEastAsia" w:hAnsiTheme="minorEastAsia"/>
-        </w:rPr>
-        <w:lastRenderedPageBreak/>
-        <w:t>보였다. 향후에는 도착 정보가 실시간으로 공개되는 동적 문제, 대형 시간 제약 조건을 위한 더 강한 하한, 산업 데이터를 활용한 사례 연구가 필요하다.</w:t>
+        <w:t xml:space="preserve">본 연구는 부분 하역 병행 트럭 스케줄링에 도착 시각과 연성 납기를 도입하고, MILP·CP-SAT 정식화와 유효 하한으로 휴리스틱 해를 검증하였다. CP-SAT 기준해가 있는 실험 조건에서 VAA-GILS의 목적값은 해당 기준해 대비 평균 0.06–0.25%였고(소형 무제약 조건에서는 CP-SAT가 최적성을 증명하였다), CP-SAT가 600초 안에 실행 가능해를 찾지 못한 대형 시간 제약 조건에서도 약 3초 안에 VAA와 Extended SA-RL5보다 좋은 해를 제공하였다. ablation은 성능이 kick restart, guided 이동, best-improvement descent라는 결정론적 구조에서 비롯되며, 학습 기반 연산자 선택과 확률적 acceptance는 이 환경에서 실용적 이득을 주지 않아 최종 알고리즘은 greedy acceptance를 사용한다. 향후에는 도착 정보가 실시간으로 공개되는 동적 문제, 대형 시간 제약 조건을 위한 더 강한 하한, 산업 데이터를 활용한 사례 연구가 필요하다.</w:t>
       </w:r>
     </w:p>
     <w:p>
@@ -21669,13 +22535,13 @@
           <w:i/>
           <w:iCs/>
         </w:rPr>
-        <w:t>train</w:t>
-      </w:r>
-      <w:r>
-        <w:rPr>
-          <w:rFonts w:asciiTheme="minorEastAsia" w:hAnsiTheme="minorEastAsia"/>
-        </w:rPr>
-        <w:t xml:space="preserve"> 집합(S/M 규모, 모든 화물 분포·시간 제약 조건)에서 500회 실행으로 오프라인 학습(</w:t>
+        <w:t xml:space="preserve">학습 집합</w:t>
+      </w:r>
+      <w:r>
+        <w:rPr>
+          <w:rFonts w:asciiTheme="minorEastAsia" w:hAnsiTheme="minorEastAsia"/>
+        </w:rPr>
+        <w:t xml:space="preserve">(S/M 규모, 모든 화물 분포·시간 제약 조건)에서 500회 실행으로 오프라인 학습(</w:t>
       </w:r>
       <m:oMath>
         <m:r>
@@ -21697,13 +22563,13 @@
           <w:i/>
           <w:iCs/>
         </w:rPr>
-        <w:t>test</w:t>
-      </w:r>
-      <w:r>
-        <w:rPr>
-          <w:rFonts w:asciiTheme="minorEastAsia" w:hAnsiTheme="minorEastAsia"/>
-        </w:rPr>
-        <w:t xml:space="preserve"> 인스턴스에 zero-shot (</w:t>
+        <w:t xml:space="preserve">시험 인스턴스</w:t>
+      </w:r>
+      <w:r>
+        <w:rPr>
+          <w:rFonts w:asciiTheme="minorEastAsia" w:hAnsiTheme="minorEastAsia"/>
+        </w:rPr>
+        <w:t xml:space="preserve">에 zero-shot (</w:t>
       </w:r>
       <m:oMath>
         <m:r>
@@ -21753,7 +22619,7 @@
         </w:rPr>
         <w:drawing>
           <wp:inline distT="0" distB="0" distL="0" distR="0" wp14:anchorId="4EAC3267" wp14:editId="3F167AD3">
-            <wp:extent cx="3840480" cy="2820298"/>
+            <wp:extent cx="3840480" cy="2606040"/>
             <wp:effectExtent l="0" t="0" r="0" b="0"/>
             <wp:docPr id="43" name="Picture"/>
             <wp:cNvGraphicFramePr/>
@@ -21775,7 +22641,7 @@
                   <pic:spPr bwMode="auto">
                     <a:xfrm>
                       <a:off x="0" y="0"/>
-                      <a:ext cx="3840480" cy="2820298"/>
+                      <a:ext cx="3840480" cy="2606040"/>
                     </a:xfrm>
                     <a:prstGeom prst="rect">
                       <a:avLst/>
@@ -21840,7 +22706,7 @@
         <w:rPr>
           <w:rFonts w:asciiTheme="minorEastAsia" w:hAnsiTheme="minorEastAsia"/>
         </w:rPr>
-        <w:t>본 논문의 작성 과정에서 저자는 OpenAI Codex(GPT-5, OpenAI)와 Claude Code(Anthropic)를 본문의 맞춤법 및 가독성 개선을 위해 사용하였다. 저자는 해당 도구 사용 후 그 내용을 검토 및 수정하였으며, 논문의 모든 내용에 대한 책임은 저자에게 있다.</w:t>
+        <w:t xml:space="preserve">본 논문의 연구 및 작성 과정에서 저자는 OpenAI Codex(GPT-5, OpenAI)와 Claude Code(Anthropic)를 코드 작성 및 디버깅 보조와 논문의 문장 표현 및 가독성 개선을 위해 활용하였다. 생성형 AI의 도움을 받은 내용은 저자가 검토 및 수정하였으며, 논문의 모든 내용과 결과에 대한 책임은 저자에게 있다.</w:t>
       </w:r>
     </w:p>
     <w:p>

</xml_diff>

<commit_message>
feat: 용례 확인 #6
</commit_message>
<xml_diff>
--- a/paper/jkiie_submit_body.docx
+++ b/paper/jkiie_submit_body.docx
@@ -17,7 +17,7 @@
         <w:spacing w:line="300" w:lineRule="exact"/>
       </w:pPr>
       <w:r>
-        <w:t xml:space="preserve">We study truck scheduling in a multi-door cross-dock where a compound truck is partially unloaded and then departs as an outbound carrier. Existing models assume all trucks are available at time zero and minimize makespan only. We extend the problem with per-truck release times and soft due dates (violable at a tardiness cost), minimizing makespan plus total tardiness, and formulate it as a mixed-integer program and a CP-SAT model under a reproducible seed protocol. VAA-GILS is an iterated local search combining Vogel-style construction, best-improvement descent, bottleneck-guided operators, kick restarts, and greedy acceptance. Where CP-SAT provides a reference solution, VAA-GILS is within 0.06–0.25% of that reference while requiring substantially less computation time (under 0.5 versus 76–606 seconds); where optimality was proven, it averages 0.23% above the optimum. Where CP-SAT finds no feasible schedule within 600 seconds, it returns the best solutions observed. Ablation attributes the gain to this deterministic structure, not to learned operator selection or stochastic acceptance.</w:t>
+        <w:t xml:space="preserve">We study truck scheduling in a multi-door cross-dock where a compound truck is partially unloaded and then departs as an outbound carrier. Existing models assume all trucks are available at time zero and minimize makespan only. We extend the problem with per-truck release times and soft due dates (violable at a tardiness cost), minimizing makespan plus total tardiness, and formulate it as a mixed-integer program and a CP-SAT model under a reproducible seed protocol. VAA-GILS is an iterated local search combining Vogel-style construction, best-improvement descent, bottleneck-guided operators, kick restarts, and greedy acceptance. Where CP-SAT provides a reference solution, VAA-GILS is within 0.06–0.25% of that reference while requiring substantially less computation time (under 0.5 versus 76–606 seconds); where optimality was proven, it averages 0.23% above the optimum. Where CP-SAT finds no feasible schedule within 600 seconds, VAA-GILS returns the best solutions observed among the compared methods. Ablation attributes the gain to this deterministic structure, not to learned operator selection or stochastic acceptance.</w:t>
       </w:r>
     </w:p>
     <w:p>
@@ -276,87 +276,6 @@
         <w:br/>
         <w:t xml:space="preserve">Compound-Truck Cross-Docking Scheduling with Release Times and Soft Due Dates: A Bottleneck-Guided Iterated Local Search with CP-SAT Benchmarking</w:t>
       </w:r>
-      <w:r>
-        <w:br/>
-      </w:r>
-      <w:r>
-        <w:t>이곳에</w:t>
-      </w:r>
-      <w:r>
-        <w:t xml:space="preserve"> </w:t>
-      </w:r>
-      <w:r>
-        <w:t>저자명</w:t>
-      </w:r>
-      <w:r>
-        <w:t xml:space="preserve"> </w:t>
-      </w:r>
-      <w:r>
-        <w:t>및</w:t>
-      </w:r>
-      <w:r>
-        <w:t xml:space="preserve"> </w:t>
-      </w:r>
-      <w:r>
-        <w:t>소속을</w:t>
-      </w:r>
-      <w:r>
-        <w:t xml:space="preserve"> </w:t>
-      </w:r>
-      <w:r>
-        <w:t>넣지</w:t>
-      </w:r>
-      <w:r>
-        <w:t xml:space="preserve"> </w:t>
-      </w:r>
-      <w:r>
-        <w:t>마십시오</w:t>
-      </w:r>
-      <w:r>
-        <w:t xml:space="preserve">. </w:t>
-      </w:r>
-      <w:r>
-        <w:t>심사</w:t>
-      </w:r>
-      <w:r>
-        <w:t xml:space="preserve"> </w:t>
-      </w:r>
-      <w:r>
-        <w:t>완료</w:t>
-      </w:r>
-      <w:r>
-        <w:t xml:space="preserve"> </w:t>
-      </w:r>
-      <w:r>
-        <w:t>후</w:t>
-      </w:r>
-      <w:r>
-        <w:t xml:space="preserve"> </w:t>
-      </w:r>
-      <w:r>
-        <w:t>최종본</w:t>
-      </w:r>
-      <w:r>
-        <w:t xml:space="preserve"> </w:t>
-      </w:r>
-      <w:r>
-        <w:t>작성</w:t>
-      </w:r>
-      <w:r>
-        <w:t xml:space="preserve"> </w:t>
-      </w:r>
-      <w:r>
-        <w:t>시</w:t>
-      </w:r>
-      <w:r>
-        <w:t xml:space="preserve"> </w:t>
-      </w:r>
-      <w:r>
-        <w:t>추가</w:t>
-      </w:r>
-      <w:r>
-        <w:t>.</w:t>
-      </w:r>
     </w:p>
     <w:p>
       <w:pPr>
@@ -593,7 +512,7 @@
         <w:rPr>
           <w:rFonts w:asciiTheme="minorEastAsia" w:hAnsiTheme="minorEastAsia"/>
         </w:rPr>
-        <w:t xml:space="preserve"> Boysen과 Fliedner(2010)는 도크 스케줄링 문제를 분류하였고, Van Belle 등(2012)은 분야를 조망하였다. 여러 결정론적 모형이 기존 입고·출고트럭에 대해 시간 제약을 이미 반영한다. Van Belle 등(2013)은 다중 도어·time window· 납기지연을, Assadi와 Bagheri(2016)는 ready time과 outbound 조기완료와 납기지연(earliness/납기지연)을, Bodnar 등(2017)은 time window와 mixed-service door를 다룬다. Molavi 등(2018)은 경성 납기(hard due date)를, Rijal 등(2019)은 truck scheduling과 door assignment의 통합을 다룬다. 이들은 release/due date가 새롭지 않음을 보이나, 입고·출고트럭을 구분하며 부분 하역 후 출고 운송 트럭으로 전환되는 트럭을 모형화하지 않는다.</w:t>
+        <w:t xml:space="preserve"> Boysen과 Fliedner(2010)는 도크 스케줄링 문제를 분류하였고, Van Belle 등(2012)은 분야를 조망하였다. 여러 결정론적 모형이 기존 입고·출고트럭에 대해 시간 제약을 이미 반영한다. Van Belle 등(2013)은 다중 도어·time window· 납기지연을, Assadi와 Bagheri(2016)는 ready time과 outbound 조기완료와 납기지연(earliness/납기지연)을, Bodnar 등(2017)은 time window와 mixed-service door를 다룬다. Molavi 등(2018)은 경성 납기(hard due date)를, Rijal 등(2019)은 truck scheduling과 door assignment의 통합을 다룬다. 이들은 release/due date가 새롭지 않음을 보이나, 입고·출고트럭을 구분하며 부분 하역 후 출고 운송 트럭으로 전환되는 트럭을 모형화하지 않는다. 최근의 Theophilus 등(2021)도 cold-chain 터미널에서 부패성 제품의 품질 저하, 트럭 도착 시각, 예정 출발 시각을 넘긴 지연 출발 비용을 함께 고려하지만 입고트럭과 출고트럭은 서로 구분된다. 병행 트럭 계열의 후속 연구는 드물다. Nowak과 Puladi(2025)는 혼합 서비스 도어와 작업 선점을 허용하면서 하역을 마친 트럭이 다시 적재되는 병행 트럭을 다루고 메타휴리스틱으로 총 작업완료시간을 최소화하지만, 트럭은 싣고 온 화물을 모두 하역한 뒤 적재되고 도착 시각이나 납기는 두지 않는다. 출고트럭의 반복 적재를 허용한 Pan 등(2021)은 병행 트럭을 다루지 않으며 모든 트럭이 시각 0에 가용하다고 가정한다. Shahmardan과 Sajadieh(2020)를 인용한 문헌 가운데에서도 부분 하역 병행 트럭에 도착 시각과 납기를 결합한 연구는 확인되지 않았다.</w:t>
       </w:r>
     </w:p>
     <w:p>
@@ -641,7 +560,7 @@
         <w:rPr>
           <w:rFonts w:asciiTheme="minorEastAsia" w:hAnsiTheme="minorEastAsia"/>
         </w:rPr>
-        <w:t xml:space="preserve"> Li 등(2026)은 무인 배송센터(distribution center)를 대상으로 mixed service mode dock의 통합 트럭 배정·스케줄링을 Q-learning 기반 ALNS로 푼다. 이들 역시 도착 시각과 연장 가능한 출발 예정 시각을 시간창 </w:t>
+        <w:t xml:space="preserve"> Li 등(2026)은 무인 배송센터(distribution center)를 대상으로 mixed service mode dock의 통합 트럭 배정·스케줄링을 Q-learning 기반 ALNS(adaptive large neighborhood search; Ropke and Pisinger, 2006)로 푼다. 이들 역시 도착 시각과 연장 가능한 출발 예정 시각을 시간창 </w:t>
       </w:r>
       <m:oMath>
         <m:r>
@@ -726,7 +645,7 @@
         <w:rPr>
           <w:rFonts w:asciiTheme="minorEastAsia" w:hAnsiTheme="minorEastAsia"/>
         </w:rPr>
-        <w:t>로 두고 납기지연과 총 작업완료시간을 목적에 포함하므로, 시간 제약의 형태 자체는 본 연구와 유사하다. 그러나 유연성이 도어 수준에 있어 도어가 적재 전용·하역 전용·혼합 모드 중 하나를 선택하고 트럭은 순수 입고·출고트럭으로 고정되며, 화물은 도어 간 직접 이송이 아니라 저장 구역을 경유해 AGV가 운반한다. 반면 본 문제의 유연성은 트럭 수준에 있어, 부분 하역된 병행 트럭이 특정 목적지의 운송 트럭으로 전환되고 화물은 도어 간에 직접 이송된다. 한편 이들을 포함하여 학습 기반 연산자 선택이 메타휴리스틱을 개선한다는 보고가 많으나, 본 연구는 강한 지역 탐색을 갖춘 뒤에는 학습 기반 선택 정책의 이득이 작다는 통제된 반례를 더한다.</w:t>
+        <w:t xml:space="preserve">로 두고 납기지연과 총 작업완료시간을 목적에 포함하므로, 시간 제약의 형태 자체는 본 연구와 유사하다. 그러나 유연성이 도어 수준에 있어 도어가 적재 전용·하역 전용·혼합 모드 중 하나를 선택하고 트럭은 순수 입고·출고트럭으로 고정되며, 화물은 도어 간 직접 이송이 아니라 저장 구역을 경유해 AGV가 운반한다. 반면 본 문제의 유연성은 트럭 수준에 있어, 부분 하역된 병행 트럭이 특정 목적지의 운송 트럭으로 전환되고 화물은 도어 간에 직접 이송된다. 한편 이들과 함께 cross-dock door assignment에 강화학습 기반 strategic oscillation을 적용한 Li 등(2024), iterated greedy에 Q-learning 연산자 선택을 통합한 Karimi-Mamaghan 등(2023)처럼 학습 기반 탐색 제어가 메타휴리스틱을 개선한다는 보고가 많으나, 본 연구는 강한 지역 탐색을 갖춘 뒤에는 학습 기반 선택 정책의 이득이 작다는 통제된 반례를 더한다.</w:t>
       </w:r>
     </w:p>
     <w:p>
@@ -5985,6 +5904,125 @@
           </m:r>
         </m:oMath>
       </m:oMathPara>
+    </w:p>
+    <w:p>
+      <w:pPr>
+        <w:pStyle w:val="FirstParagraph"/>
+        <w:spacing w:line="300" w:lineRule="exact"/>
+        <w:rPr>
+          <w:rFonts w:asciiTheme="minorEastAsia" w:hAnsiTheme="minorEastAsia"/>
+        </w:rPr>
+      </w:pPr>
+      <w:r>
+        <w:rPr>
+          <w:rFonts w:asciiTheme="minorEastAsia" w:hAnsiTheme="minorEastAsia"/>
+        </w:rPr>
+        <w:t xml:space="preserve">식 (10)은 모든 </w:t>
+      </w:r>
+      <m:oMath>
+        <m:r>
+          <m:t>f</m:t>
+        </m:r>
+        <m:r>
+          <m:rPr>
+            <m:sty m:val="p"/>
+          </m:rPr>
+          <m:t>,</m:t>
+        </m:r>
+        <m:r>
+          <m:t>d</m:t>
+        </m:r>
+        <m:r>
+          <m:rPr>
+            <m:sty m:val="p"/>
+          </m:rPr>
+          <m:t>,</m:t>
+        </m:r>
+        <m:r>
+          <m:t>m</m:t>
+        </m:r>
+        <m:r>
+          <m:rPr>
+            <m:sty m:val="p"/>
+          </m:rPr>
+          <m:t>,</m:t>
+        </m:r>
+        <m:r>
+          <m:t>n</m:t>
+        </m:r>
+      </m:oMath>
+      <w:r>
+        <w:rPr>
+          <w:rFonts w:asciiTheme="minorEastAsia" w:hAnsiTheme="minorEastAsia"/>
+        </w:rPr>
+        <w:t xml:space="preserve">과 </w:t>
+      </w:r>
+      <m:oMath>
+        <m:nary>
+          <m:naryPr>
+            <m:chr m:val="∑"/>
+            <m:limLoc m:val="undOvr"/>
+            <m:subHide m:val="off"/>
+            <m:supHide m:val="on"/>
+          </m:naryPr>
+          <m:sub>
+            <m:r>
+              <m:t>k</m:t>
+            </m:r>
+          </m:sub>
+          <m:sup>
+            <m:r>
+              <m:t>​</m:t>
+            </m:r>
+          </m:sup>
+          <m:e>
+            <m:sSub>
+              <m:e>
+                <m:r>
+                  <m:t>f</m:t>
+                </m:r>
+              </m:e>
+              <m:sub>
+                <m:r>
+                  <m:t>i</m:t>
+                </m:r>
+                <m:r>
+                  <m:t>d</m:t>
+                </m:r>
+                <m:r>
+                  <m:t>k</m:t>
+                </m:r>
+              </m:sub>
+            </m:sSub>
+          </m:e>
+        </m:nary>
+        <m:r>
+          <m:rPr>
+            <m:sty m:val="p"/>
+          </m:rPr>
+          <m:t>&gt;</m:t>
+        </m:r>
+        <m:r>
+          <m:t>0</m:t>
+        </m:r>
+      </m:oMath>
+      <w:r>
+        <w:rPr>
+          <w:rFonts w:asciiTheme="minorEastAsia" w:hAnsiTheme="minorEastAsia"/>
+        </w:rPr>
+        <w:t xml:space="preserve">인 기여 병행 트럭 </w:t>
+      </w:r>
+      <m:oMath>
+        <m:r>
+          <m:t>i</m:t>
+        </m:r>
+      </m:oMath>
+      <w:r>
+        <w:rPr>
+          <w:rFonts w:asciiTheme="minorEastAsia" w:hAnsiTheme="minorEastAsia"/>
+        </w:rPr>
+        <w:t xml:space="preserve">에 대해 성립한다.</w:t>
+      </w:r>
     </w:p>
     <w:p>
       <w:pPr>
@@ -10473,7 +10511,7 @@
         <w:rPr>
           <w:rFonts w:asciiTheme="minorEastAsia" w:hAnsiTheme="minorEastAsia"/>
         </w:rPr>
-        <w:t xml:space="preserve">VAA-GILS는 iterated local search의 구현체로, 연산자 선택, 연산자 내부 sampling, kick을 제외하면 결정론적이다. 이하에서 </w:t>
+        <w:t xml:space="preserve">VAA-GILS는 iterated local search(Lourenço 등, 2019)의 구현체로, 연산자 선택, 연산자 내부 sampling, kick을 제외하면 결정론적이다. 이하에서 </w:t>
       </w:r>
       <w:r>
         <w:rPr>
@@ -10559,7 +10597,7 @@
         <w:rPr>
           <w:rFonts w:asciiTheme="minorEastAsia" w:hAnsiTheme="minorEastAsia"/>
         </w:rPr>
-        <w:t xml:space="preserve"> 1,000회 반복한다. 선택 정책이 연산자 하나를 뽑아 현재 해에서 후보를 생성하고, 후보가 전역 최선해를 개선하면 descent를 적용해 incumbent를 갱신한다. acceptance는 후보가 현재 해를 엄격히 개선할 때만 받아들이는 greedy 규칙이다. 이 규칙은 조정 집합에서 simulated annealing acceptance(초기 온도 </w:t>
+        <w:t xml:space="preserve"> 1,000회 반복한다. 선택 정책이 연산자 하나를 뽑아 현재 해에서 후보를 생성하고, 후보가 전역 최선해를 개선하면 descent를 적용해 incumbent를 갱신한다. acceptance는 후보가 현재 해를 엄격히 개선할 때만 받아들이는 greedy 규칙이다. 이 규칙은 조정 집합에서 simulated annealing(Kirkpatrick 등, 1983) acceptance(초기 온도 </w:t>
       </w:r>
       <m:oMath>
         <m:sSub>
@@ -10897,7 +10935,7 @@
         <w:rPr>
           <w:rFonts w:asciiTheme="minorEastAsia" w:hAnsiTheme="minorEastAsia"/>
         </w:rPr>
-        <w:t xml:space="preserve"> 선택 정책은 교체할 수 있으며 기본값은 균등 무작위 선택이다. 학습 정책(SA-RL5의 tabular Q-learning , 규모 불변 특징(feature)으로 오프라인 학습한 transfer DQN )은 ablation 목적으로만 평가하며 제안 방법의 일부가 아니다. tabular Q는 원 모델과 같이 무개선 구간 5-상태에서 ε-greedy 탐험과 룰렛 활용을 쓰되, 보상은 원 모델의 이진 보상(후보가 현재 해보다 나쁘지 않으면 1, 아니면 0) 대신 신규 incumbent 2·비악화 1·그 외 0의 셰이핑 보상을 사용한다. 이는 학습 신호를 강화할 뿐이므로 비교 대상 선택 정책을 불리하게 만들지 않는다. 원 모델 SA-RL5는 RL이 단일 이동을 고르고 SA accept/reject로 한 단계가 끝나는 </w:t>
+        <w:t xml:space="preserve"> 선택 정책은 교체할 수 있으며 기본값은 균등 무작위 선택이다. 학습 정책(SA-RL5의 tabular Q-learning(Watkins and Dayan, 1992), 규모 불변 특징(feature)으로 오프라인 학습한 transfer DQN(Mnih 등, 2015))은 ablation 목적으로만 평가하며 제안 방법의 일부가 아니다. tabular Q는 원 모델과 같이 무개선 구간 5-상태에서 ε-greedy 탐험과 룰렛 활용을 쓰되, 보상은 원 모델의 이진 보상(후보가 현재 해보다 나쁘지 않으면 1, 아니면 0) 대신 신규 incumbent 2·비악화 1·그 외 0의 셰이핑 보상을 사용한다. 이는 학습 신호를 강화할 뿐이므로 비교 대상 선택 정책을 불리하게 만들지 않는다. 원 모델 SA-RL5는 RL이 단일 이동을 고르고 SA accept/reject로 한 단계가 끝나는 </w:t>
       </w:r>
       <w:r>
         <w:rPr>
@@ -13931,7 +13969,7 @@
         <w:rPr>
           <w:rFonts w:asciiTheme="minorEastAsia" w:hAnsiTheme="minorEastAsia"/>
         </w:rPr>
-        <w:t>GILS 계열의 종료 조건은 반복 횟수 1,000회로 통일한다. CP-SAT는 인스턴스당 1회, 8 thread로 S에 300초(5개), M과 L에 600초(조건당 2개)를 부여하며 S-none 5개에서만 최적성이 증명된다. 실험은 Apple M2 칩(8코어)과 16 GB 메모리를 갖춘 macOS 환경에서 Python 3.12와 OR-Tools 9.15로 수행하였다.</w:t>
+        <w:t xml:space="preserve">Paper-SA-RL5와 Extended SA-RL5를 포함한 모든 메타휴리스틱의 종료 조건은 반복 횟수 1,000회로 통일한다. 한 반복은 선택된 연산자 하나로 후보해를 생성·평가하는 단계이며, GILS는 여기에 개선 시 descent를 더 수행한다. 원 모델은 CPU 시간으로 종료하지만 본 연구는 모든 방법에 같은 반복 횟수를 부여하였고, 반복당 계산량이 방법마다 다르므로 실행 시간은 &lt;Table 3&gt;에 함께 보고한다. CP-SAT는 인스턴스당 1회, 8 thread로 S에 300초(5개), M과 L에 600초(조건당 2개)를 부여하며 S-none 5개에서만 최적성이 증명된다. 실험은 Apple M2 칩(8코어)과 16 GB 메모리를 갖춘 macOS 환경에서 Python 3.12와 OR-Tools 9.15로 수행하였다.</w:t>
       </w:r>
     </w:p>
     <w:p>
@@ -14099,7 +14137,7 @@
         <w:rPr>
           <w:rFonts w:asciiTheme="minorEastAsia" w:hAnsiTheme="minorEastAsia"/>
         </w:rPr>
-        <w:t xml:space="preserve">)이다. 실행 시간은 S/M/L에서 각각 0.09, 0.55, 3.17초로, 같은 조건의 CP-SAT(76, 237, 376초)보다 100배 이상 빠르다.</w:t>
+        <w:t xml:space="preserve">)이다. 실행 시간은 S/M/L에서 각각 0.09, 0.55, 3.17초이다. CP-SAT가 기준해를 반환한 조건에서 CP-SAT의 평균 계산 시간은 S 76초, M-none 606초로 같은 조건의 GILS(0.09, 0.48초)보다 100배 이상 길며, M의 시간 제약 조건과 L의 모든 조건에서는 CP-SAT가 제한시간 안에 실행 가능해를 반환하지 못했다.</w:t>
       </w:r>
     </w:p>
     <w:p>
@@ -22859,7 +22897,7 @@
         <w:rPr>
           <w:rFonts w:asciiTheme="minorEastAsia" w:hAnsiTheme="minorEastAsia"/>
         </w:rPr>
-        <w:t xml:space="preserve">Konur, D. and Golias, M. M.(2013a), Analysis of Different Approaches to Cross-Dock Truck Scheduling with Truck Arrival Time Uncertainty, </w:t>
+        <w:t xml:space="preserve">Karimi-Mamaghan, M., Mohammadi, M., Pasdeloup, B., and Meyer, P.(2023), Learning to Select Operators in Meta-Heuristics: An Integration of Q-Learning into the Iterated Greedy Algorithm for the Permutation Flowshop Scheduling Problem, </w:t>
       </w:r>
       <w:r>
         <w:rPr>
@@ -22867,13 +22905,13 @@
           <w:i/>
           <w:iCs/>
         </w:rPr>
-        <w:t>Computers &amp; Industrial Engineering</w:t>
-      </w:r>
-      <w:r>
-        <w:rPr>
-          <w:rFonts w:asciiTheme="minorEastAsia" w:hAnsiTheme="minorEastAsia"/>
-        </w:rPr>
-        <w:t>, 65(4), 663-672.</w:t>
+        <w:t xml:space="preserve">European Journal of Operational Research</w:t>
+      </w:r>
+      <w:r>
+        <w:rPr>
+          <w:rFonts w:asciiTheme="minorEastAsia" w:hAnsiTheme="minorEastAsia"/>
+        </w:rPr>
+        <w:t xml:space="preserve">, 304(3), 1296-1330.</w:t>
       </w:r>
     </w:p>
     <w:p>
@@ -22889,7 +22927,7 @@
         <w:rPr>
           <w:rFonts w:asciiTheme="minorEastAsia" w:hAnsiTheme="minorEastAsia"/>
         </w:rPr>
-        <w:t xml:space="preserve">Konur, D. and Golias, M. M.(2013b), Cost-Stable Truck Scheduling at a Cross-Dock Facility with Unknown Truck Arrivals: A Meta-Heuristic Approach, </w:t>
+        <w:t xml:space="preserve">Kirkpatrick, S., Gelatt, C. D., and Vecchi, M. P.(1983), Optimization by Simulated Annealing, </w:t>
       </w:r>
       <w:r>
         <w:rPr>
@@ -22897,13 +22935,13 @@
           <w:i/>
           <w:iCs/>
         </w:rPr>
-        <w:t>Transportation Research Part E</w:t>
-      </w:r>
-      <w:r>
-        <w:rPr>
-          <w:rFonts w:asciiTheme="minorEastAsia" w:hAnsiTheme="minorEastAsia"/>
-        </w:rPr>
-        <w:t>, 49(1), 71-91.</w:t>
+        <w:t xml:space="preserve">Science</w:t>
+      </w:r>
+      <w:r>
+        <w:rPr>
+          <w:rFonts w:asciiTheme="minorEastAsia" w:hAnsiTheme="minorEastAsia"/>
+        </w:rPr>
+        <w:t xml:space="preserve">, 220(4598), 671-680.</w:t>
       </w:r>
     </w:p>
     <w:p>
@@ -22919,7 +22957,7 @@
         <w:rPr>
           <w:rFonts w:asciiTheme="minorEastAsia" w:hAnsiTheme="minorEastAsia"/>
         </w:rPr>
-        <w:t xml:space="preserve">Ladier, A.-L. and Alpan, G.(2016), Robust Cross-Dock Scheduling with Time Windows, </w:t>
+        <w:t xml:space="preserve">Konur, D. and Golias, M. M.(2013a), Analysis of Different Approaches to Cross-Dock Truck Scheduling with Truck Arrival Time Uncertainty, </w:t>
       </w:r>
       <w:r>
         <w:rPr>
@@ -22933,7 +22971,7 @@
         <w:rPr>
           <w:rFonts w:asciiTheme="minorEastAsia" w:hAnsiTheme="minorEastAsia"/>
         </w:rPr>
-        <w:t>, 99, 16-28.</w:t>
+        <w:t>, 65(4), 663-672.</w:t>
       </w:r>
     </w:p>
     <w:p>
@@ -22949,7 +22987,7 @@
         <w:rPr>
           <w:rFonts w:asciiTheme="minorEastAsia" w:hAnsiTheme="minorEastAsia"/>
         </w:rPr>
-        <w:t xml:space="preserve">Larbi, R., Alpan, G., Baptiste, P., and Penz, B.(2011), Scheduling Cross Docking Operations under Full, Partial and No Information on Inbound Arrivals, </w:t>
+        <w:t xml:space="preserve">Konur, D. and Golias, M. M.(2013b), Cost-Stable Truck Scheduling at a Cross-Dock Facility with Unknown Truck Arrivals: A Meta-Heuristic Approach, </w:t>
       </w:r>
       <w:r>
         <w:rPr>
@@ -22957,13 +22995,13 @@
           <w:i/>
           <w:iCs/>
         </w:rPr>
-        <w:t>Computers &amp; Operations Research</w:t>
-      </w:r>
-      <w:r>
-        <w:rPr>
-          <w:rFonts w:asciiTheme="minorEastAsia" w:hAnsiTheme="minorEastAsia"/>
-        </w:rPr>
-        <w:t>, 38(6), 889-900.</w:t>
+        <w:t>Transportation Research Part E</w:t>
+      </w:r>
+      <w:r>
+        <w:rPr>
+          <w:rFonts w:asciiTheme="minorEastAsia" w:hAnsiTheme="minorEastAsia"/>
+        </w:rPr>
+        <w:t>, 49(1), 71-91.</w:t>
       </w:r>
     </w:p>
     <w:p>
@@ -22979,7 +23017,7 @@
         <w:rPr>
           <w:rFonts w:asciiTheme="minorEastAsia" w:hAnsiTheme="minorEastAsia"/>
         </w:rPr>
-        <w:t xml:space="preserve">Li, Y., Mohammadi, M., Zhang, X., Lan, Y., and van Jaarsveld, W.(2026), Integrated Trucks Assignment and Scheduling Problem with Mixed Service Mode Docks, </w:t>
+        <w:t xml:space="preserve">Ladier, A.-L. and Alpan, G.(2016), Robust Cross-Dock Scheduling with Time Windows, </w:t>
       </w:r>
       <w:r>
         <w:rPr>
@@ -22987,13 +23025,13 @@
           <w:i/>
           <w:iCs/>
         </w:rPr>
-        <w:t>European Journal of Operational Research</w:t>
-      </w:r>
-      <w:r>
-        <w:rPr>
-          <w:rFonts w:asciiTheme="minorEastAsia" w:hAnsiTheme="minorEastAsia"/>
-        </w:rPr>
-        <w:t>, 333(1), 117-137.</w:t>
+        <w:t>Computers &amp; Industrial Engineering</w:t>
+      </w:r>
+      <w:r>
+        <w:rPr>
+          <w:rFonts w:asciiTheme="minorEastAsia" w:hAnsiTheme="minorEastAsia"/>
+        </w:rPr>
+        <w:t>, 99, 16-28.</w:t>
       </w:r>
     </w:p>
     <w:p>
@@ -23009,7 +23047,7 @@
         <w:rPr>
           <w:rFonts w:asciiTheme="minorEastAsia" w:hAnsiTheme="minorEastAsia"/>
         </w:rPr>
-        <w:t xml:space="preserve">Mnih, V., Kavukcuoglu, K., Silver, D., Rusu, A. A., Veness, J., Bellemare, M. G., Graves, A., Riedmiller, M., Fidjeland, A. K., Ostrovski, G., Petersen, S., Beattie, C., Sadik, A., Antonoglou, I., King, H., Kumaran, D., Wierstra, D., Legg, S., and Hassabis, D.(2015), Human-Level Control through Deep Reinforcement Learning, </w:t>
+        <w:t xml:space="preserve">Larbi, R., Alpan, G., Baptiste, P., and Penz, B.(2011), Scheduling Cross Docking Operations under Full, Partial and No Information on Inbound Arrivals, </w:t>
       </w:r>
       <w:r>
         <w:rPr>
@@ -23017,13 +23055,13 @@
           <w:i/>
           <w:iCs/>
         </w:rPr>
-        <w:t>Nature</w:t>
-      </w:r>
-      <w:r>
-        <w:rPr>
-          <w:rFonts w:asciiTheme="minorEastAsia" w:hAnsiTheme="minorEastAsia"/>
-        </w:rPr>
-        <w:t>, 518, 529-533.</w:t>
+        <w:t>Computers &amp; Operations Research</w:t>
+      </w:r>
+      <w:r>
+        <w:rPr>
+          <w:rFonts w:asciiTheme="minorEastAsia" w:hAnsiTheme="minorEastAsia"/>
+        </w:rPr>
+        <w:t>, 38(6), 889-900.</w:t>
       </w:r>
     </w:p>
     <w:p>
@@ -23039,7 +23077,7 @@
         <w:rPr>
           <w:rFonts w:asciiTheme="minorEastAsia" w:hAnsiTheme="minorEastAsia"/>
         </w:rPr>
-        <w:t xml:space="preserve">Molavi, D., Shahmardan, A., and Sajadieh, M. S.(2018), Truck Scheduling in a Cross Docking Systems with Fixed Due Dates and Shipment Sorting, </w:t>
+        <w:t xml:space="preserve">Li, M., Hao, J.-K., and Wu, Q.(2024), A Flow Based Formulation and a Reinforcement Learning Based Strategic Oscillation for Cross-Dock Door Assignment, </w:t>
       </w:r>
       <w:r>
         <w:rPr>
@@ -23047,13 +23085,13 @@
           <w:i/>
           <w:iCs/>
         </w:rPr>
-        <w:t>Computers &amp; Industrial Engineering</w:t>
-      </w:r>
-      <w:r>
-        <w:rPr>
-          <w:rFonts w:asciiTheme="minorEastAsia" w:hAnsiTheme="minorEastAsia"/>
-        </w:rPr>
-        <w:t>, 117, 29-40.</w:t>
+        <w:t xml:space="preserve">European Journal of Operational Research</w:t>
+      </w:r>
+      <w:r>
+        <w:rPr>
+          <w:rFonts w:asciiTheme="minorEastAsia" w:hAnsiTheme="minorEastAsia"/>
+        </w:rPr>
+        <w:t xml:space="preserve">, 312(2), 473-492.</w:t>
       </w:r>
     </w:p>
     <w:p>
@@ -23069,7 +23107,7 @@
         <w:rPr>
           <w:rFonts w:asciiTheme="minorEastAsia" w:hAnsiTheme="minorEastAsia"/>
         </w:rPr>
-        <w:t xml:space="preserve">Rijal, A., Bijvank, M., and de Koster, R.(2019), Integrated Scheduling and Assignment of Trucks at Unit-Load Cross-Dock Terminals with Mixed Service Mode Dock Doors, </w:t>
+        <w:t xml:space="preserve">Li, Y., Mohammadi, M., Zhang, X., Lan, Y., and van Jaarsveld, W.(2026), Integrated Trucks Assignment and Scheduling Problem with Mixed Service Mode Docks, </w:t>
       </w:r>
       <w:r>
         <w:rPr>
@@ -23083,7 +23121,7 @@
         <w:rPr>
           <w:rFonts w:asciiTheme="minorEastAsia" w:hAnsiTheme="minorEastAsia"/>
         </w:rPr>
-        <w:t>, 278(3), 752-771.</w:t>
+        <w:t>, 333(1), 117-137.</w:t>
       </w:r>
     </w:p>
     <w:p>
@@ -23099,7 +23137,7 @@
         <w:rPr>
           <w:rFonts w:asciiTheme="minorEastAsia" w:hAnsiTheme="minorEastAsia"/>
         </w:rPr>
-        <w:t xml:space="preserve">Shahmardan, A. and Sajadieh, M. S.(2020), Truck Scheduling in a Multi-Door Cross-Docking Center with Partial Unloading: Reinforcement Learning-Based Simulated Annealing Approaches, </w:t>
+        <w:t xml:space="preserve">Lourenço, H. R., Martin, O. C., and Stützle, T.(2019), Iterated Local Search: Framework and Applications, In Gendreau, M. and Potvin, J.-Y.(Eds.), </w:t>
       </w:r>
       <w:r>
         <w:rPr>
@@ -23107,13 +23145,253 @@
           <w:i/>
           <w:iCs/>
         </w:rPr>
+        <w:t xml:space="preserve">Handbook of Metaheuristics</w:t>
+      </w:r>
+      <w:r>
+        <w:rPr>
+          <w:rFonts w:asciiTheme="minorEastAsia" w:hAnsiTheme="minorEastAsia"/>
+        </w:rPr>
+        <w:t xml:space="preserve">, Springer, Cham, 129-168.</w:t>
+      </w:r>
+    </w:p>
+    <w:p>
+      <w:pPr>
+        <w:pStyle w:val="a0"/>
+        <w:spacing w:line="300" w:lineRule="exact"/>
+        <w:ind w:firstLine="216"/>
+        <w:rPr>
+          <w:rFonts w:asciiTheme="minorEastAsia" w:hAnsiTheme="minorEastAsia"/>
+        </w:rPr>
+      </w:pPr>
+      <w:r>
+        <w:rPr>
+          <w:rFonts w:asciiTheme="minorEastAsia" w:hAnsiTheme="minorEastAsia"/>
+        </w:rPr>
+        <w:t xml:space="preserve">Mnih, V., Kavukcuoglu, K., Silver, D., Rusu, A. A., Veness, J., Bellemare, M. G., Graves, A., Riedmiller, M., Fidjeland, A. K., Ostrovski, G., Petersen, S., Beattie, C., Sadik, A., Antonoglou, I., King, H., Kumaran, D., Wierstra, D., Legg, S., and Hassabis, D.(2015), Human-Level Control through Deep Reinforcement Learning, </w:t>
+      </w:r>
+      <w:r>
+        <w:rPr>
+          <w:rFonts w:asciiTheme="minorEastAsia" w:hAnsiTheme="minorEastAsia"/>
+          <w:i/>
+          <w:iCs/>
+        </w:rPr>
+        <w:t>Nature</w:t>
+      </w:r>
+      <w:r>
+        <w:rPr>
+          <w:rFonts w:asciiTheme="minorEastAsia" w:hAnsiTheme="minorEastAsia"/>
+        </w:rPr>
+        <w:t>, 518, 529-533.</w:t>
+      </w:r>
+    </w:p>
+    <w:p>
+      <w:pPr>
+        <w:pStyle w:val="a0"/>
+        <w:spacing w:line="300" w:lineRule="exact"/>
+        <w:ind w:firstLine="216"/>
+        <w:rPr>
+          <w:rFonts w:asciiTheme="minorEastAsia" w:hAnsiTheme="minorEastAsia"/>
+        </w:rPr>
+      </w:pPr>
+      <w:r>
+        <w:rPr>
+          <w:rFonts w:asciiTheme="minorEastAsia" w:hAnsiTheme="minorEastAsia"/>
+        </w:rPr>
+        <w:t xml:space="preserve">Molavi, D., Shahmardan, A., and Sajadieh, M. S.(2018), Truck Scheduling in a Cross Docking Systems with Fixed Due Dates and Shipment Sorting, </w:t>
+      </w:r>
+      <w:r>
+        <w:rPr>
+          <w:rFonts w:asciiTheme="minorEastAsia" w:hAnsiTheme="minorEastAsia"/>
+          <w:i/>
+          <w:iCs/>
+        </w:rPr>
         <w:t>Computers &amp; Industrial Engineering</w:t>
       </w:r>
       <w:r>
         <w:rPr>
           <w:rFonts w:asciiTheme="minorEastAsia" w:hAnsiTheme="minorEastAsia"/>
         </w:rPr>
+        <w:t>, 117, 29-40.</w:t>
+      </w:r>
+    </w:p>
+    <w:p>
+      <w:pPr>
+        <w:pStyle w:val="a0"/>
+        <w:spacing w:line="300" w:lineRule="exact"/>
+        <w:ind w:firstLine="216"/>
+        <w:rPr>
+          <w:rFonts w:asciiTheme="minorEastAsia" w:hAnsiTheme="minorEastAsia"/>
+        </w:rPr>
+      </w:pPr>
+      <w:r>
+        <w:rPr>
+          <w:rFonts w:asciiTheme="minorEastAsia" w:hAnsiTheme="minorEastAsia"/>
+        </w:rPr>
+        <w:t xml:space="preserve">Nowak, M. and Puladi, S.(2025), Value of Operational Flexibility in Cross-Docking, </w:t>
+      </w:r>
+      <w:r>
+        <w:rPr>
+          <w:rFonts w:asciiTheme="minorEastAsia" w:hAnsiTheme="minorEastAsia"/>
+          <w:i/>
+          <w:iCs/>
+        </w:rPr>
+        <w:t xml:space="preserve">Computers &amp; Industrial Engineering</w:t>
+      </w:r>
+      <w:r>
+        <w:rPr>
+          <w:rFonts w:asciiTheme="minorEastAsia" w:hAnsiTheme="minorEastAsia"/>
+        </w:rPr>
+        <w:t xml:space="preserve">, 209, 111423.</w:t>
+      </w:r>
+    </w:p>
+    <w:p>
+      <w:pPr>
+        <w:pStyle w:val="a0"/>
+        <w:spacing w:line="300" w:lineRule="exact"/>
+        <w:ind w:firstLine="216"/>
+        <w:rPr>
+          <w:rFonts w:asciiTheme="minorEastAsia" w:hAnsiTheme="minorEastAsia"/>
+        </w:rPr>
+      </w:pPr>
+      <w:r>
+        <w:rPr>
+          <w:rFonts w:asciiTheme="minorEastAsia" w:hAnsiTheme="minorEastAsia"/>
+        </w:rPr>
+        <w:t xml:space="preserve">Pan, F., Fan, T., Qi, X., Chen, J., and Zhang, C.(2021), Truck Scheduling for Cross-Docking of Fresh Produce with Repeated Loading, </w:t>
+      </w:r>
+      <w:r>
+        <w:rPr>
+          <w:rFonts w:asciiTheme="minorEastAsia" w:hAnsiTheme="minorEastAsia"/>
+          <w:i/>
+          <w:iCs/>
+        </w:rPr>
+        <w:t xml:space="preserve">Mathematical Problems in Engineering</w:t>
+      </w:r>
+      <w:r>
+        <w:rPr>
+          <w:rFonts w:asciiTheme="minorEastAsia" w:hAnsiTheme="minorEastAsia"/>
+        </w:rPr>
+        <w:t xml:space="preserve">, 2021, 5592122.</w:t>
+      </w:r>
+    </w:p>
+    <w:p>
+      <w:pPr>
+        <w:pStyle w:val="a0"/>
+        <w:spacing w:line="300" w:lineRule="exact"/>
+        <w:ind w:firstLine="216"/>
+        <w:rPr>
+          <w:rFonts w:asciiTheme="minorEastAsia" w:hAnsiTheme="minorEastAsia"/>
+        </w:rPr>
+      </w:pPr>
+      <w:r>
+        <w:rPr>
+          <w:rFonts w:asciiTheme="minorEastAsia" w:hAnsiTheme="minorEastAsia"/>
+        </w:rPr>
+        <w:t xml:space="preserve">Rijal, A., Bijvank, M., and de Koster, R.(2019), Integrated Scheduling and Assignment of Trucks at Unit-Load Cross-Dock Terminals with Mixed Service Mode Dock Doors, </w:t>
+      </w:r>
+      <w:r>
+        <w:rPr>
+          <w:rFonts w:asciiTheme="minorEastAsia" w:hAnsiTheme="minorEastAsia"/>
+          <w:i/>
+          <w:iCs/>
+        </w:rPr>
+        <w:t>European Journal of Operational Research</w:t>
+      </w:r>
+      <w:r>
+        <w:rPr>
+          <w:rFonts w:asciiTheme="minorEastAsia" w:hAnsiTheme="minorEastAsia"/>
+        </w:rPr>
+        <w:t>, 278(3), 752-771.</w:t>
+      </w:r>
+    </w:p>
+    <w:p>
+      <w:pPr>
+        <w:pStyle w:val="a0"/>
+        <w:spacing w:line="300" w:lineRule="exact"/>
+        <w:ind w:firstLine="216"/>
+        <w:rPr>
+          <w:rFonts w:asciiTheme="minorEastAsia" w:hAnsiTheme="minorEastAsia"/>
+        </w:rPr>
+      </w:pPr>
+      <w:r>
+        <w:rPr>
+          <w:rFonts w:asciiTheme="minorEastAsia" w:hAnsiTheme="minorEastAsia"/>
+        </w:rPr>
+        <w:t xml:space="preserve">Ropke, S. and Pisinger, D.(2006), An Adaptive Large Neighborhood Search Heuristic for the Pickup and Delivery Problem with Time Windows, </w:t>
+      </w:r>
+      <w:r>
+        <w:rPr>
+          <w:rFonts w:asciiTheme="minorEastAsia" w:hAnsiTheme="minorEastAsia"/>
+          <w:i/>
+          <w:iCs/>
+        </w:rPr>
+        <w:t xml:space="preserve">Transportation Science</w:t>
+      </w:r>
+      <w:r>
+        <w:rPr>
+          <w:rFonts w:asciiTheme="minorEastAsia" w:hAnsiTheme="minorEastAsia"/>
+        </w:rPr>
+        <w:t xml:space="preserve">, 40(4), 455-472.</w:t>
+      </w:r>
+    </w:p>
+    <w:p>
+      <w:pPr>
+        <w:pStyle w:val="a0"/>
+        <w:spacing w:line="300" w:lineRule="exact"/>
+        <w:ind w:firstLine="216"/>
+        <w:rPr>
+          <w:rFonts w:asciiTheme="minorEastAsia" w:hAnsiTheme="minorEastAsia"/>
+        </w:rPr>
+      </w:pPr>
+      <w:r>
+        <w:rPr>
+          <w:rFonts w:asciiTheme="minorEastAsia" w:hAnsiTheme="minorEastAsia"/>
+        </w:rPr>
+        <w:t xml:space="preserve">Shahmardan, A. and Sajadieh, M. S.(2020), Truck Scheduling in a Multi-Door Cross-Docking Center with Partial Unloading: Reinforcement Learning-Based Simulated Annealing Approaches, </w:t>
+      </w:r>
+      <w:r>
+        <w:rPr>
+          <w:rFonts w:asciiTheme="minorEastAsia" w:hAnsiTheme="minorEastAsia"/>
+          <w:i/>
+          <w:iCs/>
+        </w:rPr>
+        <w:t>Computers &amp; Industrial Engineering</w:t>
+      </w:r>
+      <w:r>
+        <w:rPr>
+          <w:rFonts w:asciiTheme="minorEastAsia" w:hAnsiTheme="minorEastAsia"/>
+        </w:rPr>
         <w:t>, 139, 106134.</w:t>
+      </w:r>
+    </w:p>
+    <w:p>
+      <w:pPr>
+        <w:pStyle w:val="a0"/>
+        <w:spacing w:line="300" w:lineRule="exact"/>
+        <w:ind w:firstLine="216"/>
+        <w:rPr>
+          <w:rFonts w:asciiTheme="minorEastAsia" w:hAnsiTheme="minorEastAsia"/>
+        </w:rPr>
+      </w:pPr>
+      <w:r>
+        <w:rPr>
+          <w:rFonts w:asciiTheme="minorEastAsia" w:hAnsiTheme="minorEastAsia"/>
+        </w:rPr>
+        <w:t xml:space="preserve">Theophilus, O., Dulebenets, M. A., Pasha, J., Lau, Y.-y., Fathollahi-Fard, A. M., and Mazaheri, A.(2021), Truck Scheduling Optimization at a Cold-Chain Cross-Docking Terminal with Product Perishability Considerations, </w:t>
+      </w:r>
+      <w:r>
+        <w:rPr>
+          <w:rFonts w:asciiTheme="minorEastAsia" w:hAnsiTheme="minorEastAsia"/>
+          <w:i/>
+          <w:iCs/>
+        </w:rPr>
+        <w:t xml:space="preserve">Computers &amp; Industrial Engineering</w:t>
+      </w:r>
+      <w:r>
+        <w:rPr>
+          <w:rFonts w:asciiTheme="minorEastAsia" w:hAnsiTheme="minorEastAsia"/>
+        </w:rPr>
+        <w:t xml:space="preserve">, 156, 107240.</w:t>
       </w:r>
     </w:p>
     <w:p>

</xml_diff>

<commit_message>
feat: 용례 확인 #7
</commit_message>
<xml_diff>
--- a/paper/jkiie_submit_body.docx
+++ b/paper/jkiie_submit_body.docx
@@ -2430,7 +2430,7 @@
         </w:rPr>
         <w:drawing>
           <wp:inline distT="0" distB="0" distL="0" distR="0" wp14:anchorId="42FBF958" wp14:editId="57998C38">
-            <wp:extent cx="5334000" cy="1927094"/>
+            <wp:extent cx="5334000" cy="2104322"/>
             <wp:effectExtent l="0" t="0" r="0" b="0"/>
             <wp:docPr id="23" name="Picture"/>
             <wp:cNvGraphicFramePr/>
@@ -2452,7 +2452,7 @@
                   <pic:spPr bwMode="auto">
                     <a:xfrm>
                       <a:off x="0" y="0"/>
-                      <a:ext cx="5334000" cy="1927094"/>
+                      <a:ext cx="5334000" cy="2104322"/>
                     </a:xfrm>
                     <a:prstGeom prst="rect">
                       <a:avLst/>

</xml_diff>

<commit_message>
feat: 논문 개선 #3
</commit_message>
<xml_diff>
--- a/paper/jkiie_submit_body.docx
+++ b/paper/jkiie_submit_body.docx
@@ -335,7 +335,7 @@
         <w:rPr>
           <w:rFonts w:asciiTheme="minorEastAsia" w:hAnsiTheme="minorEastAsia"/>
         </w:rPr>
-        <w:t xml:space="preserve">기존 병행 트럭 모델의 두 가정이 현실성을 제약한다. 첫째, 모든 트럭이 시각 0에 가용하다고 가정하지만 실제 도크에서는 트럭마다 예약 도착 시각(release time)이 다르다. 둘째, 목적식이 순수 총 작업완료시간이지만 출고트럭의 출발은 위반 시 비용이 발생하는 납기(due date)에 묶여 있다.</w:t>
+        <w:t xml:space="preserve">기존 병행 트럭 모델의 두 가정이 현실성을 제약한다. 첫째, 모든 트럭이 시각 0에 가용하다고 가정하지만 실제 도크에서는 트럭마다 예약 도착 시각(release time)이 다르다. 일반 크로스도킹 연구에서도 트럭 도착은 시간창(time window)이나 도착 구간으로 주어지는 것으로 다루어지며(Van Belle 등, 2013; Konur and Golias, 2013a; Ladier and Alpan, 2016), 도착 정보를 얼마나 알고 있는지가 스케줄 품질에 영향을 준다(Larbi 등, 2011). 둘째, 목적식이 순수 총 작업완료시간이지만 출고트럭의 출발은 위반 시 비용이 발생하는 납기(due date)에 묶여 있다. 출고 납기는 경성 제약으로 부과되거나(Molavi 등, 2018) 납기지연(tardiness)이나 지연 출발 비용으로 목적식에 반영되어 왔다(Van Belle 등, 2013; Rijal 등, 2019; Theophilus 등, 2021). 병행 트럭 모형이 이 두 요소를 빼면 부분 하역의 이점이 실제 도착·출발 일정 아래에서도 유지되는지 평가할 수 없으므로, 두 가정을 완화한 모형이 필요하다.</w:t>
       </w:r>
     </w:p>
     <w:p>
@@ -351,7 +351,7 @@
         <w:rPr>
           <w:rFonts w:asciiTheme="minorEastAsia" w:hAnsiTheme="minorEastAsia"/>
         </w:rPr>
-        <w:t xml:space="preserve">도착 시각, 시간창(time window), 납기지연(tardiness)은 일반 크로스도킹 스케줄링에서 이미 연구되어 왔다(Van Belle et al., 2013; Assadi and Bagheri, 2016; Bodnar et al., 2017; Molavi et al., 2018; Rijal et al., 2019; Li et al., 2026). 그러나 병행 트럭 설정은 temporal constraint의 의미를 바꾼다. 병행 트럭은 순수 입고트럭도 출고트럭도 아니다. 부분 하역 후 한 목적지의 화물을 유지하고, 해당 목적지로 들어오는 이송 화물을 기다린 뒤 비로소 출고 운송 트럭으로 출발한다. 이 부분 하역 변환은 하나의 precedence chain — 도착 </w:t>
+        <w:t xml:space="preserve">도착 시각, 시간창, 납기지연은 일반 크로스도킹 스케줄링에서 이미 연구되어 왔다(Van Belle et al., 2013; Assadi and Bagheri, 2016; Bodnar et al., 2017; Molavi et al., 2018; Rijal et al., 2019; Li et al., 2026). 그러나 병행 트럭 설정은 temporal constraint의 의미를 바꾼다. 병행 트럭은 순수 입고트럭도 출고트럭도 아니다. 부분 하역 후 한 목적지의 화물을 유지하고, 해당 목적지로 들어오는 이송 화물을 기다린 뒤 비로소 출고 운송 트럭으로 출발한다. 이 부분 하역 변환은 하나의 precedence chain — 도착 </w:t>
       </w:r>
       <m:oMath>
         <m:r>
@@ -13660,7 +13660,13 @@
         <w:rPr>
           <w:rFonts w:asciiTheme="minorEastAsia" w:hAnsiTheme="minorEastAsia"/>
         </w:rPr>
-        <w:t xml:space="preserve">, 재시작 시 reheating)와 비교해 정하였다. 조정 집합 45개 인스턴스 중 33개에서 SA 수락 규칙의 목적값이 greedy보다 높았고(인스턴스별 차이의 중앙값 +0.017%p, 양측 Wilcoxon </w:t>
+        <w:t xml:space="preserve">, 재시작 시 reheating)와 비교해 </w:t>
+      </w:r>
+      <w:r>
+        <w:rPr>
+          <w:rFonts w:asciiTheme="minorEastAsia" w:hAnsiTheme="minorEastAsia"/>
+        </w:rPr>
+        <w:t xml:space="preserve">정하였다. 조정 집합 45개 인스턴스 중 33개에서 SA 수락 규칙의 목적값이 greedy보다 높아, 인스턴스별 순위 기준으로는 greedy가 유의하게 좋았다(차이의 중앙값 +0.017%p, 양측 Wilcoxon </w:t>
       </w:r>
       <m:oMath>
         <m:r>
@@ -13680,7 +13686,7 @@
         <w:rPr>
           <w:rFonts w:asciiTheme="minorEastAsia" w:hAnsiTheme="minorEastAsia"/>
         </w:rPr>
-        <w:t xml:space="preserve">), 평균 차이는 한 인스턴스의 큰 차이 때문에 −0.011%p였다. 시간 제약이 없는 조건(+0.084%p, </w:t>
+        <w:t xml:space="preserve">). 평균 차이(−0.011%p)가 음수인 것은 한 인스턴스의 큰 차이 때문이며 SA의 우위를 뜻하지 않는다. 시간 제약이 없는 조건(+0.084%p, </w:t>
       </w:r>
       <m:oMath>
         <m:r>
@@ -13710,17 +13716,23 @@
           <m:rPr>
             <m:sty m:val="p"/>
           </m:rPr>
-          <m:t>=</m:t>
-        </m:r>
-        <m:r>
-          <m:t>0.051</m:t>
+          <m:t>&gt;</m:t>
+        </m:r>
+        <m:r>
+          <m:t>0.05</m:t>
         </m:r>
       </m:oMath>
       <w:r>
         <w:rPr>
           <w:rFonts w:asciiTheme="minorEastAsia" w:hAnsiTheme="minorEastAsia"/>
         </w:rPr>
-        <w:t xml:space="preserve">)으로 나누어도 SA의 유의한 우위는 없었다.</w:t>
+        <w:t xml:space="preserve">)으로 나누면 어느 쪽에서도 두 규칙의 차이는 유의하지 않았다.</w:t>
+      </w:r>
+      <w:r>
+        <w:rPr>
+          <w:rFonts w:asciiTheme="minorEastAsia" w:hAnsiTheme="minorEastAsia"/>
+        </w:rPr>
+        <w:t xml:space="preserve"/>
       </w:r>
     </w:p>
     <w:p>

</xml_diff>

<commit_message>
fix: docx 수식 깨짐 수정 (Table 3 + pandoc 변환 잔재)
pandoc tex→docx 변환 과정에서 깨진 수식을 Word 정식 수식(OMML)으로 바로잡았다.

Table 3 (Instance generation parameters)
- 평문으로 남아 있던 f_idk, t_k, DE_q/DL_q, t_mn, r_q를 아래첨자 OMML로 교체
- 3개 런으로 분리돼 있던 d + 결합 매크론 + _q를 오버바 + 아래첨자 하나로 통합
- (|I|,|F|,|D|,|M|), |I|/|D|, |K|, (ρ,δ), U[·] 표기를 이탤릭 변수 + 정립 기호로 조판
- [0,100]²를 윗첨자 수식으로, ρH·δH를 수식 런으로 분리
- 문서의 나머지 수식과 같은 폰트·크기(Cambria Math, 9pt)로 맞춤

본문 전체
- 수식 안의 EM QUAD(U+2001) 55개를 일반 공백으로 치환 — 식 (1)~(16)의
  번호·∀ 앞 간격에 쓰이며 일부 변환기에서 ¿ 모양으로 표시되던 원인
- ZERO WIDTH SPACE(U+200B) 19개 제거 (∑ 첨자 뒤 pandoc 잔재)
- THIN/FOUR-PER-EM SPACE 6개를 일반 공백으로 치환
- 내용이 없는 빈 런 8개 제거

검증: XML well-formed, oMath 207개 유지, 예외 문자 0개.

paper/jkiie_submit_body_word.pdf 추가
- 수정된 docx를 Word로 내보낸 확인용 PDF (28쪽).
- 기존 jkiie_submit_body.pdf는 .tex의 XeLaTeX 빌드(18쪽)이며
  .tex 원본에는 문제가 없어 그대로 둔다.

Co-Authored-By: Claude Opus 5 <noreply@anthropic.com>
</commit_message>
<xml_diff>
--- a/paper/jkiie_submit_body.docx
+++ b/paper/jkiie_submit_body.docx
@@ -187,34 +187,6 @@
           <w:bCs/>
         </w:rPr>
         <w:t xml:space="preserve">CP-SAT 기준해 비교를 동반한</w:t>
-      </w:r>
-      <w:r>
-        <w:rPr>
-          <w:b/>
-          <w:bCs/>
-        </w:rPr>
-        <w:t xml:space="preserve"/>
-      </w:r>
-      <w:r>
-        <w:rPr>
-          <w:b/>
-          <w:bCs/>
-        </w:rPr>
-        <w:t xml:space="preserve"/>
-      </w:r>
-      <w:r>
-        <w:rPr>
-          <w:b/>
-          <w:bCs/>
-        </w:rPr>
-        <w:t xml:space="preserve"/>
-      </w:r>
-      <w:r>
-        <w:rPr>
-          <w:b/>
-          <w:bCs/>
-        </w:rPr>
-        <w:t xml:space="preserve"/>
       </w:r>
       <w:r>
         <w:rPr>
@@ -3203,7 +3175,7 @@
                 </m:sub>
                 <m:sup>
                   <m:r>
-                    <m:t>​</m:t>
+                    <m:t/>
                   </m:r>
                 </m:sup>
                 <m:e>
@@ -3349,7 +3321,7 @@
                 </m:sub>
                 <m:sup>
                   <m:r>
-                    <m:t>​</m:t>
+                    <m:t/>
                   </m:r>
                 </m:sup>
                 <m:e>
@@ -3480,7 +3452,7 @@
                 </m:sub>
                 <m:sup>
                   <m:r>
-                    <m:t>​</m:t>
+                    <m:t/>
                   </m:r>
                 </m:sup>
                 <m:e>
@@ -3655,7 +3627,7 @@
                 </m:sub>
                 <m:sup>
                   <m:r>
-                    <m:t>​</m:t>
+                    <m:t/>
                   </m:r>
                 </m:sup>
                 <m:e>
@@ -4414,7 +4386,7 @@
                 </m:sub>
                 <m:sup>
                   <m:r>
-                    <m:t>​</m:t>
+                    <m:t/>
                   </m:r>
                 </m:sup>
                 <m:e>
@@ -4487,7 +4459,7 @@
                 </m:sub>
                 <m:sup>
                   <m:r>
-                    <m:t>​</m:t>
+                    <m:t/>
                   </m:r>
                 </m:sup>
                 <m:e>
@@ -4560,7 +4532,7 @@
                 </m:sub>
                 <m:sup>
                   <m:r>
-                    <m:t>​</m:t>
+                    <m:t/>
                   </m:r>
                 </m:sup>
                 <m:e>
@@ -5063,7 +5035,7 @@
                 <m:t>,</m:t>
               </m:r>
               <m:r>
-                <m:t> </m:t>
+                <m:t xml:space="preserve"> </m:t>
               </m:r>
               <m:sSub>
                 <m:e>
@@ -5424,7 +5396,7 @@
               <w:rPr>
                 <w:rFonts w:ascii="Cambria Math" w:hAnsi="Cambria Math"/>
               </w:rPr>
-              <m:t>​</m:t>
+              <m:t/>
             </m:r>
           </m:sup>
           <m:e>
@@ -5561,7 +5533,7 @@
           <w:rPr>
             <w:rFonts w:ascii="Cambria Math" w:hAnsi="Cambria Math"/>
           </w:rPr>
-          <m:t> </m:t>
+          <m:t xml:space="preserve"> </m:t>
         </m:r>
         <m:r>
           <m:rPr>
@@ -5585,7 +5557,7 @@
           <w:rPr>
             <w:rFonts w:ascii="Cambria Math" w:hAnsi="Cambria Math"/>
           </w:rPr>
-          <m:t> </m:t>
+          <m:t xml:space="preserve"> </m:t>
         </m:r>
         <m:sSub>
           <m:sSubPr>
@@ -6195,7 +6167,7 @@
                 <w:rPr>
                   <w:rFonts w:ascii="Cambria Math" w:hAnsi="Cambria Math"/>
                 </w:rPr>
-                <m:t>​</m:t>
+                <m:t/>
               </m:r>
             </m:sup>
             <m:e>
@@ -6239,7 +6211,7 @@
             <w:rPr>
               <w:rFonts w:ascii="Cambria Math" w:hAnsi="Cambria Math"/>
             </w:rPr>
-            <m:t>1 </m:t>
+            <m:t xml:space="preserve">1  </m:t>
           </m:r>
           <m:r>
             <m:rPr>
@@ -6254,7 +6226,7 @@
             <w:rPr>
               <w:rFonts w:ascii="Cambria Math" w:hAnsi="Cambria Math"/>
             </w:rPr>
-            <m:t>i  </m:t>
+            <m:t xml:space="preserve">i    </m:t>
           </m:r>
           <m:r>
             <m:rPr>
@@ -6287,7 +6259,7 @@
             <w:rPr>
               <w:rFonts w:ascii="Cambria Math" w:hAnsi="Cambria Math"/>
             </w:rPr>
-            <m:t>,  </m:t>
+            <m:t xml:space="preserve">,    </m:t>
           </m:r>
           <m:nary>
             <m:naryPr>
@@ -6328,7 +6300,7 @@
                 <w:rPr>
                   <w:rFonts w:ascii="Cambria Math" w:hAnsi="Cambria Math"/>
                 </w:rPr>
-                <m:t>​</m:t>
+                <m:t/>
               </m:r>
             </m:sup>
             <m:e>
@@ -6372,7 +6344,7 @@
             <w:rPr>
               <w:rFonts w:ascii="Cambria Math" w:hAnsi="Cambria Math"/>
             </w:rPr>
-            <m:t>1 </m:t>
+            <m:t xml:space="preserve">1  </m:t>
           </m:r>
           <m:r>
             <m:rPr>
@@ -6387,7 +6359,7 @@
             <w:rPr>
               <w:rFonts w:ascii="Cambria Math" w:hAnsi="Cambria Math"/>
             </w:rPr>
-            <m:t>f  </m:t>
+            <m:t xml:space="preserve">f    </m:t>
           </m:r>
           <m:r>
             <m:rPr>
@@ -6468,7 +6440,7 @@
                 <w:rPr>
                   <w:rFonts w:ascii="Cambria Math" w:hAnsi="Cambria Math"/>
                 </w:rPr>
-                <m:t>​</m:t>
+                <m:t/>
               </m:r>
             </m:sup>
             <m:e>
@@ -6547,7 +6519,7 @@
                 <w:rPr>
                   <w:rFonts w:ascii="Cambria Math" w:hAnsi="Cambria Math"/>
                 </w:rPr>
-                <m:t>​</m:t>
+                <m:t/>
               </m:r>
             </m:sup>
             <m:e>
@@ -6591,7 +6563,7 @@
             <w:rPr>
               <w:rFonts w:ascii="Cambria Math" w:hAnsi="Cambria Math"/>
             </w:rPr>
-            <m:t>1 </m:t>
+            <m:t xml:space="preserve">1  </m:t>
           </m:r>
           <m:r>
             <m:rPr>
@@ -6606,7 +6578,7 @@
             <w:rPr>
               <w:rFonts w:ascii="Cambria Math" w:hAnsi="Cambria Math"/>
             </w:rPr>
-            <m:t>d  </m:t>
+            <m:t xml:space="preserve">d    </m:t>
           </m:r>
           <m:r>
             <m:rPr>
@@ -6639,7 +6611,7 @@
             <w:rPr>
               <w:rFonts w:ascii="Cambria Math" w:hAnsi="Cambria Math"/>
             </w:rPr>
-            <m:t>,  </m:t>
+            <m:t xml:space="preserve">,    </m:t>
           </m:r>
           <m:nary>
             <m:naryPr>
@@ -6680,7 +6652,7 @@
                 <w:rPr>
                   <w:rFonts w:ascii="Cambria Math" w:hAnsi="Cambria Math"/>
                 </w:rPr>
-                <m:t>​</m:t>
+                <m:t/>
               </m:r>
             </m:sup>
             <m:e>
@@ -6724,7 +6696,7 @@
             <w:rPr>
               <w:rFonts w:ascii="Cambria Math" w:hAnsi="Cambria Math"/>
             </w:rPr>
-            <m:t>1 </m:t>
+            <m:t xml:space="preserve">1  </m:t>
           </m:r>
           <m:r>
             <m:rPr>
@@ -6739,7 +6711,7 @@
             <w:rPr>
               <w:rFonts w:ascii="Cambria Math" w:hAnsi="Cambria Math"/>
             </w:rPr>
-            <m:t>m  </m:t>
+            <m:t xml:space="preserve">m    </m:t>
           </m:r>
           <m:r>
             <m:rPr>
@@ -6978,7 +6950,7 @@
                 <w:rPr>
                   <w:rFonts w:ascii="Cambria Math" w:hAnsi="Cambria Math"/>
                 </w:rPr>
-                <m:t>​</m:t>
+                <m:t/>
               </m:r>
             </m:sup>
             <m:e>
@@ -7038,7 +7010,7 @@
             <w:rPr>
               <w:rFonts w:ascii="Cambria Math" w:hAnsi="Cambria Math"/>
             </w:rPr>
-            <m:t> </m:t>
+            <m:t xml:space="preserve">  </m:t>
           </m:r>
           <m:r>
             <m:rPr>
@@ -7053,7 +7025,7 @@
             <w:rPr>
               <w:rFonts w:ascii="Cambria Math" w:hAnsi="Cambria Math"/>
             </w:rPr>
-            <m:t>i  </m:t>
+            <m:t xml:space="preserve">i    </m:t>
           </m:r>
           <m:r>
             <m:rPr>
@@ -7305,7 +7277,7 @@
             <w:rPr>
               <w:rFonts w:ascii="Cambria Math" w:hAnsi="Cambria Math"/>
             </w:rPr>
-            <m:t> </m:t>
+            <m:t xml:space="preserve">  </m:t>
           </m:r>
           <m:r>
             <m:rPr>
@@ -7350,7 +7322,7 @@
             <w:rPr>
               <w:rFonts w:ascii="Cambria Math" w:hAnsi="Cambria Math"/>
             </w:rPr>
-            <m:t>m  </m:t>
+            <m:t xml:space="preserve">m    </m:t>
           </m:r>
           <m:r>
             <m:rPr>
@@ -7670,7 +7642,7 @@
             <w:rPr>
               <w:rFonts w:ascii="Cambria Math" w:hAnsi="Cambria Math"/>
             </w:rPr>
-            <m:t>  </m:t>
+            <m:t xml:space="preserve">    </m:t>
           </m:r>
           <m:r>
             <m:rPr>
@@ -7797,7 +7769,7 @@
               <w:rPr>
                 <w:rFonts w:ascii="Cambria Math" w:hAnsi="Cambria Math"/>
               </w:rPr>
-              <m:t>​</m:t>
+              <m:t/>
             </m:r>
           </m:sup>
           <m:e>
@@ -7973,7 +7945,7 @@
             <w:rPr>
               <w:rFonts w:ascii="Cambria Math" w:hAnsi="Cambria Math"/>
             </w:rPr>
-            <m:t> </m:t>
+            <m:t xml:space="preserve">  </m:t>
           </m:r>
           <m:r>
             <m:rPr>
@@ -7988,7 +7960,7 @@
             <w:rPr>
               <w:rFonts w:ascii="Cambria Math" w:hAnsi="Cambria Math"/>
             </w:rPr>
-            <m:t>f  </m:t>
+            <m:t xml:space="preserve">f    </m:t>
           </m:r>
           <m:r>
             <m:rPr>
@@ -8280,7 +8252,7 @@
             <w:rPr>
               <w:rFonts w:ascii="Cambria Math" w:hAnsi="Cambria Math"/>
             </w:rPr>
-            <m:t> </m:t>
+            <m:t xml:space="preserve">  </m:t>
           </m:r>
           <m:r>
             <m:rPr>
@@ -8310,7 +8282,7 @@
             <w:rPr>
               <w:rFonts w:ascii="Cambria Math" w:hAnsi="Cambria Math"/>
             </w:rPr>
-            <m:t>d  </m:t>
+            <m:t xml:space="preserve">d    </m:t>
           </m:r>
           <m:r>
             <m:rPr>
@@ -8556,7 +8528,7 @@
             <w:rPr>
               <w:rFonts w:ascii="Cambria Math" w:hAnsi="Cambria Math"/>
             </w:rPr>
-            <m:t>  </m:t>
+            <m:t xml:space="preserve">    </m:t>
           </m:r>
           <m:r>
             <m:rPr>
@@ -8652,7 +8624,7 @@
           </m:sub>
           <m:sup>
             <m:r>
-              <m:t>​</m:t>
+              <m:t/>
             </m:r>
           </m:sup>
           <m:e>
@@ -8887,7 +8859,7 @@
             <w:rPr>
               <w:rFonts w:ascii="Cambria Math" w:hAnsi="Cambria Math"/>
             </w:rPr>
-            <m:t> </m:t>
+            <m:t xml:space="preserve">  </m:t>
           </m:r>
           <m:r>
             <m:rPr>
@@ -8932,7 +8904,7 @@
             <w:rPr>
               <w:rFonts w:ascii="Cambria Math" w:hAnsi="Cambria Math"/>
             </w:rPr>
-            <m:t>m  </m:t>
+            <m:t xml:space="preserve">m    </m:t>
           </m:r>
           <m:r>
             <m:rPr>
@@ -9188,7 +9160,7 @@
             <w:rPr>
               <w:rFonts w:ascii="Cambria Math" w:hAnsi="Cambria Math"/>
             </w:rPr>
-            <m:t> </m:t>
+            <m:t xml:space="preserve">  </m:t>
           </m:r>
           <m:sSub>
             <m:sSubPr>
@@ -9262,7 +9234,7 @@
             <w:rPr>
               <w:rFonts w:ascii="Cambria Math" w:hAnsi="Cambria Math"/>
             </w:rPr>
-            <m:t> </m:t>
+            <m:t xml:space="preserve">  </m:t>
           </m:r>
           <m:sSub>
             <m:sSubPr>
@@ -9327,7 +9299,7 @@
             <w:rPr>
               <w:rFonts w:ascii="Cambria Math" w:hAnsi="Cambria Math"/>
             </w:rPr>
-            <m:t>  </m:t>
+            <m:t xml:space="preserve">    </m:t>
           </m:r>
           <m:r>
             <m:rPr>
@@ -9505,7 +9477,7 @@
             <w:rPr>
               <w:rFonts w:ascii="Cambria Math" w:hAnsi="Cambria Math"/>
             </w:rPr>
-            <m:t>  </m:t>
+            <m:t xml:space="preserve">    </m:t>
           </m:r>
           <m:r>
             <m:rPr>
@@ -9538,7 +9510,7 @@
             <w:rPr>
               <w:rFonts w:ascii="Cambria Math" w:hAnsi="Cambria Math"/>
             </w:rPr>
-            <m:t>,  </m:t>
+            <m:t xml:space="preserve">,    </m:t>
           </m:r>
           <m:sSub>
             <m:sSubPr>
@@ -9676,7 +9648,7 @@
             <w:rPr>
               <w:rFonts w:ascii="Cambria Math" w:hAnsi="Cambria Math"/>
             </w:rPr>
-            <m:t>  </m:t>
+            <m:t xml:space="preserve">    </m:t>
           </m:r>
           <m:r>
             <m:rPr>
@@ -9800,7 +9772,7 @@
             <w:rPr>
               <w:rFonts w:ascii="Cambria Math" w:hAnsi="Cambria Math"/>
             </w:rPr>
-            <m:t> </m:t>
+            <m:t xml:space="preserve">  </m:t>
           </m:r>
           <m:r>
             <m:rPr>
@@ -9830,7 +9802,7 @@
             <w:rPr>
               <w:rFonts w:ascii="Cambria Math" w:hAnsi="Cambria Math"/>
             </w:rPr>
-            <m:t>  </m:t>
+            <m:t xml:space="preserve">    </m:t>
           </m:r>
           <m:sSub>
             <m:sSubPr>
@@ -9898,7 +9870,7 @@
             <w:rPr>
               <w:rFonts w:ascii="Cambria Math" w:hAnsi="Cambria Math"/>
             </w:rPr>
-            <m:t> </m:t>
+            <m:t xml:space="preserve">  </m:t>
           </m:r>
           <m:r>
             <m:rPr>
@@ -9913,7 +9885,7 @@
             <w:rPr>
               <w:rFonts w:ascii="Cambria Math" w:hAnsi="Cambria Math"/>
             </w:rPr>
-            <m:t>f  </m:t>
+            <m:t xml:space="preserve">f    </m:t>
           </m:r>
           <m:r>
             <m:rPr>
@@ -10142,7 +10114,7 @@
             <w:rPr>
               <w:rFonts w:ascii="Cambria Math" w:hAnsi="Cambria Math"/>
             </w:rPr>
-            <m:t> J</m:t>
+            <m:t xml:space="preserve"> J</m:t>
           </m:r>
           <m:r>
             <m:rPr>
@@ -10250,7 +10222,7 @@
                 <w:rPr>
                   <w:rFonts w:ascii="Cambria Math" w:hAnsi="Cambria Math"/>
                 </w:rPr>
-                <m:t>​</m:t>
+                <m:t/>
               </m:r>
             </m:sup>
             <m:e>
@@ -10294,7 +10266,7 @@
             <w:rPr>
               <w:rFonts w:ascii="Cambria Math" w:hAnsi="Cambria Math"/>
             </w:rPr>
-            <m:t>  λ</m:t>
+            <m:t xml:space="preserve">    λ</m:t>
           </m:r>
           <m:r>
             <m:rPr>
@@ -10309,7 +10281,7 @@
             <w:rPr>
               <w:rFonts w:ascii="Cambria Math" w:hAnsi="Cambria Math"/>
             </w:rPr>
-            <m:t>1  </m:t>
+            <m:t xml:space="preserve">1    </m:t>
           </m:r>
           <m:r>
             <m:rPr>
@@ -10632,7 +10604,7 @@
           <w:rPr>
             <w:rFonts w:ascii="Cambria Math" w:hAnsi="Cambria Math"/>
           </w:rPr>
-          <m:t>0.05 J</m:t>
+          <m:t>0.05 J</m:t>
         </m:r>
         <m:r>
           <m:rPr>
@@ -10704,7 +10676,7 @@
           <w:rPr>
             <w:rFonts w:ascii="Cambria Math" w:hAnsi="Cambria Math"/>
           </w:rPr>
-          <m:t>0.995 T</m:t>
+          <m:t>0.995 T</m:t>
         </m:r>
       </m:oMath>
       <w:r>
@@ -10756,20 +10728,6 @@
           <w:bCs/>
         </w:rPr>
         <w:t xml:space="preserve">섭동 재시작(kick restart). 30회 연속 개선이 없으면 섭동 재시작을</w:t>
-      </w:r>
-      <w:r>
-        <w:rPr>
-          <w:rFonts w:asciiTheme="minorEastAsia" w:hAnsiTheme="minorEastAsia"/>
-        </w:rPr>
-        <w:t xml:space="preserve"/>
-      </w:r>
-      <w:r>
-        <w:rPr>
-          <w:rFonts w:asciiTheme="minorEastAsia" w:hAnsiTheme="minorEastAsia"/>
-          <w:b/>
-          <w:bCs/>
-        </w:rPr>
-        <w:t xml:space="preserve"/>
       </w:r>
       <w:r>
         <w:rPr>
@@ -10849,12 +10807,6 @@
           <w:rFonts w:asciiTheme="minorEastAsia" w:hAnsiTheme="minorEastAsia"/>
         </w:rPr>
         <w:t xml:space="preserve">고속 증분 평가기(fast incremental evaluator)는 해 하나를 평가하는 데 시험 인스턴스 기준 S에서 약 25–28마이크로초(μs), L에서 약 95–148마이크로초가 걸려 하강 탐색과 유도 연산자를 저렴하게 만든다.</w:t>
-      </w:r>
-      <w:r>
-        <w:rPr>
-          <w:rFonts w:asciiTheme="minorEastAsia" w:hAnsiTheme="minorEastAsia"/>
-        </w:rPr>
-        <w:t xml:space="preserve"/>
       </w:r>
     </w:p>
     <w:p>
@@ -12264,14 +12216,7 @@
         </w:rPr>
         <w:t xml:space="preserve">나머지 생성 파라미터는 &lt;Table 3&gt;</w:t>
       </w:r>
-      <w:hyperlink w:anchor="tab:param">
-        <w:r>
-          <w:rPr>
-            <w:rFonts w:asciiTheme="minorEastAsia" w:hAnsiTheme="minorEastAsia"/>
-          </w:rPr>
-          <w:t xml:space="preserve"/>
-        </w:r>
-      </w:hyperlink>
+      <w:hyperlink w:anchor="tab:param"/>
       <w:r>
         <w:rPr>
           <w:rFonts w:asciiTheme="minorEastAsia" w:hAnsiTheme="minorEastAsia"/>
@@ -12427,13 +12372,86 @@
                 <w:rFonts w:asciiTheme="minorEastAsia" w:hAnsiTheme="minorEastAsia"/>
               </w:rPr>
             </w:pPr>
-            <w:r>
-              <w:rPr>
-                <w:rFonts w:asciiTheme="minorEastAsia" w:hAnsiTheme="minorEastAsia"/>
-                <w:sz w:val="18"/>
-              </w:rPr>
-              <w:t>(|I|,|F|,|D|,|M|)</w:t>
-            </w:r>
+            <m:oMath>
+              <m:r>
+                <m:rPr>
+                  <m:sty m:val="p"/>
+                </m:rPr>
+                <w:rPr>
+                  <w:rFonts w:ascii="Cambria Math" w:hAnsi="Cambria Math"/>
+                  <w:sz w:val="18"/>
+                </w:rPr>
+                <m:t>(|</m:t>
+              </m:r>
+              <m:r>
+                <w:rPr>
+                  <w:rFonts w:ascii="Cambria Math" w:hAnsi="Cambria Math"/>
+                  <w:sz w:val="18"/>
+                </w:rPr>
+                <m:t>I</m:t>
+              </m:r>
+              <m:r>
+                <m:rPr>
+                  <m:sty m:val="p"/>
+                </m:rPr>
+                <w:rPr>
+                  <w:rFonts w:ascii="Cambria Math" w:hAnsi="Cambria Math"/>
+                  <w:sz w:val="18"/>
+                </w:rPr>
+                <m:t>|,|</m:t>
+              </m:r>
+              <m:r>
+                <w:rPr>
+                  <w:rFonts w:ascii="Cambria Math" w:hAnsi="Cambria Math"/>
+                  <w:sz w:val="18"/>
+                </w:rPr>
+                <m:t>F</m:t>
+              </m:r>
+              <m:r>
+                <m:rPr>
+                  <m:sty m:val="p"/>
+                </m:rPr>
+                <w:rPr>
+                  <w:rFonts w:ascii="Cambria Math" w:hAnsi="Cambria Math"/>
+                  <w:sz w:val="18"/>
+                </w:rPr>
+                <m:t>|,|</m:t>
+              </m:r>
+              <m:r>
+                <w:rPr>
+                  <w:rFonts w:ascii="Cambria Math" w:hAnsi="Cambria Math"/>
+                  <w:sz w:val="18"/>
+                </w:rPr>
+                <m:t>D</m:t>
+              </m:r>
+              <m:r>
+                <m:rPr>
+                  <m:sty m:val="p"/>
+                </m:rPr>
+                <w:rPr>
+                  <w:rFonts w:ascii="Cambria Math" w:hAnsi="Cambria Math"/>
+                  <w:sz w:val="18"/>
+                </w:rPr>
+                <m:t>|,|</m:t>
+              </m:r>
+              <m:r>
+                <w:rPr>
+                  <w:rFonts w:ascii="Cambria Math" w:hAnsi="Cambria Math"/>
+                  <w:sz w:val="18"/>
+                </w:rPr>
+                <m:t>M</m:t>
+              </m:r>
+              <m:r>
+                <m:rPr>
+                  <m:sty m:val="p"/>
+                </m:rPr>
+                <w:rPr>
+                  <w:rFonts w:ascii="Cambria Math" w:hAnsi="Cambria Math"/>
+                  <w:sz w:val="18"/>
+                </w:rPr>
+                <m:t>|)</m:t>
+              </m:r>
+            </m:oMath>
           </w:p>
         </w:tc>
         <w:tc>
@@ -12492,13 +12510,52 @@
                 <w:rFonts w:asciiTheme="minorEastAsia" w:hAnsiTheme="minorEastAsia"/>
               </w:rPr>
             </w:pPr>
-            <w:r>
-              <w:rPr>
-                <w:rFonts w:asciiTheme="minorEastAsia" w:hAnsiTheme="minorEastAsia"/>
-                <w:sz w:val="18"/>
-              </w:rPr>
-              <w:t>|I|/|D|</w:t>
-            </w:r>
+            <m:oMath>
+              <m:r>
+                <m:rPr>
+                  <m:sty m:val="p"/>
+                </m:rPr>
+                <w:rPr>
+                  <w:rFonts w:ascii="Cambria Math" w:hAnsi="Cambria Math"/>
+                  <w:sz w:val="18"/>
+                </w:rPr>
+                <m:t>|</m:t>
+              </m:r>
+              <m:r>
+                <w:rPr>
+                  <w:rFonts w:ascii="Cambria Math" w:hAnsi="Cambria Math"/>
+                  <w:sz w:val="18"/>
+                </w:rPr>
+                <m:t>I</m:t>
+              </m:r>
+              <m:r>
+                <m:rPr>
+                  <m:sty m:val="p"/>
+                </m:rPr>
+                <w:rPr>
+                  <w:rFonts w:ascii="Cambria Math" w:hAnsi="Cambria Math"/>
+                  <w:sz w:val="18"/>
+                </w:rPr>
+                <m:t>|/|</m:t>
+              </m:r>
+              <m:r>
+                <w:rPr>
+                  <w:rFonts w:ascii="Cambria Math" w:hAnsi="Cambria Math"/>
+                  <w:sz w:val="18"/>
+                </w:rPr>
+                <m:t>D</m:t>
+              </m:r>
+              <m:r>
+                <m:rPr>
+                  <m:sty m:val="p"/>
+                </m:rPr>
+                <w:rPr>
+                  <w:rFonts w:ascii="Cambria Math" w:hAnsi="Cambria Math"/>
+                  <w:sz w:val="18"/>
+                </w:rPr>
+                <m:t>|</m:t>
+              </m:r>
+            </m:oMath>
           </w:p>
         </w:tc>
         <w:tc>
@@ -12557,13 +12614,35 @@
                 <w:rFonts w:asciiTheme="minorEastAsia" w:hAnsiTheme="minorEastAsia"/>
               </w:rPr>
             </w:pPr>
-            <w:r>
-              <w:rPr>
-                <w:rFonts w:asciiTheme="minorEastAsia" w:hAnsiTheme="minorEastAsia"/>
-                <w:sz w:val="18"/>
-              </w:rPr>
-              <w:t>|K|</w:t>
-            </w:r>
+            <m:oMath>
+              <m:r>
+                <m:rPr>
+                  <m:sty m:val="p"/>
+                </m:rPr>
+                <w:rPr>
+                  <w:rFonts w:ascii="Cambria Math" w:hAnsi="Cambria Math"/>
+                  <w:sz w:val="18"/>
+                </w:rPr>
+                <m:t>|</m:t>
+              </m:r>
+              <m:r>
+                <w:rPr>
+                  <w:rFonts w:ascii="Cambria Math" w:hAnsi="Cambria Math"/>
+                  <w:sz w:val="18"/>
+                </w:rPr>
+                <m:t>K</m:t>
+              </m:r>
+              <m:r>
+                <m:rPr>
+                  <m:sty m:val="p"/>
+                </m:rPr>
+                <w:rPr>
+                  <w:rFonts w:ascii="Cambria Math" w:hAnsi="Cambria Math"/>
+                  <w:sz w:val="18"/>
+                </w:rPr>
+                <m:t>|</m:t>
+              </m:r>
+            </m:oMath>
           </w:p>
         </w:tc>
         <w:tc>
@@ -12622,13 +12701,51 @@
                 <w:rFonts w:asciiTheme="minorEastAsia" w:hAnsiTheme="minorEastAsia"/>
               </w:rPr>
             </w:pPr>
-            <w:r>
-              <w:rPr>
-                <w:rFonts w:asciiTheme="minorEastAsia" w:hAnsiTheme="minorEastAsia"/>
-                <w:sz w:val="18"/>
-              </w:rPr>
-              <w:t>f_idk</w:t>
-            </w:r>
+            <m:oMath>
+              <m:sSub>
+                <m:sSubPr>
+                  <m:ctrlPr>
+                    <w:rPr>
+                      <w:rFonts w:ascii="Cambria Math" w:hAnsi="Cambria Math"/>
+                      <w:i/>
+                      <w:sz w:val="18"/>
+                    </w:rPr>
+                  </m:ctrlPr>
+                </m:sSubPr>
+                <m:e>
+                  <m:r>
+                    <w:rPr>
+                      <w:rFonts w:ascii="Cambria Math" w:hAnsi="Cambria Math"/>
+                      <w:sz w:val="18"/>
+                    </w:rPr>
+                    <m:t>f</m:t>
+                  </m:r>
+                </m:e>
+                <m:sub>
+                  <m:r>
+                    <w:rPr>
+                      <w:rFonts w:ascii="Cambria Math" w:hAnsi="Cambria Math"/>
+                      <w:sz w:val="18"/>
+                    </w:rPr>
+                    <m:t>i</m:t>
+                  </m:r>
+                  <m:r>
+                    <w:rPr>
+                      <w:rFonts w:ascii="Cambria Math" w:hAnsi="Cambria Math"/>
+                      <w:sz w:val="18"/>
+                    </w:rPr>
+                    <m:t>d</m:t>
+                  </m:r>
+                  <m:r>
+                    <w:rPr>
+                      <w:rFonts w:ascii="Cambria Math" w:hAnsi="Cambria Math"/>
+                      <w:sz w:val="18"/>
+                    </w:rPr>
+                    <m:t>k</m:t>
+                  </m:r>
+                </m:sub>
+              </m:sSub>
+            </m:oMath>
           </w:p>
         </w:tc>
         <w:tc>
@@ -12643,13 +12760,25 @@
                 <w:rFonts w:asciiTheme="minorEastAsia" w:hAnsiTheme="minorEastAsia"/>
               </w:rPr>
             </w:pPr>
-            <w:r>
-              <w:rPr>
-                <w:rFonts w:asciiTheme="minorEastAsia" w:hAnsiTheme="minorEastAsia"/>
-                <w:sz w:val="18"/>
-              </w:rPr>
-              <w:t>U[0,20]</w:t>
-            </w:r>
+            <m:oMath>
+              <m:r>
+                <w:rPr>
+                  <w:rFonts w:ascii="Cambria Math" w:hAnsi="Cambria Math"/>
+                  <w:sz w:val="18"/>
+                </w:rPr>
+                <m:t>U</m:t>
+              </m:r>
+              <m:r>
+                <m:rPr>
+                  <m:sty m:val="p"/>
+                </m:rPr>
+                <w:rPr>
+                  <w:rFonts w:ascii="Cambria Math" w:hAnsi="Cambria Math"/>
+                  <w:sz w:val="18"/>
+                </w:rPr>
+                <m:t>[0,20]</m:t>
+              </m:r>
+            </m:oMath>
           </w:p>
         </w:tc>
       </w:tr>
@@ -12687,13 +12816,37 @@
                 <w:rFonts w:asciiTheme="minorEastAsia" w:hAnsiTheme="minorEastAsia"/>
               </w:rPr>
             </w:pPr>
-            <w:r>
-              <w:rPr>
-                <w:rFonts w:asciiTheme="minorEastAsia" w:hAnsiTheme="minorEastAsia"/>
-                <w:sz w:val="18"/>
-              </w:rPr>
-              <w:t>t_k</w:t>
-            </w:r>
+            <m:oMath>
+              <m:sSub>
+                <m:sSubPr>
+                  <m:ctrlPr>
+                    <w:rPr>
+                      <w:rFonts w:ascii="Cambria Math" w:hAnsi="Cambria Math"/>
+                      <w:i/>
+                      <w:sz w:val="18"/>
+                    </w:rPr>
+                  </m:ctrlPr>
+                </m:sSubPr>
+                <m:e>
+                  <m:r>
+                    <w:rPr>
+                      <w:rFonts w:ascii="Cambria Math" w:hAnsi="Cambria Math"/>
+                      <w:sz w:val="18"/>
+                    </w:rPr>
+                    <m:t>t</m:t>
+                  </m:r>
+                </m:e>
+                <m:sub>
+                  <m:r>
+                    <w:rPr>
+                      <w:rFonts w:ascii="Cambria Math" w:hAnsi="Cambria Math"/>
+                      <w:sz w:val="18"/>
+                    </w:rPr>
+                    <m:t>k</m:t>
+                  </m:r>
+                </m:sub>
+              </m:sSub>
+            </m:oMath>
           </w:p>
         </w:tc>
         <w:tc>
@@ -12708,13 +12861,25 @@
                 <w:rFonts w:asciiTheme="minorEastAsia" w:hAnsiTheme="minorEastAsia"/>
               </w:rPr>
             </w:pPr>
-            <w:r>
-              <w:rPr>
-                <w:rFonts w:asciiTheme="minorEastAsia" w:hAnsiTheme="minorEastAsia"/>
-                <w:sz w:val="18"/>
-              </w:rPr>
-              <w:t>U[1,4]</w:t>
-            </w:r>
+            <m:oMath>
+              <m:r>
+                <w:rPr>
+                  <w:rFonts w:ascii="Cambria Math" w:hAnsi="Cambria Math"/>
+                  <w:sz w:val="18"/>
+                </w:rPr>
+                <m:t>U</m:t>
+              </m:r>
+              <m:r>
+                <m:rPr>
+                  <m:sty m:val="p"/>
+                </m:rPr>
+                <w:rPr>
+                  <w:rFonts w:ascii="Cambria Math" w:hAnsi="Cambria Math"/>
+                  <w:sz w:val="18"/>
+                </w:rPr>
+                <m:t>[1,4]</m:t>
+              </m:r>
+            </m:oMath>
           </w:p>
         </w:tc>
       </w:tr>
@@ -12752,13 +12917,90 @@
                 <w:rFonts w:asciiTheme="minorEastAsia" w:hAnsiTheme="minorEastAsia"/>
               </w:rPr>
             </w:pPr>
-            <w:r>
-              <w:rPr>
-                <w:rFonts w:asciiTheme="minorEastAsia" w:hAnsiTheme="minorEastAsia"/>
-                <w:sz w:val="18"/>
-              </w:rPr>
-              <w:t>DE_q, DL_q</w:t>
-            </w:r>
+            <m:oMath>
+              <m:sSub>
+                <m:sSubPr>
+                  <m:ctrlPr>
+                    <w:rPr>
+                      <w:rFonts w:ascii="Cambria Math" w:hAnsi="Cambria Math"/>
+                      <w:i/>
+                      <w:sz w:val="18"/>
+                    </w:rPr>
+                  </m:ctrlPr>
+                </m:sSubPr>
+                <m:e>
+                  <m:r>
+                    <w:rPr>
+                      <w:rFonts w:ascii="Cambria Math" w:hAnsi="Cambria Math"/>
+                      <w:sz w:val="18"/>
+                    </w:rPr>
+                    <m:t>D</m:t>
+                  </m:r>
+                  <m:r>
+                    <w:rPr>
+                      <w:rFonts w:ascii="Cambria Math" w:hAnsi="Cambria Math"/>
+                      <w:sz w:val="18"/>
+                    </w:rPr>
+                    <m:t>E</m:t>
+                  </m:r>
+                </m:e>
+                <m:sub>
+                  <m:r>
+                    <w:rPr>
+                      <w:rFonts w:ascii="Cambria Math" w:hAnsi="Cambria Math"/>
+                      <w:sz w:val="18"/>
+                    </w:rPr>
+                    <m:t>q</m:t>
+                  </m:r>
+                </m:sub>
+              </m:sSub>
+              <m:r>
+                <m:rPr>
+                  <m:sty m:val="p"/>
+                </m:rPr>
+                <w:rPr>
+                  <w:rFonts w:ascii="Cambria Math" w:hAnsi="Cambria Math"/>
+                  <w:sz w:val="18"/>
+                </w:rPr>
+                <m:t>, </m:t>
+              </m:r>
+              <m:sSub>
+                <m:sSubPr>
+                  <m:ctrlPr>
+                    <w:rPr>
+                      <w:rFonts w:ascii="Cambria Math" w:hAnsi="Cambria Math"/>
+                      <w:i/>
+                      <w:sz w:val="18"/>
+                    </w:rPr>
+                  </m:ctrlPr>
+                </m:sSubPr>
+                <m:e>
+                  <m:r>
+                    <w:rPr>
+                      <w:rFonts w:ascii="Cambria Math" w:hAnsi="Cambria Math"/>
+                      <w:sz w:val="18"/>
+                    </w:rPr>
+                    <m:t>D</m:t>
+                  </m:r>
+                  <m:r>
+                    <w:rPr>
+                      <w:rFonts w:ascii="Cambria Math" w:hAnsi="Cambria Math"/>
+                      <w:sz w:val="18"/>
+                    </w:rPr>
+                    <m:t>L</m:t>
+                  </m:r>
+                </m:e>
+                <m:sub>
+                  <m:r>
+                    <w:rPr>
+                      <w:rFonts w:ascii="Cambria Math" w:hAnsi="Cambria Math"/>
+                      <w:sz w:val="18"/>
+                    </w:rPr>
+                    <m:t>q</m:t>
+                  </m:r>
+                </m:sub>
+              </m:sSub>
+            </m:oMath>
           </w:p>
         </w:tc>
         <w:tc>
@@ -12773,13 +13015,25 @@
                 <w:rFonts w:asciiTheme="minorEastAsia" w:hAnsiTheme="minorEastAsia"/>
               </w:rPr>
             </w:pPr>
-            <w:r>
-              <w:rPr>
-                <w:rFonts w:asciiTheme="minorEastAsia" w:hAnsiTheme="minorEastAsia"/>
-                <w:sz w:val="18"/>
-              </w:rPr>
-              <w:t>U[1,5]</w:t>
-            </w:r>
+            <m:oMath>
+              <m:r>
+                <w:rPr>
+                  <w:rFonts w:ascii="Cambria Math" w:hAnsi="Cambria Math"/>
+                  <w:sz w:val="18"/>
+                </w:rPr>
+                <m:t>U</m:t>
+              </m:r>
+              <m:r>
+                <m:rPr>
+                  <m:sty m:val="p"/>
+                </m:rPr>
+                <w:rPr>
+                  <w:rFonts w:ascii="Cambria Math" w:hAnsi="Cambria Math"/>
+                  <w:sz w:val="18"/>
+                </w:rPr>
+                <m:t>[1,5]</m:t>
+              </m:r>
+            </m:oMath>
           </w:p>
         </w:tc>
       </w:tr>
@@ -12843,8 +13097,45 @@
                 <w:rFonts w:asciiTheme="minorEastAsia" w:hAnsiTheme="minorEastAsia"/>
                 <w:sz w:val="18"/>
               </w:rPr>
-              <w:t>uniform on [0,100]²</w:t>
-            </w:r>
+              <w:t xml:space="preserve">uniform on </w:t>
+            </w:r>
+            <m:oMath>
+              <m:sSup>
+                <m:sSupPr>
+                  <m:ctrlPr>
+                    <w:rPr>
+                      <w:rFonts w:ascii="Cambria Math" w:hAnsi="Cambria Math"/>
+                      <w:i/>
+                      <w:sz w:val="18"/>
+                    </w:rPr>
+                  </m:ctrlPr>
+                </m:sSupPr>
+                <m:e>
+                  <m:r>
+                    <m:rPr>
+                      <m:sty m:val="p"/>
+                    </m:rPr>
+                    <w:rPr>
+                      <w:rFonts w:ascii="Cambria Math" w:hAnsi="Cambria Math"/>
+                      <w:sz w:val="18"/>
+                    </w:rPr>
+                    <m:t>[0,100]</m:t>
+                  </m:r>
+                </m:e>
+                <m:sup>
+                  <m:r>
+                    <m:rPr>
+                      <m:sty m:val="p"/>
+                    </m:rPr>
+                    <w:rPr>
+                      <w:rFonts w:ascii="Cambria Math" w:hAnsi="Cambria Math"/>
+                      <w:sz w:val="18"/>
+                    </w:rPr>
+                    <m:t>2</m:t>
+                  </m:r>
+                </m:sup>
+              </m:sSup>
+            </m:oMath>
           </w:p>
         </w:tc>
       </w:tr>
@@ -12882,13 +13173,44 @@
                 <w:rFonts w:asciiTheme="minorEastAsia" w:hAnsiTheme="minorEastAsia"/>
               </w:rPr>
             </w:pPr>
-            <w:r>
-              <w:rPr>
-                <w:rFonts w:asciiTheme="minorEastAsia" w:hAnsiTheme="minorEastAsia"/>
-                <w:sz w:val="18"/>
-              </w:rPr>
-              <w:t>t_mn</w:t>
-            </w:r>
+            <m:oMath>
+              <m:sSub>
+                <m:sSubPr>
+                  <m:ctrlPr>
+                    <w:rPr>
+                      <w:rFonts w:ascii="Cambria Math" w:hAnsi="Cambria Math"/>
+                      <w:i/>
+                      <w:sz w:val="18"/>
+                    </w:rPr>
+                  </m:ctrlPr>
+                </m:sSubPr>
+                <m:e>
+                  <m:r>
+                    <w:rPr>
+                      <w:rFonts w:ascii="Cambria Math" w:hAnsi="Cambria Math"/>
+                      <w:sz w:val="18"/>
+                    </w:rPr>
+                    <m:t>t</m:t>
+                  </m:r>
+                </m:e>
+                <m:sub>
+                  <m:r>
+                    <w:rPr>
+                      <w:rFonts w:ascii="Cambria Math" w:hAnsi="Cambria Math"/>
+                      <w:sz w:val="18"/>
+                    </w:rPr>
+                    <m:t>m</m:t>
+                  </m:r>
+                  <m:r>
+                    <w:rPr>
+                      <w:rFonts w:ascii="Cambria Math" w:hAnsi="Cambria Math"/>
+                      <w:sz w:val="18"/>
+                    </w:rPr>
+                    <m:t>n</m:t>
+                  </m:r>
+                </m:sub>
+              </m:sSub>
+            </m:oMath>
           </w:p>
         </w:tc>
         <w:tc>
@@ -12947,13 +13269,37 @@
                 <w:rFonts w:asciiTheme="minorEastAsia" w:hAnsiTheme="minorEastAsia"/>
               </w:rPr>
             </w:pPr>
-            <w:r>
-              <w:rPr>
-                <w:rFonts w:asciiTheme="minorEastAsia" w:hAnsiTheme="minorEastAsia"/>
-                <w:sz w:val="18"/>
-              </w:rPr>
-              <w:t>r_q</w:t>
-            </w:r>
+            <m:oMath>
+              <m:sSub>
+                <m:sSubPr>
+                  <m:ctrlPr>
+                    <w:rPr>
+                      <w:rFonts w:ascii="Cambria Math" w:hAnsi="Cambria Math"/>
+                      <w:i/>
+                      <w:sz w:val="18"/>
+                    </w:rPr>
+                  </m:ctrlPr>
+                </m:sSubPr>
+                <m:e>
+                  <m:r>
+                    <w:rPr>
+                      <w:rFonts w:ascii="Cambria Math" w:hAnsi="Cambria Math"/>
+                      <w:sz w:val="18"/>
+                    </w:rPr>
+                    <m:t>r</m:t>
+                  </m:r>
+                </m:e>
+                <m:sub>
+                  <m:r>
+                    <w:rPr>
+                      <w:rFonts w:ascii="Cambria Math" w:hAnsi="Cambria Math"/>
+                      <w:sz w:val="18"/>
+                    </w:rPr>
+                    <m:t>q</m:t>
+                  </m:r>
+                </m:sub>
+              </m:sSub>
+            </m:oMath>
           </w:p>
         </w:tc>
         <w:tc>
@@ -12973,8 +13319,51 @@
                 <w:rFonts w:asciiTheme="minorEastAsia" w:hAnsiTheme="minorEastAsia"/>
                 <w:sz w:val="18"/>
               </w:rPr>
-              <w:t>none: 0; otherwise U[0,ρH]</w:t>
-            </w:r>
+              <w:t xml:space="preserve">none: 0; otherwise </w:t>
+            </w:r>
+            <m:oMath>
+              <m:r>
+                <w:rPr>
+                  <w:rFonts w:ascii="Cambria Math" w:hAnsi="Cambria Math"/>
+                  <w:sz w:val="18"/>
+                </w:rPr>
+                <m:t>U</m:t>
+              </m:r>
+              <m:r>
+                <m:rPr>
+                  <m:sty m:val="p"/>
+                </m:rPr>
+                <w:rPr>
+                  <w:rFonts w:ascii="Cambria Math" w:hAnsi="Cambria Math"/>
+                  <w:sz w:val="18"/>
+                </w:rPr>
+                <m:t>[0,</m:t>
+              </m:r>
+              <m:r>
+                <w:rPr>
+                  <w:rFonts w:ascii="Cambria Math" w:hAnsi="Cambria Math"/>
+                  <w:sz w:val="18"/>
+                </w:rPr>
+                <m:t>ρ</m:t>
+              </m:r>
+              <m:r>
+                <w:rPr>
+                  <w:rFonts w:ascii="Cambria Math" w:hAnsi="Cambria Math"/>
+                  <w:sz w:val="18"/>
+                </w:rPr>
+                <m:t>H</m:t>
+              </m:r>
+              <m:r>
+                <m:rPr>
+                  <m:sty m:val="p"/>
+                </m:rPr>
+                <w:rPr>
+                  <w:rFonts w:ascii="Cambria Math" w:hAnsi="Cambria Math"/>
+                  <w:sz w:val="18"/>
+                </w:rPr>
+                <m:t>]</m:t>
+              </m:r>
+            </m:oMath>
           </w:p>
         </w:tc>
       </w:tr>
@@ -13012,27 +13401,51 @@
                 <w:rFonts w:asciiTheme="minorEastAsia" w:hAnsiTheme="minorEastAsia"/>
               </w:rPr>
             </w:pPr>
-            <w:r>
-              <w:rPr>
-                <w:rFonts w:asciiTheme="minorEastAsia" w:hAnsiTheme="minorEastAsia"/>
-                <w:sz w:val="18"/>
-              </w:rPr>
-              <w:t>d</w:t>
-            </w:r>
-            <w:r>
-              <w:rPr>
-                <w:rFonts w:ascii="Courier New" w:hAnsi="Courier New" w:cs="Courier New"/>
-                <w:sz w:val="18"/>
-              </w:rPr>
-              <w:t>̄</w:t>
-            </w:r>
-            <w:r>
-              <w:rPr>
-                <w:rFonts w:asciiTheme="minorEastAsia" w:hAnsiTheme="minorEastAsia"/>
-                <w:sz w:val="18"/>
-              </w:rPr>
-              <w:t>_q</w:t>
-            </w:r>
+            <m:oMath>
+              <m:sSub>
+                <m:sSubPr>
+                  <m:ctrlPr>
+                    <w:rPr>
+                      <w:rFonts w:ascii="Cambria Math" w:hAnsi="Cambria Math"/>
+                      <w:i/>
+                      <w:sz w:val="18"/>
+                    </w:rPr>
+                  </m:ctrlPr>
+                </m:sSubPr>
+                <m:e>
+                  <m:acc>
+                    <m:accPr>
+                      <m:chr m:val="‾"/>
+                      <m:ctrlPr>
+                        <w:rPr>
+                          <w:rFonts w:ascii="Cambria Math" w:hAnsi="Cambria Math"/>
+                          <w:i/>
+                          <w:sz w:val="18"/>
+                        </w:rPr>
+                      </m:ctrlPr>
+                    </m:accPr>
+                    <m:e>
+                      <m:r>
+                        <w:rPr>
+                          <w:rFonts w:ascii="Cambria Math" w:hAnsi="Cambria Math"/>
+                          <w:sz w:val="18"/>
+                        </w:rPr>
+                        <m:t>d</m:t>
+                      </m:r>
+                    </m:e>
+                  </m:acc>
+                </m:e>
+                <m:sub>
+                  <m:r>
+                    <w:rPr>
+                      <w:rFonts w:ascii="Cambria Math" w:hAnsi="Cambria Math"/>
+                      <w:sz w:val="18"/>
+                    </w:rPr>
+                    <m:t>q</m:t>
+                  </m:r>
+                </m:sub>
+              </m:sSub>
+            </m:oMath>
           </w:p>
         </w:tc>
         <w:tc>
@@ -13052,8 +13465,63 @@
                 <w:rFonts w:asciiTheme="minorEastAsia" w:hAnsiTheme="minorEastAsia"/>
                 <w:sz w:val="18"/>
               </w:rPr>
-              <w:t>none: ∞; otherwise r_q + δH</w:t>
-            </w:r>
+              <w:t xml:space="preserve">none: ∞; otherwise </w:t>
+            </w:r>
+            <m:oMath>
+              <m:sSub>
+                <m:sSubPr>
+                  <m:ctrlPr>
+                    <w:rPr>
+                      <w:rFonts w:ascii="Cambria Math" w:hAnsi="Cambria Math"/>
+                      <w:i/>
+                      <w:sz w:val="18"/>
+                    </w:rPr>
+                  </m:ctrlPr>
+                </m:sSubPr>
+                <m:e>
+                  <m:r>
+                    <w:rPr>
+                      <w:rFonts w:ascii="Cambria Math" w:hAnsi="Cambria Math"/>
+                      <w:sz w:val="18"/>
+                    </w:rPr>
+                    <m:t>r</m:t>
+                  </m:r>
+                </m:e>
+                <m:sub>
+                  <m:r>
+                    <w:rPr>
+                      <w:rFonts w:ascii="Cambria Math" w:hAnsi="Cambria Math"/>
+                      <w:sz w:val="18"/>
+                    </w:rPr>
+                    <m:t>q</m:t>
+                  </m:r>
+                </m:sub>
+              </m:sSub>
+              <m:r>
+                <m:rPr>
+                  <m:sty m:val="p"/>
+                </m:rPr>
+                <w:rPr>
+                  <w:rFonts w:ascii="Cambria Math" w:hAnsi="Cambria Math"/>
+                  <w:sz w:val="18"/>
+                </w:rPr>
+                <m:t> + </m:t>
+              </m:r>
+              <m:r>
+                <w:rPr>
+                  <w:rFonts w:ascii="Cambria Math" w:hAnsi="Cambria Math"/>
+                  <w:sz w:val="18"/>
+                </w:rPr>
+                <m:t>δ</m:t>
+              </m:r>
+              <m:r>
+                <w:rPr>
+                  <w:rFonts w:ascii="Cambria Math" w:hAnsi="Cambria Math"/>
+                  <w:sz w:val="18"/>
+                </w:rPr>
+                <m:t>H</m:t>
+              </m:r>
+            </m:oMath>
           </w:p>
         </w:tc>
       </w:tr>
@@ -13091,13 +13559,52 @@
                 <w:rFonts w:asciiTheme="minorEastAsia" w:hAnsiTheme="minorEastAsia"/>
               </w:rPr>
             </w:pPr>
-            <w:r>
-              <w:rPr>
-                <w:rFonts w:asciiTheme="minorEastAsia" w:hAnsiTheme="minorEastAsia"/>
-                <w:sz w:val="18"/>
-              </w:rPr>
-              <w:t>(ρ,δ)</w:t>
-            </w:r>
+            <m:oMath>
+              <m:r>
+                <m:rPr>
+                  <m:sty m:val="p"/>
+                </m:rPr>
+                <w:rPr>
+                  <w:rFonts w:ascii="Cambria Math" w:hAnsi="Cambria Math"/>
+                  <w:sz w:val="18"/>
+                </w:rPr>
+                <m:t>(</m:t>
+              </m:r>
+              <m:r>
+                <w:rPr>
+                  <w:rFonts w:ascii="Cambria Math" w:hAnsi="Cambria Math"/>
+                  <w:sz w:val="18"/>
+                </w:rPr>
+                <m:t>ρ</m:t>
+              </m:r>
+              <m:r>
+                <m:rPr>
+                  <m:sty m:val="p"/>
+                </m:rPr>
+                <w:rPr>
+                  <w:rFonts w:ascii="Cambria Math" w:hAnsi="Cambria Math"/>
+                  <w:sz w:val="18"/>
+                </w:rPr>
+                <m:t>,</m:t>
+              </m:r>
+              <m:r>
+                <w:rPr>
+                  <w:rFonts w:ascii="Cambria Math" w:hAnsi="Cambria Math"/>
+                  <w:sz w:val="18"/>
+                </w:rPr>
+                <m:t>δ</m:t>
+              </m:r>
+              <m:r>
+                <m:rPr>
+                  <m:sty m:val="p"/>
+                </m:rPr>
+                <w:rPr>
+                  <w:rFonts w:ascii="Cambria Math" w:hAnsi="Cambria Math"/>
+                  <w:sz w:val="18"/>
+                </w:rPr>
+                <m:t>)</m:t>
+              </m:r>
+            </m:oMath>
           </w:p>
         </w:tc>
         <w:tc>
@@ -13603,7 +14110,7 @@
               <w:rPr>
                 <w:rFonts w:ascii="Cambria Math" w:hAnsi="Cambria Math"/>
               </w:rPr>
-              <m:t>​</m:t>
+              <m:t/>
             </m:r>
           </m:sup>
           <m:e>
@@ -21101,7 +21608,7 @@
           </m:sub>
           <m:sup>
             <m:r>
-              <m:t>​</m:t>
+              <m:t/>
             </m:r>
           </m:sup>
           <m:e>

</xml_diff>